<commit_message>
Replace generic placeholders with unique LMB__ prefixed IDs
All short placeholder names (B1, C2_p, sl1, tt3, Z1, etc.) replaced with
collision-safe LMB__<METRIC>_<PERIOD> format in both .docx templates and
both R output scripts. E.g. B1 → LMB__EMP_CUR, B2_p → LMB__EMP_DQ_p,
sl1 → LMB__SL01, Z1 → LMB__MONTH_LABEL.

https://claude.ai/code/session_01QTVHE2cPDWnCbu52Ph5Q3X
</commit_message>
<xml_diff>
--- a/LMSB_extracted/labour-market-stats-brief/utils/ManualDB.docx
+++ b/LMSB_extracted/labour-market-stats-brief/utils/ManualDB.docx
@@ -19,7 +19,7 @@
           <w:tcPr>
             <w:tcW w:w="10316" w:type="dxa"/>
           </w:tcPr>
-          <w:p>
+          <w:p w14:textId="1D2LMB__EMP_CUR2B3">
             <w:pPr>
               <w:spacing w:after="0"/>
               <w:rPr>
@@ -58,10 +58,10 @@
                   <w:sz w:val="32"/>
                   <w:szCs w:val="32"/>
                 </w:rPr>
-                <w:t>Z1</w:t>
+                <w:t>LMB__MONTH_LABEL</w:t>
               </w:r>
             </w:hyperlink>
-            <w:r>
+            <w:r w:rsidR="00LMB__EMP_CUR40EB">
               <w:rPr>
                 <w:b/>
                 <w:bCs/>
@@ -107,7 +107,7 @@
                   <wp:wrapSquare wrapText="bothSides"/>
                   <wp:docPr id="530377592" name="Picture 1">
                     <a:extLst xmlns:a="http://schemas.openxmlformats.org/drawingml/2006/main">
-                      <a:ext uri="{C183D7F6-B498-43B3-948B-1728B52AA6E4}">
+                      <a:ext uri="{LMB__EMPRT_CUR83D7F6-B498-43B3-948B-1728B52AA6E4}">
                         <adec:decorative xmlns:adec="http://schemas.microsoft.com/office/drawing/2017/decorative" val="1"/>
                       </a:ext>
                     </a:extLst>
@@ -121,7 +121,7 @@
                         <pic:nvPicPr>
                           <pic:cNvPr id="530377592" name="Picture 1">
                             <a:extLst>
-                              <a:ext uri="{C183D7F6-B498-43B3-948B-1728B52AA6E4}">
+                              <a:ext uri="{LMB__EMPRT_CUR83D7F6-B498-43B3-948B-1728B52AA6E4}">
                                 <adec:decorative xmlns:adec="http://schemas.microsoft.com/office/drawing/2017/decorative" val="1"/>
                               </a:ext>
                             </a:extLst>
@@ -133,7 +133,7 @@
                         <pic:blipFill>
                           <a:blip r:embed="rId13">
                             <a:extLst>
-                              <a:ext uri="{28A0092B-C50C-407E-A947-70E740481C1C}">
+                              <a:ext uri="{28A0092B-C50C-407E-A947-70E740481LMB__EMPRT_CURC}">
                                 <a14:useLocalDpi xmlns:a14="http://schemas.microsoft.com/office/drawing/2010/main" val="0"/>
                               </a:ext>
                             </a:extLst>
@@ -177,7 +177,7 @@
                 <w:rFonts w:cs="Arial"/>
                 <w:color w:val="00285F" w:themeColor="text2"/>
               </w:rPr>
-              <w:t>RENDER_DATE</w:t>
+              <w:t>LMB__RENDER_DATE</w:t>
             </w:r>
             <w:r>
               <w:rPr>
@@ -197,7 +197,7 @@
           <w:tcPr>
             <w:tcW w:w="10316" w:type="dxa"/>
           </w:tcPr>
-          <w:p>
+          <w:p w14:paraId="6LMB__INACT_CUR88LMB__EMP_CURE">
             <w:pPr>
               <w:spacing w:before="0" w:after="0"/>
               <w:rPr>
@@ -339,7 +339,7 @@
         </w:tc>
       </w:tr>
     </w:tbl>
-    <w:p>
+    <w:p w:rsidRDefault="00LMB__EMP_CUR58LMB__UNEMP_CUR">
       <w:pPr>
         <w:pStyle w:val="ListParagraph"/>
         <w:numPr>
@@ -420,7 +420,7 @@
           <w:sz w:val="22"/>
           <w:szCs w:val="28"/>
         </w:rPr>
-        <w:t>LFS_PERIOD_LABEL</w:t>
+        <w:t>LMB__LFS_PERIOD</w:t>
       </w:r>
       <w:r>
         <w:rPr>
@@ -531,7 +531,7 @@
       <w:tblGrid>
         <w:gridCol w:w="10456"/>
       </w:tblGrid>
-      <w:tr>
+      <w:tr w:rsidTr="3FLMB__UNEMPRT_CUR7790">
         <w:trPr>
           <w:trHeight w:val="285"/>
         </w:trPr>
@@ -591,7 +591,7 @@
                 <w:sz w:val="22"/>
                 <w:szCs w:val="22"/>
               </w:rPr>
-              <w:t>sl1</w:t>
+              <w:t>LMB__SL01</w:t>
             </w:r>
           </w:p>
           <w:p>
@@ -612,7 +612,49 @@
                 <w:sz w:val="22"/>
                 <w:szCs w:val="22"/>
               </w:rPr>
-              <w:t>sl2</w:t>
+              <w:t>LMB__SL02</w:t>
+            </w:r>
+          </w:p>
+          <w:p w14:paraId="256D32LMB__EMP_CUR">
+            <w:pPr>
+              <w:pStyle w:val="ListParagraph"/>
+              <w:numPr>
+                <w:ilvl w:val="0"/>
+                <w:numId w:val="11"/>
+              </w:numPr>
+              <w:spacing w:beforeLines="20" w:before="48" w:afterLines="20" w:after="48"/>
+              <w:rPr>
+                <w:sz w:val="22"/>
+                <w:szCs w:val="22"/>
+              </w:rPr>
+            </w:pPr>
+            <w:r>
+              <w:rPr>
+                <w:sz w:val="22"/>
+                <w:szCs w:val="22"/>
+              </w:rPr>
+              <w:t>LMB__SL04</w:t>
+            </w:r>
+          </w:p>
+          <w:p w:rsidR="009LMB__UNEMP_CURAAA">
+            <w:pPr>
+              <w:pStyle w:val="ListParagraph"/>
+              <w:numPr>
+                <w:ilvl w:val="0"/>
+                <w:numId w:val="11"/>
+              </w:numPr>
+              <w:spacing w:beforeLines="20" w:before="48" w:afterLines="20" w:after="48"/>
+              <w:rPr>
+                <w:sz w:val="22"/>
+                <w:szCs w:val="22"/>
+              </w:rPr>
+            </w:pPr>
+            <w:r>
+              <w:rPr>
+                <w:sz w:val="22"/>
+                <w:szCs w:val="22"/>
+              </w:rPr>
+              <w:t>LMB__SL05</w:t>
             </w:r>
           </w:p>
           <w:p>
@@ -625,15 +667,15 @@
               <w:spacing w:beforeLines="20" w:before="48" w:afterLines="20" w:after="48"/>
               <w:rPr>
                 <w:sz w:val="22"/>
-                <w:szCs w:val="22"/>
+                <w:szCs w:val="28"/>
               </w:rPr>
             </w:pPr>
             <w:r>
               <w:rPr>
                 <w:sz w:val="22"/>
-                <w:szCs w:val="22"/>
-              </w:rPr>
-              <w:t>sl4</w:t>
+                <w:szCs w:val="28"/>
+              </w:rPr>
+              <w:t>LMB__SL08</w:t>
             </w:r>
           </w:p>
           <w:p>
@@ -646,15 +688,15 @@
               <w:spacing w:beforeLines="20" w:before="48" w:afterLines="20" w:after="48"/>
               <w:rPr>
                 <w:sz w:val="22"/>
-                <w:szCs w:val="22"/>
+                <w:szCs w:val="28"/>
               </w:rPr>
             </w:pPr>
             <w:r>
               <w:rPr>
                 <w:sz w:val="22"/>
-                <w:szCs w:val="22"/>
-              </w:rPr>
-              <w:t>sl5</w:t>
+                <w:szCs w:val="28"/>
+              </w:rPr>
+              <w:t>LMB__SL09</w:t>
             </w:r>
           </w:p>
           <w:p>
@@ -675,54 +717,12 @@
                 <w:sz w:val="22"/>
                 <w:szCs w:val="28"/>
               </w:rPr>
-              <w:t>sl8</w:t>
-            </w:r>
-          </w:p>
-          <w:p>
-            <w:pPr>
-              <w:pStyle w:val="ListParagraph"/>
-              <w:numPr>
-                <w:ilvl w:val="0"/>
-                <w:numId w:val="11"/>
-              </w:numPr>
-              <w:spacing w:beforeLines="20" w:before="48" w:afterLines="20" w:after="48"/>
-              <w:rPr>
-                <w:sz w:val="22"/>
-                <w:szCs w:val="28"/>
-              </w:rPr>
-            </w:pPr>
-            <w:r>
-              <w:rPr>
-                <w:sz w:val="22"/>
-                <w:szCs w:val="28"/>
-              </w:rPr>
-              <w:t>sl9</w:t>
-            </w:r>
-          </w:p>
-          <w:p>
-            <w:pPr>
-              <w:pStyle w:val="ListParagraph"/>
-              <w:numPr>
-                <w:ilvl w:val="0"/>
-                <w:numId w:val="11"/>
-              </w:numPr>
-              <w:spacing w:beforeLines="20" w:before="48" w:afterLines="20" w:after="48"/>
-              <w:rPr>
-                <w:sz w:val="22"/>
-                <w:szCs w:val="28"/>
-              </w:rPr>
-            </w:pPr>
-            <w:r>
-              <w:rPr>
-                <w:sz w:val="22"/>
-                <w:szCs w:val="28"/>
-              </w:rPr>
-              <w:t>sl10</w:t>
+              <w:t>LMB__SLMB__WAGENOM_CUR0</w:t>
             </w:r>
           </w:p>
         </w:tc>
       </w:tr>
-      <w:tr>
+      <w:tr w14:paraId="3LMB__EMP_CURECBCF">
         <w:tc>
           <w:tcPr>
             <w:tcW w:w="10456" w:type="dxa"/>
@@ -780,7 +780,7 @@
             <w:vAlign w:val="center"/>
             <w:hideMark/>
           </w:tcPr>
-          <w:p>
+          <w:p w:rsidP="008410LMB__EMP_CUR">
             <w:pPr>
               <w:spacing w:before="0" w:after="0"/>
               <w:rPr>
@@ -810,7 +810,7 @@
                 <w:sz w:val="20"/>
                 <w:szCs w:val="20"/>
               </w:rPr>
-              <w:t>LFS_QUARTER_LABEL</w:t>
+              <w:t>LMB__LFS_QUARTER</w:t>
             </w:r>
           </w:p>
         </w:tc>
@@ -822,7 +822,7 @@
             <w:vAlign w:val="center"/>
             <w:hideMark/>
           </w:tcPr>
-          <w:p>
+          <w:p w:rsidP="008410LMB__EMP_CUR">
             <w:pPr>
               <w:jc w:val="center"/>
               <w:rPr>
@@ -853,7 +853,7 @@
             <w:vAlign w:val="center"/>
             <w:hideMark/>
           </w:tcPr>
-          <w:p>
+          <w:p w:rsidP="008410LMB__EMP_CUR">
             <w:pPr>
               <w:jc w:val="center"/>
               <w:rPr>
@@ -884,7 +884,7 @@
             <w:vAlign w:val="center"/>
             <w:hideMark/>
           </w:tcPr>
-          <w:p>
+          <w:p w:rsidP="008410LMB__EMP_CUR">
             <w:pPr>
               <w:jc w:val="center"/>
               <w:rPr>
@@ -912,7 +912,7 @@
             <w:tcW w:w="948" w:type="pct"/>
             <w:shd w:val="clear" w:color="auto" w:fill="00285F" w:themeFill="text2"/>
           </w:tcPr>
-          <w:p>
+          <w:p w14:paraId="2A6LMB__EMPRT_CURA1B" w:rsidP="008410LMB__EMP_CUR">
             <w:pPr>
               <w:jc w:val="center"/>
               <w:rPr>
@@ -940,7 +940,7 @@
             <w:tcW w:w="801" w:type="pct"/>
             <w:shd w:val="clear" w:color="auto" w:fill="00285F" w:themeFill="text2"/>
           </w:tcPr>
-          <w:p>
+          <w:p w:rsidP="008410LMB__EMP_CUR">
             <w:pPr>
               <w:jc w:val="center"/>
               <w:rPr>
@@ -1026,7 +1026,7 @@
                 <w:sz w:val="20"/>
                 <w:szCs w:val="20"/>
               </w:rPr>
-              <w:t>B1</w:t>
+              <w:t>LMB__EMP_CUR</w:t>
             </w:r>
           </w:p>
         </w:tc>
@@ -1058,7 +1058,7 @@
                 <w:sz w:val="20"/>
                 <w:szCs w:val="20"/>
               </w:rPr>
-              <w:t>B2_p</w:t>
+              <w:t>LMB__EMP_DQ_p</w:t>
             </w:r>
             <w:r>
               <w:rPr>
@@ -1070,7 +1070,7 @@
                 <w:sz w:val="20"/>
                 <w:szCs w:val="20"/>
               </w:rPr>
-              <w:t>B2_n</w:t>
+              <w:t>LMB__EMP_DQ_n</w:t>
             </w:r>
             <w:r>
               <w:rPr>
@@ -1082,7 +1082,7 @@
                 <w:sz w:val="20"/>
                 <w:szCs w:val="20"/>
               </w:rPr>
-              <w:t>B2_z</w:t>
+              <w:t>LMB__EMP_DQ_z</w:t>
             </w:r>
           </w:p>
         </w:tc>
@@ -1113,7 +1113,7 @@
                 <w:sz w:val="20"/>
                 <w:szCs w:val="20"/>
               </w:rPr>
-              <w:t>B3_p</w:t>
+              <w:t>LMB__EMP_DY_p</w:t>
             </w:r>
             <w:r>
               <w:rPr>
@@ -1125,7 +1125,7 @@
                 <w:sz w:val="20"/>
                 <w:szCs w:val="20"/>
               </w:rPr>
-              <w:t>B3_n</w:t>
+              <w:t>LMB__EMP_DY_n</w:t>
             </w:r>
             <w:r>
               <w:rPr>
@@ -1137,7 +1137,7 @@
                 <w:sz w:val="20"/>
                 <w:szCs w:val="20"/>
               </w:rPr>
-              <w:t>B3_z</w:t>
+              <w:t>LMB__EMP_DY_z</w:t>
             </w:r>
           </w:p>
         </w:tc>
@@ -1167,7 +1167,7 @@
                 <w:sz w:val="20"/>
                 <w:szCs w:val="20"/>
               </w:rPr>
-              <w:t>B4_p</w:t>
+              <w:t>LMB__EMP_DC_p</w:t>
             </w:r>
             <w:r>
               <w:rPr>
@@ -1179,7 +1179,7 @@
                 <w:sz w:val="20"/>
                 <w:szCs w:val="20"/>
               </w:rPr>
-              <w:t>B4_n</w:t>
+              <w:t>LMB__EMP_DC_n</w:t>
             </w:r>
             <w:r>
               <w:rPr>
@@ -1191,7 +1191,7 @@
                 <w:sz w:val="20"/>
                 <w:szCs w:val="20"/>
               </w:rPr>
-              <w:t>B4_z</w:t>
+              <w:t>LMB__EMP_DC_z</w:t>
             </w:r>
           </w:p>
         </w:tc>
@@ -1221,7 +1221,7 @@
                 <w:sz w:val="20"/>
                 <w:szCs w:val="20"/>
               </w:rPr>
-              <w:t>B5_p</w:t>
+              <w:t>LMB__EMP_DE_p</w:t>
             </w:r>
             <w:r>
               <w:rPr>
@@ -1233,7 +1233,7 @@
                 <w:sz w:val="20"/>
                 <w:szCs w:val="20"/>
               </w:rPr>
-              <w:t>B5_n</w:t>
+              <w:t>LMB__EMP_DE_n</w:t>
             </w:r>
             <w:r>
               <w:rPr>
@@ -1245,7 +1245,7 @@
                 <w:sz w:val="20"/>
                 <w:szCs w:val="20"/>
               </w:rPr>
-              <w:t>B5_z</w:t>
+              <w:t>LMB__EMP_DE_z</w:t>
             </w:r>
           </w:p>
         </w:tc>
@@ -1310,7 +1310,7 @@
                 <w:sz w:val="20"/>
                 <w:szCs w:val="20"/>
               </w:rPr>
-              <w:t>C1</w:t>
+              <w:t>LMB__EMPRT_CUR</w:t>
             </w:r>
           </w:p>
         </w:tc>
@@ -1321,7 +1321,7 @@
             <w:noWrap/>
             <w:vAlign w:val="center"/>
           </w:tcPr>
-          <w:p>
+          <w:p w14:textId="541LMB__UNEMPRT_CURBB6">
             <w:pPr>
               <w:jc w:val="center"/>
               <w:rPr>
@@ -1338,7 +1338,7 @@
                 <w:sz w:val="20"/>
                 <w:szCs w:val="20"/>
               </w:rPr>
-              <w:t>C2_p</w:t>
+              <w:t>LMB__EMPRT_DQ_p</w:t>
             </w:r>
             <w:r>
               <w:rPr>
@@ -1347,16 +1347,16 @@
                 <w:sz w:val="20"/>
                 <w:szCs w:val="20"/>
               </w:rPr>
-              <w:t>C2_n</w:t>
-            </w:r>
-            <w:r>
-              <w:rPr>
-                <w:b/>
-                <w:color w:val="000000"/>
-                <w:sz w:val="20"/>
-                <w:szCs w:val="20"/>
-              </w:rPr>
-              <w:t>C2_z</w:t>
+              <w:t>LMB__EMPRT_DQ_n</w:t>
+            </w:r>
+            <w:r>
+              <w:rPr>
+                <w:b/>
+                <w:color w:val="000000"/>
+                <w:sz w:val="20"/>
+                <w:szCs w:val="20"/>
+              </w:rPr>
+              <w:t>LMB__EMPRT_DQ_z</w:t>
             </w:r>
           </w:p>
         </w:tc>
@@ -1385,7 +1385,7 @@
                 <w:sz w:val="20"/>
                 <w:szCs w:val="20"/>
               </w:rPr>
-              <w:t>C3_p</w:t>
+              <w:t>LMB__EMPRT_DY_p</w:t>
             </w:r>
             <w:r>
               <w:rPr>
@@ -1394,16 +1394,16 @@
                 <w:sz w:val="20"/>
                 <w:szCs w:val="20"/>
               </w:rPr>
-              <w:t>C3_n</w:t>
-            </w:r>
-            <w:r>
-              <w:rPr>
-                <w:b/>
-                <w:color w:val="000000"/>
-                <w:sz w:val="20"/>
-                <w:szCs w:val="20"/>
-              </w:rPr>
-              <w:t>C3_z</w:t>
+              <w:t>LMB__EMPRT_DY_n</w:t>
+            </w:r>
+            <w:r>
+              <w:rPr>
+                <w:b/>
+                <w:color w:val="000000"/>
+                <w:sz w:val="20"/>
+                <w:szCs w:val="20"/>
+              </w:rPr>
+              <w:t>LMB__EMPRT_DY_z</w:t>
             </w:r>
           </w:p>
         </w:tc>
@@ -1431,7 +1431,7 @@
                 <w:sz w:val="20"/>
                 <w:szCs w:val="20"/>
               </w:rPr>
-              <w:t>C4_p</w:t>
+              <w:t>LMB__EMPRT_DC_p</w:t>
             </w:r>
             <w:r>
               <w:rPr>
@@ -1440,16 +1440,16 @@
                 <w:sz w:val="20"/>
                 <w:szCs w:val="20"/>
               </w:rPr>
-              <w:t>C4_n</w:t>
-            </w:r>
-            <w:r>
-              <w:rPr>
-                <w:b/>
-                <w:color w:val="000000"/>
-                <w:sz w:val="20"/>
-                <w:szCs w:val="20"/>
-              </w:rPr>
-              <w:t>C4_z</w:t>
+              <w:t>LMB__EMPRT_DC_n</w:t>
+            </w:r>
+            <w:r>
+              <w:rPr>
+                <w:b/>
+                <w:color w:val="000000"/>
+                <w:sz w:val="20"/>
+                <w:szCs w:val="20"/>
+              </w:rPr>
+              <w:t>LMB__EMPRT_DC_z</w:t>
             </w:r>
           </w:p>
         </w:tc>
@@ -1477,7 +1477,7 @@
                 <w:sz w:val="20"/>
                 <w:szCs w:val="20"/>
               </w:rPr>
-              <w:t>C5_p</w:t>
+              <w:t>LMB__EMPRT_DE_p</w:t>
             </w:r>
             <w:r>
               <w:rPr>
@@ -1486,16 +1486,16 @@
                 <w:sz w:val="20"/>
                 <w:szCs w:val="20"/>
               </w:rPr>
-              <w:t>C5_n</w:t>
-            </w:r>
-            <w:r>
-              <w:rPr>
-                <w:b/>
-                <w:color w:val="000000"/>
-                <w:sz w:val="20"/>
-                <w:szCs w:val="20"/>
-              </w:rPr>
-              <w:t>C5_z</w:t>
+              <w:t>LMB__EMPRT_DE_n</w:t>
+            </w:r>
+            <w:r>
+              <w:rPr>
+                <w:b/>
+                <w:color w:val="000000"/>
+                <w:sz w:val="20"/>
+                <w:szCs w:val="20"/>
+              </w:rPr>
+              <w:t>LMB__EMPRT_DE_z</w:t>
             </w:r>
           </w:p>
         </w:tc>
@@ -1560,7 +1560,7 @@
                 <w:sz w:val="20"/>
                 <w:szCs w:val="20"/>
               </w:rPr>
-              <w:t>D1</w:t>
+              <w:t>LMB__UNEMP_CUR</w:t>
             </w:r>
           </w:p>
         </w:tc>
@@ -1589,7 +1589,7 @@
                 <w:sz w:val="20"/>
                 <w:szCs w:val="20"/>
               </w:rPr>
-              <w:t>D2_p</w:t>
+              <w:t>LMB__UNEMP_DQ_p</w:t>
             </w:r>
             <w:r>
               <w:rPr>
@@ -1598,16 +1598,16 @@
                 <w:sz w:val="20"/>
                 <w:szCs w:val="20"/>
               </w:rPr>
-              <w:t>D2_n</w:t>
-            </w:r>
-            <w:r>
-              <w:rPr>
-                <w:b/>
-                <w:color w:val="000000"/>
-                <w:sz w:val="20"/>
-                <w:szCs w:val="20"/>
-              </w:rPr>
-              <w:t>D2_z</w:t>
+              <w:t>LMB__UNEMP_DQ_n</w:t>
+            </w:r>
+            <w:r>
+              <w:rPr>
+                <w:b/>
+                <w:color w:val="000000"/>
+                <w:sz w:val="20"/>
+                <w:szCs w:val="20"/>
+              </w:rPr>
+              <w:t>LMB__UNEMP_DQ_z</w:t>
             </w:r>
           </w:p>
         </w:tc>
@@ -1636,7 +1636,7 @@
                 <w:sz w:val="20"/>
                 <w:szCs w:val="20"/>
               </w:rPr>
-              <w:t>D3_p</w:t>
+              <w:t>LMB__UNEMP_DY_p</w:t>
             </w:r>
             <w:r>
               <w:rPr>
@@ -1645,16 +1645,16 @@
                 <w:sz w:val="20"/>
                 <w:szCs w:val="20"/>
               </w:rPr>
-              <w:t>D3_n</w:t>
-            </w:r>
-            <w:r>
-              <w:rPr>
-                <w:b/>
-                <w:color w:val="000000"/>
-                <w:sz w:val="20"/>
-                <w:szCs w:val="20"/>
-              </w:rPr>
-              <w:t>D3_z</w:t>
+              <w:t>LMB__UNEMP_DY_n</w:t>
+            </w:r>
+            <w:r>
+              <w:rPr>
+                <w:b/>
+                <w:color w:val="000000"/>
+                <w:sz w:val="20"/>
+                <w:szCs w:val="20"/>
+              </w:rPr>
+              <w:t>LMB__UNEMP_DY_z</w:t>
             </w:r>
           </w:p>
         </w:tc>
@@ -1682,7 +1682,7 @@
                 <w:sz w:val="20"/>
                 <w:szCs w:val="20"/>
               </w:rPr>
-              <w:t>D4_p</w:t>
+              <w:t>LMB__UNEMP_DC_p</w:t>
             </w:r>
             <w:r>
               <w:rPr>
@@ -1691,16 +1691,16 @@
                 <w:sz w:val="20"/>
                 <w:szCs w:val="20"/>
               </w:rPr>
-              <w:t>D4_n</w:t>
-            </w:r>
-            <w:r>
-              <w:rPr>
-                <w:b/>
-                <w:color w:val="000000"/>
-                <w:sz w:val="20"/>
-                <w:szCs w:val="20"/>
-              </w:rPr>
-              <w:t>D4_z</w:t>
+              <w:t>LMB__UNEMP_DC_n</w:t>
+            </w:r>
+            <w:r>
+              <w:rPr>
+                <w:b/>
+                <w:color w:val="000000"/>
+                <w:sz w:val="20"/>
+                <w:szCs w:val="20"/>
+              </w:rPr>
+              <w:t>LMB__UNEMP_DC_z</w:t>
             </w:r>
           </w:p>
         </w:tc>
@@ -1728,7 +1728,7 @@
                 <w:sz w:val="20"/>
                 <w:szCs w:val="20"/>
               </w:rPr>
-              <w:t>D5_p</w:t>
+              <w:t>LMB__UNEMP_DE_p</w:t>
             </w:r>
             <w:r>
               <w:rPr>
@@ -1737,21 +1737,21 @@
                 <w:sz w:val="20"/>
                 <w:szCs w:val="20"/>
               </w:rPr>
-              <w:t>D5_n</w:t>
-            </w:r>
-            <w:r>
-              <w:rPr>
-                <w:b/>
-                <w:color w:val="000000"/>
-                <w:sz w:val="20"/>
-                <w:szCs w:val="20"/>
-              </w:rPr>
-              <w:t>D5_z</w:t>
+              <w:t>LMB__UNEMP_DE_n</w:t>
+            </w:r>
+            <w:r>
+              <w:rPr>
+                <w:b/>
+                <w:color w:val="000000"/>
+                <w:sz w:val="20"/>
+                <w:szCs w:val="20"/>
+              </w:rPr>
+              <w:t>LMB__UNEMP_DE_z</w:t>
             </w:r>
           </w:p>
         </w:tc>
       </w:tr>
-      <w:tr>
+      <w:tr w14:paraId="67937ALMB__EMP_CUR">
         <w:trPr>
           <w:trHeight w:hRule="exact" w:val="510"/>
           <w:jc w:val="center"/>
@@ -1763,7 +1763,7 @@
             <w:vAlign w:val="center"/>
             <w:hideMark/>
           </w:tcPr>
-          <w:p>
+          <w:p w14:paraId="45E6D3LMB__EMP_CUR">
             <w:pPr>
               <w:rPr>
                 <w:rFonts w:cs="Arial"/>
@@ -1811,7 +1811,7 @@
                 <w:sz w:val="20"/>
                 <w:szCs w:val="20"/>
               </w:rPr>
-              <w:t>E1</w:t>
+              <w:t>LMB__UNEMPRT_CUR</w:t>
             </w:r>
           </w:p>
         </w:tc>
@@ -1839,7 +1839,7 @@
                 <w:sz w:val="20"/>
                 <w:szCs w:val="20"/>
               </w:rPr>
-              <w:t>E2_p</w:t>
+              <w:t>LMB__UNEMPRT_DQ_p</w:t>
             </w:r>
             <w:r>
               <w:rPr>
@@ -1848,16 +1848,16 @@
                 <w:sz w:val="20"/>
                 <w:szCs w:val="20"/>
               </w:rPr>
-              <w:t>E2_n</w:t>
-            </w:r>
-            <w:r>
-              <w:rPr>
-                <w:b/>
-                <w:color w:val="000000"/>
-                <w:sz w:val="20"/>
-                <w:szCs w:val="20"/>
-              </w:rPr>
-              <w:t>E2_z</w:t>
+              <w:t>LMB__UNEMPRT_DQ_n</w:t>
+            </w:r>
+            <w:r>
+              <w:rPr>
+                <w:b/>
+                <w:color w:val="000000"/>
+                <w:sz w:val="20"/>
+                <w:szCs w:val="20"/>
+              </w:rPr>
+              <w:t>LMB__UNEMPRT_DQ_z</w:t>
             </w:r>
           </w:p>
         </w:tc>
@@ -1886,7 +1886,7 @@
                 <w:sz w:val="20"/>
                 <w:szCs w:val="20"/>
               </w:rPr>
-              <w:t>E3_p</w:t>
+              <w:t>LMB__UNEMPRT_DY_p</w:t>
             </w:r>
             <w:r>
               <w:rPr>
@@ -1895,16 +1895,16 @@
                 <w:sz w:val="20"/>
                 <w:szCs w:val="20"/>
               </w:rPr>
-              <w:t>E3_n</w:t>
-            </w:r>
-            <w:r>
-              <w:rPr>
-                <w:b/>
-                <w:color w:val="000000"/>
-                <w:sz w:val="20"/>
-                <w:szCs w:val="20"/>
-              </w:rPr>
-              <w:t>E3_z</w:t>
+              <w:t>LMB__UNEMPRT_DY_n</w:t>
+            </w:r>
+            <w:r>
+              <w:rPr>
+                <w:b/>
+                <w:color w:val="000000"/>
+                <w:sz w:val="20"/>
+                <w:szCs w:val="20"/>
+              </w:rPr>
+              <w:t>LMB__UNEMPRT_DY_z</w:t>
             </w:r>
           </w:p>
         </w:tc>
@@ -1914,7 +1914,7 @@
             <w:shd w:val="clear" w:color="auto" w:fill="D9DDEA" w:themeFill="accent5"/>
             <w:vAlign w:val="center"/>
           </w:tcPr>
-          <w:p>
+          <w:p w:rsidRDefault="00LMB__EMP_CUR61A7">
             <w:pPr>
               <w:jc w:val="center"/>
               <w:rPr>
@@ -1932,7 +1932,7 @@
                 <w:sz w:val="20"/>
                 <w:szCs w:val="20"/>
               </w:rPr>
-              <w:t>E4_p</w:t>
+              <w:t>LMB__UNEMPRT_DC_p</w:t>
             </w:r>
             <w:r>
               <w:rPr>
@@ -1941,16 +1941,16 @@
                 <w:sz w:val="20"/>
                 <w:szCs w:val="20"/>
               </w:rPr>
-              <w:t>E4_n</w:t>
-            </w:r>
-            <w:r>
-              <w:rPr>
-                <w:b/>
-                <w:color w:val="000000"/>
-                <w:sz w:val="20"/>
-                <w:szCs w:val="20"/>
-              </w:rPr>
-              <w:t>E4_z</w:t>
+              <w:t>LMB__UNEMPRT_DC_n</w:t>
+            </w:r>
+            <w:r>
+              <w:rPr>
+                <w:b/>
+                <w:color w:val="000000"/>
+                <w:sz w:val="20"/>
+                <w:szCs w:val="20"/>
+              </w:rPr>
+              <w:t>LMB__UNEMPRT_DC_z</w:t>
             </w:r>
           </w:p>
         </w:tc>
@@ -1978,7 +1978,7 @@
                 <w:sz w:val="20"/>
                 <w:szCs w:val="20"/>
               </w:rPr>
-              <w:t>E5_p</w:t>
+              <w:t>LMB__UNEMPRT_DE_p</w:t>
             </w:r>
             <w:r>
               <w:rPr>
@@ -1987,16 +1987,16 @@
                 <w:sz w:val="20"/>
                 <w:szCs w:val="20"/>
               </w:rPr>
-              <w:t>E5_n</w:t>
-            </w:r>
-            <w:r>
-              <w:rPr>
-                <w:b/>
-                <w:color w:val="000000"/>
-                <w:sz w:val="20"/>
-                <w:szCs w:val="20"/>
-              </w:rPr>
-              <w:t>E5_z</w:t>
+              <w:t>LMB__UNEMPRT_DE_n</w:t>
+            </w:r>
+            <w:r>
+              <w:rPr>
+                <w:b/>
+                <w:color w:val="000000"/>
+                <w:sz w:val="20"/>
+                <w:szCs w:val="20"/>
+              </w:rPr>
+              <w:t>LMB__UNEMPRT_DE_z</w:t>
             </w:r>
           </w:p>
         </w:tc>
@@ -2013,7 +2013,7 @@
             <w:vAlign w:val="center"/>
             <w:hideMark/>
           </w:tcPr>
-          <w:p>
+          <w:p w:rsidR="002LMB__UNEMPRT_CUR4B5" w:rsidRDefault="002LMB__UNEMPRT_CUR4B5" w:rsidP="002LMB__UNEMPRT_CUR4B5">
             <w:pPr>
               <w:rPr>
                 <w:rFonts w:cs="Arial"/>
@@ -2042,7 +2042,7 @@
             <w:noWrap/>
             <w:vAlign w:val="center"/>
           </w:tcPr>
-          <w:p>
+          <w:p w14:paraId="0D2ELMB__EMPRT_CURB7" w:rsidR="002LMB__UNEMPRT_CUR4B5" w:rsidRDefault="002LMB__UNEMPRT_CUR4B5" w:rsidP="002LMB__UNEMPRT_CUR4B5">
             <w:pPr>
               <w:jc w:val="center"/>
               <w:rPr>
@@ -2061,7 +2061,7 @@
                 <w:sz w:val="20"/>
                 <w:szCs w:val="20"/>
               </w:rPr>
-              <w:t>F1</w:t>
+              <w:t>LMB__INACT_CUR</w:t>
             </w:r>
           </w:p>
         </w:tc>
@@ -2072,7 +2072,7 @@
             <w:noWrap/>
             <w:vAlign w:val="center"/>
           </w:tcPr>
-          <w:p>
+          <w:p w:rsidR="002LMB__UNEMPRT_CUR4B5" w:rsidP="002LMB__UNEMPRT_CUR4B5">
             <w:pPr>
               <w:jc w:val="center"/>
               <w:rPr>
@@ -2090,7 +2090,7 @@
                 <w:sz w:val="20"/>
                 <w:szCs w:val="20"/>
               </w:rPr>
-              <w:t>F2_p</w:t>
+              <w:t>LMB__INACT_DQ_p</w:t>
             </w:r>
             <w:r>
               <w:rPr>
@@ -2099,16 +2099,16 @@
                 <w:sz w:val="20"/>
                 <w:szCs w:val="20"/>
               </w:rPr>
-              <w:t>F2_n</w:t>
-            </w:r>
-            <w:r>
-              <w:rPr>
-                <w:b/>
-                <w:color w:val="000000"/>
-                <w:sz w:val="20"/>
-                <w:szCs w:val="20"/>
-              </w:rPr>
-              <w:t>F2_z</w:t>
+              <w:t>LMB__INACT_DQ_n</w:t>
+            </w:r>
+            <w:r>
+              <w:rPr>
+                <w:b/>
+                <w:color w:val="000000"/>
+                <w:sz w:val="20"/>
+                <w:szCs w:val="20"/>
+              </w:rPr>
+              <w:t>LMB__INACT_DQ_z</w:t>
             </w:r>
           </w:p>
         </w:tc>
@@ -2119,7 +2119,7 @@
             <w:noWrap/>
             <w:vAlign w:val="center"/>
           </w:tcPr>
-          <w:p>
+          <w:p w:rsidR="002LMB__UNEMPRT_CUR4B5" w:rsidRDefault="002LMB__UNEMPRT_CUR4B5" w:rsidP="002LMB__UNEMPRT_CUR4B5">
             <w:pPr>
               <w:jc w:val="center"/>
               <w:rPr>
@@ -2137,7 +2137,7 @@
                 <w:sz w:val="20"/>
                 <w:szCs w:val="20"/>
               </w:rPr>
-              <w:t>F3_p</w:t>
+              <w:t>LMB__INACT_DY_p</w:t>
             </w:r>
             <w:r>
               <w:rPr>
@@ -2146,16 +2146,16 @@
                 <w:sz w:val="20"/>
                 <w:szCs w:val="20"/>
               </w:rPr>
-              <w:t>F3_n</w:t>
-            </w:r>
-            <w:r>
-              <w:rPr>
-                <w:b/>
-                <w:color w:val="000000"/>
-                <w:sz w:val="20"/>
-                <w:szCs w:val="20"/>
-              </w:rPr>
-              <w:t>F3_z</w:t>
+              <w:t>LMB__INACT_DY_n</w:t>
+            </w:r>
+            <w:r>
+              <w:rPr>
+                <w:b/>
+                <w:color w:val="000000"/>
+                <w:sz w:val="20"/>
+                <w:szCs w:val="20"/>
+              </w:rPr>
+              <w:t>LMB__INACT_DY_z</w:t>
             </w:r>
           </w:p>
         </w:tc>
@@ -2165,7 +2165,7 @@
             <w:shd w:val="clear" w:color="auto" w:fill="D9DDEA" w:themeFill="accent5"/>
             <w:vAlign w:val="center"/>
           </w:tcPr>
-          <w:p>
+          <w:p w:rsidR="002LMB__UNEMPRT_CUR4B5" w:rsidRDefault="008F23LMB__UNEMPRT_CUR" w:rsidP="002LMB__UNEMPRT_CUR4B5">
             <w:pPr>
               <w:jc w:val="center"/>
               <w:rPr>
@@ -2183,7 +2183,7 @@
                 <w:sz w:val="20"/>
                 <w:szCs w:val="20"/>
               </w:rPr>
-              <w:t>F4_p</w:t>
+              <w:t>LMB__INACT_DC_p</w:t>
             </w:r>
             <w:r>
               <w:rPr>
@@ -2192,16 +2192,16 @@
                 <w:sz w:val="20"/>
                 <w:szCs w:val="20"/>
               </w:rPr>
-              <w:t>F4_n</w:t>
-            </w:r>
-            <w:r>
-              <w:rPr>
-                <w:b/>
-                <w:color w:val="000000"/>
-                <w:sz w:val="20"/>
-                <w:szCs w:val="20"/>
-              </w:rPr>
-              <w:t>F4_z</w:t>
+              <w:t>LMB__INACT_DC_n</w:t>
+            </w:r>
+            <w:r>
+              <w:rPr>
+                <w:b/>
+                <w:color w:val="000000"/>
+                <w:sz w:val="20"/>
+                <w:szCs w:val="20"/>
+              </w:rPr>
+              <w:t>LMB__INACT_DC_z</w:t>
             </w:r>
           </w:p>
         </w:tc>
@@ -2211,7 +2211,7 @@
             <w:shd w:val="clear" w:color="auto" w:fill="D9DDEA" w:themeFill="accent5"/>
             <w:vAlign w:val="center"/>
           </w:tcPr>
-          <w:p>
+          <w:p w:rsidP="002LMB__UNEMPRT_CUR4B5">
             <w:pPr>
               <w:jc w:val="center"/>
               <w:rPr>
@@ -2229,7 +2229,7 @@
                 <w:sz w:val="20"/>
                 <w:szCs w:val="20"/>
               </w:rPr>
-              <w:t>F5_p</w:t>
+              <w:t>LMB__INACT_DE_p</w:t>
             </w:r>
             <w:r>
               <w:rPr>
@@ -2238,16 +2238,16 @@
                 <w:sz w:val="20"/>
                 <w:szCs w:val="20"/>
               </w:rPr>
-              <w:t>F5_n</w:t>
-            </w:r>
-            <w:r>
-              <w:rPr>
-                <w:b/>
-                <w:color w:val="000000"/>
-                <w:sz w:val="20"/>
-                <w:szCs w:val="20"/>
-              </w:rPr>
-              <w:t>F5_z</w:t>
+              <w:t>LMB__INACT_DE_n</w:t>
+            </w:r>
+            <w:r>
+              <w:rPr>
+                <w:b/>
+                <w:color w:val="000000"/>
+                <w:sz w:val="20"/>
+                <w:szCs w:val="20"/>
+              </w:rPr>
+              <w:t>LMB__INACT_DE_z</w:t>
             </w:r>
           </w:p>
         </w:tc>
@@ -2294,7 +2294,7 @@
             <w:noWrap/>
             <w:vAlign w:val="center"/>
           </w:tcPr>
-          <w:p>
+          <w:p w:rsidRPr="003LMB__UNEMP_CUR602">
             <w:pPr>
               <w:spacing w:before="0" w:after="0"/>
               <w:jc w:val="center"/>
@@ -2307,7 +2307,7 @@
                 <w:szCs w:val="20"/>
               </w:rPr>
             </w:pPr>
-            <w:r>
+            <w:r w:rsidRPr="003LMB__UNEMP_CUR602">
               <w:rPr>
                 <w:rFonts w:eastAsia="Arial" w:cs="Arial"/>
                 <w:bCs/>
@@ -2316,7 +2316,7 @@
                 <w:sz w:val="20"/>
                 <w:szCs w:val="20"/>
               </w:rPr>
-              <w:t>G1</w:t>
+              <w:t>LMB__INACT5064_CUR</w:t>
             </w:r>
           </w:p>
         </w:tc>
@@ -2327,7 +2327,7 @@
             <w:noWrap/>
             <w:vAlign w:val="center"/>
           </w:tcPr>
-          <w:p>
+          <w:p w:rsidRPr="003LMB__UNEMP_CUR602">
             <w:pPr>
               <w:jc w:val="center"/>
               <w:rPr>
@@ -2339,7 +2339,7 @@
                 <w:szCs w:val="20"/>
               </w:rPr>
             </w:pPr>
-            <w:r>
+            <w:r w:rsidRPr="003LMB__UNEMP_CUR602">
               <w:rPr>
                 <w:bCs/>
                 <w:i/>
@@ -2347,9 +2347,9 @@
                 <w:sz w:val="20"/>
                 <w:szCs w:val="20"/>
               </w:rPr>
-              <w:t>G2_p</w:t>
-            </w:r>
-            <w:r>
+              <w:t>LMB__INACT5064_DQ_p</w:t>
+            </w:r>
+            <w:r w:rsidRPr="003LMB__UNEMP_CUR602">
               <w:rPr>
                 <w:bCs/>
                 <w:i/>
@@ -2357,9 +2357,9 @@
                 <w:sz w:val="20"/>
                 <w:szCs w:val="20"/>
               </w:rPr>
-              <w:t>G2_n</w:t>
-            </w:r>
-            <w:r>
+              <w:t>LMB__INACT5064_DQ_n</w:t>
+            </w:r>
+            <w:r w:rsidRPr="003LMB__UNEMP_CUR602">
               <w:rPr>
                 <w:bCs/>
                 <w:i/>
@@ -2367,7 +2367,7 @@
                 <w:sz w:val="20"/>
                 <w:szCs w:val="20"/>
               </w:rPr>
-              <w:t>G2_z</w:t>
+              <w:t>LMB__INACT5064_DQ_z</w:t>
             </w:r>
           </w:p>
         </w:tc>
@@ -2378,7 +2378,7 @@
             <w:noWrap/>
             <w:vAlign w:val="center"/>
           </w:tcPr>
-          <w:p>
+          <w:p w:rsidRPr="003LMB__UNEMP_CUR602">
             <w:pPr>
               <w:jc w:val="center"/>
               <w:rPr>
@@ -2390,7 +2390,7 @@
                 <w:szCs w:val="20"/>
               </w:rPr>
             </w:pPr>
-            <w:r>
+            <w:r w:rsidRPr="003LMB__UNEMP_CUR602">
               <w:rPr>
                 <w:bCs/>
                 <w:i/>
@@ -2398,9 +2398,9 @@
                 <w:sz w:val="20"/>
                 <w:szCs w:val="20"/>
               </w:rPr>
-              <w:t>G3_p</w:t>
-            </w:r>
-            <w:r>
+              <w:t>LMB__INACT5064_DY_p</w:t>
+            </w:r>
+            <w:r w:rsidRPr="003LMB__UNEMP_CUR602">
               <w:rPr>
                 <w:bCs/>
                 <w:i/>
@@ -2408,9 +2408,9 @@
                 <w:sz w:val="20"/>
                 <w:szCs w:val="20"/>
               </w:rPr>
-              <w:t>G3_n</w:t>
-            </w:r>
-            <w:r>
+              <w:t>LMB__INACT5064_DY_n</w:t>
+            </w:r>
+            <w:r w:rsidRPr="003LMB__UNEMP_CUR602">
               <w:rPr>
                 <w:bCs/>
                 <w:i/>
@@ -2418,7 +2418,7 @@
                 <w:sz w:val="20"/>
                 <w:szCs w:val="20"/>
               </w:rPr>
-              <w:t>G3_z</w:t>
+              <w:t>LMB__INACT5064_DY_z</w:t>
             </w:r>
           </w:p>
         </w:tc>
@@ -2428,7 +2428,7 @@
             <w:shd w:val="clear" w:color="auto" w:fill="D9DDEA" w:themeFill="accent5"/>
             <w:vAlign w:val="center"/>
           </w:tcPr>
-          <w:p>
+          <w:p w14:textId="75LMB__INACT_CUR36AA" w:rsidRPr="003LMB__UNEMP_CUR602" w:rsidRDefault="00FLMB__UNEMPRT_CUR520">
             <w:pPr>
               <w:jc w:val="center"/>
               <w:rPr>
@@ -2440,7 +2440,7 @@
                 <w:szCs w:val="20"/>
               </w:rPr>
             </w:pPr>
-            <w:r>
+            <w:r w:rsidRPr="003LMB__UNEMP_CUR602">
               <w:rPr>
                 <w:bCs/>
                 <w:i/>
@@ -2448,9 +2448,9 @@
                 <w:sz w:val="20"/>
                 <w:szCs w:val="20"/>
               </w:rPr>
-              <w:t>G4_p</w:t>
-            </w:r>
-            <w:r>
+              <w:t>LMB__INACT5064_DC_p</w:t>
+            </w:r>
+            <w:r w:rsidRPr="003LMB__UNEMP_CUR602">
               <w:rPr>
                 <w:bCs/>
                 <w:i/>
@@ -2458,9 +2458,9 @@
                 <w:sz w:val="20"/>
                 <w:szCs w:val="20"/>
               </w:rPr>
-              <w:t>G4_n</w:t>
-            </w:r>
-            <w:r>
+              <w:t>LMB__INACT5064_DC_n</w:t>
+            </w:r>
+            <w:r w:rsidRPr="003LMB__UNEMP_CUR602">
               <w:rPr>
                 <w:bCs/>
                 <w:i/>
@@ -2468,7 +2468,7 @@
                 <w:sz w:val="20"/>
                 <w:szCs w:val="20"/>
               </w:rPr>
-              <w:t>G4_z</w:t>
+              <w:t>LMB__INACT5064_DC_z</w:t>
             </w:r>
           </w:p>
         </w:tc>
@@ -2478,7 +2478,7 @@
             <w:shd w:val="clear" w:color="auto" w:fill="D9DDEA" w:themeFill="accent5"/>
             <w:vAlign w:val="center"/>
           </w:tcPr>
-          <w:p>
+          <w:p w14:textId="41CLMB__EMP_CUR483" w:rsidRPr="003LMB__UNEMP_CUR602">
             <w:pPr>
               <w:jc w:val="center"/>
               <w:rPr>
@@ -2490,7 +2490,7 @@
                 <w:szCs w:val="20"/>
               </w:rPr>
             </w:pPr>
-            <w:r>
+            <w:r w:rsidRPr="003LMB__UNEMP_CUR602">
               <w:rPr>
                 <w:bCs/>
                 <w:i/>
@@ -2498,9 +2498,9 @@
                 <w:sz w:val="20"/>
                 <w:szCs w:val="20"/>
               </w:rPr>
-              <w:t>G5_p</w:t>
-            </w:r>
-            <w:r>
+              <w:t>LMB__INACT5064_DE_p</w:t>
+            </w:r>
+            <w:r w:rsidRPr="003LMB__UNEMP_CUR602">
               <w:rPr>
                 <w:bCs/>
                 <w:i/>
@@ -2508,9 +2508,9 @@
                 <w:sz w:val="20"/>
                 <w:szCs w:val="20"/>
               </w:rPr>
-              <w:t>G5_n</w:t>
-            </w:r>
-            <w:r>
+              <w:t>LMB__INACT5064_DE_n</w:t>
+            </w:r>
+            <w:r w:rsidRPr="003LMB__UNEMP_CUR602">
               <w:rPr>
                 <w:bCs/>
                 <w:i/>
@@ -2518,7 +2518,7 @@
                 <w:sz w:val="20"/>
                 <w:szCs w:val="20"/>
               </w:rPr>
-              <w:t>G5_z</w:t>
+              <w:t>LMB__INACT5064_DE_z</w:t>
             </w:r>
           </w:p>
         </w:tc>
@@ -2583,7 +2583,7 @@
                 <w:sz w:val="20"/>
                 <w:szCs w:val="20"/>
               </w:rPr>
-              <w:t>H1</w:t>
+              <w:t>LMB__INACTRT_CUR</w:t>
             </w:r>
           </w:p>
         </w:tc>
@@ -2594,7 +2594,7 @@
             <w:noWrap/>
             <w:vAlign w:val="center"/>
           </w:tcPr>
-          <w:p>
+          <w:p w14:paraId="4LMB__UNEMPRT_CURCC41D" w:rsidRDefault="00LMB__UNEMPRT_CUR04B4">
             <w:pPr>
               <w:jc w:val="center"/>
               <w:rPr>
@@ -2612,7 +2612,7 @@
                 <w:sz w:val="20"/>
                 <w:szCs w:val="20"/>
               </w:rPr>
-              <w:t>H2_p</w:t>
+              <w:t>LMB__INACTRT_DQ_p</w:t>
             </w:r>
             <w:r>
               <w:rPr>
@@ -2621,16 +2621,16 @@
                 <w:sz w:val="20"/>
                 <w:szCs w:val="20"/>
               </w:rPr>
-              <w:t>H2_n</w:t>
-            </w:r>
-            <w:r>
-              <w:rPr>
-                <w:b/>
-                <w:color w:val="000000"/>
-                <w:sz w:val="20"/>
-                <w:szCs w:val="20"/>
-              </w:rPr>
-              <w:t>H2_z</w:t>
+              <w:t>LMB__INACTRT_DQ_n</w:t>
+            </w:r>
+            <w:r>
+              <w:rPr>
+                <w:b/>
+                <w:color w:val="000000"/>
+                <w:sz w:val="20"/>
+                <w:szCs w:val="20"/>
+              </w:rPr>
+              <w:t>LMB__INACTRT_DQ_z</w:t>
             </w:r>
           </w:p>
         </w:tc>
@@ -2659,7 +2659,7 @@
                 <w:sz w:val="20"/>
                 <w:szCs w:val="20"/>
               </w:rPr>
-              <w:t>H3_p</w:t>
+              <w:t>LMB__INACTRT_DY_p</w:t>
             </w:r>
             <w:r>
               <w:rPr>
@@ -2668,16 +2668,16 @@
                 <w:sz w:val="20"/>
                 <w:szCs w:val="20"/>
               </w:rPr>
-              <w:t>H3_n</w:t>
-            </w:r>
-            <w:r>
-              <w:rPr>
-                <w:b/>
-                <w:color w:val="000000"/>
-                <w:sz w:val="20"/>
-                <w:szCs w:val="20"/>
-              </w:rPr>
-              <w:t>H3_z</w:t>
+              <w:t>LMB__INACTRT_DY_n</w:t>
+            </w:r>
+            <w:r>
+              <w:rPr>
+                <w:b/>
+                <w:color w:val="000000"/>
+                <w:sz w:val="20"/>
+                <w:szCs w:val="20"/>
+              </w:rPr>
+              <w:t>LMB__INACTRT_DY_z</w:t>
             </w:r>
           </w:p>
         </w:tc>
@@ -2687,7 +2687,7 @@
             <w:shd w:val="clear" w:color="auto" w:fill="D9DDEA" w:themeFill="accent5"/>
             <w:vAlign w:val="center"/>
           </w:tcPr>
-          <w:p>
+          <w:p w:rsidRDefault="00FLMB__UNEMPRT_CUR520">
             <w:pPr>
               <w:jc w:val="center"/>
               <w:rPr>
@@ -2705,7 +2705,7 @@
                 <w:sz w:val="20"/>
                 <w:szCs w:val="20"/>
               </w:rPr>
-              <w:t>H4_p</w:t>
+              <w:t>LMB__INACTRT_DC_p</w:t>
             </w:r>
             <w:r>
               <w:rPr>
@@ -2714,16 +2714,16 @@
                 <w:sz w:val="20"/>
                 <w:szCs w:val="20"/>
               </w:rPr>
-              <w:t>H4_n</w:t>
-            </w:r>
-            <w:r>
-              <w:rPr>
-                <w:b/>
-                <w:color w:val="000000"/>
-                <w:sz w:val="20"/>
-                <w:szCs w:val="20"/>
-              </w:rPr>
-              <w:t>H4_z</w:t>
+              <w:t>LMB__INACTRT_DC_n</w:t>
+            </w:r>
+            <w:r>
+              <w:rPr>
+                <w:b/>
+                <w:color w:val="000000"/>
+                <w:sz w:val="20"/>
+                <w:szCs w:val="20"/>
+              </w:rPr>
+              <w:t>LMB__INACTRT_DC_z</w:t>
             </w:r>
           </w:p>
         </w:tc>
@@ -2751,7 +2751,7 @@
                 <w:sz w:val="20"/>
                 <w:szCs w:val="20"/>
               </w:rPr>
-              <w:t>H5_p</w:t>
+              <w:t>LMB__INACTRT_DE_p</w:t>
             </w:r>
             <w:r>
               <w:rPr>
@@ -2760,16 +2760,16 @@
                 <w:sz w:val="20"/>
                 <w:szCs w:val="20"/>
               </w:rPr>
-              <w:t>H5_n</w:t>
-            </w:r>
-            <w:r>
-              <w:rPr>
-                <w:b/>
-                <w:color w:val="000000"/>
-                <w:sz w:val="20"/>
-                <w:szCs w:val="20"/>
-              </w:rPr>
-              <w:t>H5_z</w:t>
+              <w:t>LMB__INACTRT_DE_n</w:t>
+            </w:r>
+            <w:r>
+              <w:rPr>
+                <w:b/>
+                <w:color w:val="000000"/>
+                <w:sz w:val="20"/>
+                <w:szCs w:val="20"/>
+              </w:rPr>
+              <w:t>LMB__INACTRT_DE_z</w:t>
             </w:r>
           </w:p>
         </w:tc>
@@ -2815,7 +2815,7 @@
             <w:shd w:val="clear" w:color="auto" w:fill="D9DDEA" w:themeFill="accent5"/>
             <w:noWrap/>
           </w:tcPr>
-          <w:p>
+          <w:p w:rsidRPr="003LMB__UNEMP_CUR602">
             <w:pPr>
               <w:jc w:val="center"/>
               <w:rPr>
@@ -2827,7 +2827,7 @@
                 <w:szCs w:val="20"/>
               </w:rPr>
             </w:pPr>
-            <w:r>
+            <w:r w:rsidRPr="003LMB__UNEMP_CUR602">
               <w:rPr>
                 <w:rFonts w:eastAsia="Arial" w:cs="Arial"/>
                 <w:bCs/>
@@ -2836,7 +2836,7 @@
                 <w:sz w:val="20"/>
                 <w:szCs w:val="20"/>
               </w:rPr>
-              <w:t>I1</w:t>
+              <w:t>LMB__INACT5064RT_CUR</w:t>
             </w:r>
           </w:p>
         </w:tc>
@@ -2846,7 +2846,7 @@
             <w:shd w:val="clear" w:color="auto" w:fill="D9DDEA" w:themeFill="accent5"/>
             <w:noWrap/>
           </w:tcPr>
-          <w:p>
+          <w:p w:rsidRPr="003LMB__UNEMP_CUR602">
             <w:pPr>
               <w:jc w:val="center"/>
               <w:rPr>
@@ -2858,7 +2858,7 @@
                 <w:szCs w:val="20"/>
               </w:rPr>
             </w:pPr>
-            <w:r>
+            <w:r w:rsidRPr="003LMB__UNEMP_CUR602">
               <w:rPr>
                 <w:rFonts w:eastAsia="Arial" w:cs="Arial"/>
                 <w:bCs/>
@@ -2867,9 +2867,9 @@
                 <w:sz w:val="20"/>
                 <w:szCs w:val="20"/>
               </w:rPr>
-              <w:t>I2_z</w:t>
-            </w:r>
-            <w:r>
+              <w:t>LMB__INACT5064RT_DQ_z</w:t>
+            </w:r>
+            <w:r w:rsidRPr="003LMB__UNEMP_CUR602">
               <w:rPr>
                 <w:bCs/>
                 <w:i/>
@@ -2877,9 +2877,9 @@
                 <w:sz w:val="20"/>
                 <w:szCs w:val="20"/>
               </w:rPr>
-              <w:t>I2_p</w:t>
-            </w:r>
-            <w:r>
+              <w:t>LMB__INACT5064RT_DQ_p</w:t>
+            </w:r>
+            <w:r w:rsidRPr="003LMB__UNEMP_CUR602">
               <w:rPr>
                 <w:bCs/>
                 <w:i/>
@@ -2887,7 +2887,7 @@
                 <w:sz w:val="20"/>
                 <w:szCs w:val="20"/>
               </w:rPr>
-              <w:t>I2_n</w:t>
+              <w:t>LMB__INACT5064RT_DQ_n</w:t>
             </w:r>
           </w:p>
         </w:tc>
@@ -2897,7 +2897,7 @@
             <w:shd w:val="clear" w:color="auto" w:fill="D9DDEA" w:themeFill="accent5"/>
             <w:noWrap/>
           </w:tcPr>
-          <w:p>
+          <w:p w:rsidRPr="003LMB__UNEMP_CUR602">
             <w:pPr>
               <w:jc w:val="center"/>
               <w:rPr>
@@ -2909,7 +2909,7 @@
                 <w:szCs w:val="20"/>
               </w:rPr>
             </w:pPr>
-            <w:r>
+            <w:r w:rsidRPr="003LMB__UNEMP_CUR602">
               <w:rPr>
                 <w:rFonts w:eastAsia="Arial" w:cs="Arial"/>
                 <w:bCs/>
@@ -2918,9 +2918,9 @@
                 <w:sz w:val="20"/>
                 <w:szCs w:val="20"/>
               </w:rPr>
-              <w:t>I3_z</w:t>
-            </w:r>
-            <w:r>
+              <w:t>LMB__INACT5064RT_DY_z</w:t>
+            </w:r>
+            <w:r w:rsidRPr="003LMB__UNEMP_CUR602">
               <w:rPr>
                 <w:bCs/>
                 <w:i/>
@@ -2928,9 +2928,9 @@
                 <w:sz w:val="20"/>
                 <w:szCs w:val="20"/>
               </w:rPr>
-              <w:t>I3_p</w:t>
-            </w:r>
-            <w:r>
+              <w:t>LMB__INACT5064RT_DY_p</w:t>
+            </w:r>
+            <w:r w:rsidRPr="003LMB__UNEMP_CUR602">
               <w:rPr>
                 <w:bCs/>
                 <w:i/>
@@ -2938,7 +2938,7 @@
                 <w:sz w:val="20"/>
                 <w:szCs w:val="20"/>
               </w:rPr>
-              <w:t>I3_n</w:t>
+              <w:t>LMB__INACT5064RT_DY_n</w:t>
             </w:r>
           </w:p>
         </w:tc>
@@ -2947,7 +2947,7 @@
             <w:tcW w:w="948" w:type="pct"/>
             <w:shd w:val="clear" w:color="auto" w:fill="D9DDEA" w:themeFill="accent5"/>
           </w:tcPr>
-          <w:p>
+          <w:p w:rsidRPr="003LMB__UNEMP_CUR602">
             <w:pPr>
               <w:jc w:val="center"/>
               <w:rPr>
@@ -2959,7 +2959,7 @@
                 <w:szCs w:val="20"/>
               </w:rPr>
             </w:pPr>
-            <w:r>
+            <w:r w:rsidRPr="003LMB__UNEMP_CUR602">
               <w:rPr>
                 <w:rFonts w:eastAsia="Arial" w:cs="Arial"/>
                 <w:bCs/>
@@ -2968,9 +2968,9 @@
                 <w:sz w:val="20"/>
                 <w:szCs w:val="20"/>
               </w:rPr>
-              <w:t>I4_z</w:t>
-            </w:r>
-            <w:r>
+              <w:t>LMB__INACT5064RT_DC_z</w:t>
+            </w:r>
+            <w:r w:rsidRPr="003LMB__UNEMP_CUR602">
               <w:rPr>
                 <w:bCs/>
                 <w:i/>
@@ -2978,9 +2978,9 @@
                 <w:sz w:val="20"/>
                 <w:szCs w:val="20"/>
               </w:rPr>
-              <w:t>I4_p</w:t>
-            </w:r>
-            <w:r>
+              <w:t>LMB__INACT5064RT_DC_p</w:t>
+            </w:r>
+            <w:r w:rsidRPr="003LMB__UNEMP_CUR602">
               <w:rPr>
                 <w:bCs/>
                 <w:i/>
@@ -2988,7 +2988,7 @@
                 <w:sz w:val="20"/>
                 <w:szCs w:val="20"/>
               </w:rPr>
-              <w:t>I4_n</w:t>
+              <w:t>LMB__INACT5064RT_DC_n</w:t>
             </w:r>
           </w:p>
         </w:tc>
@@ -2997,7 +2997,7 @@
             <w:tcW w:w="801" w:type="pct"/>
             <w:shd w:val="clear" w:color="auto" w:fill="D9DDEA" w:themeFill="accent5"/>
           </w:tcPr>
-          <w:p>
+          <w:p w:rsidRPr="003LMB__UNEMP_CUR602">
             <w:pPr>
               <w:jc w:val="center"/>
               <w:rPr>
@@ -3009,7 +3009,7 @@
                 <w:szCs w:val="20"/>
               </w:rPr>
             </w:pPr>
-            <w:r>
+            <w:r w:rsidRPr="003LMB__UNEMP_CUR602">
               <w:rPr>
                 <w:rFonts w:eastAsia="Arial" w:cs="Arial"/>
                 <w:bCs/>
@@ -3018,9 +3018,9 @@
                 <w:sz w:val="20"/>
                 <w:szCs w:val="20"/>
               </w:rPr>
-              <w:t>I5_z</w:t>
-            </w:r>
-            <w:r>
+              <w:t>LMB__INACT5064RT_DE_z</w:t>
+            </w:r>
+            <w:r w:rsidRPr="003LMB__UNEMP_CUR602">
               <w:rPr>
                 <w:bCs/>
                 <w:i/>
@@ -3028,9 +3028,9 @@
                 <w:sz w:val="20"/>
                 <w:szCs w:val="20"/>
               </w:rPr>
-              <w:t>I5_p</w:t>
-            </w:r>
-            <w:r>
+              <w:t>LMB__INACT5064RT_DE_p</w:t>
+            </w:r>
+            <w:r w:rsidRPr="003LMB__UNEMP_CUR602">
               <w:rPr>
                 <w:bCs/>
                 <w:i/>
@@ -3038,7 +3038,7 @@
                 <w:sz w:val="20"/>
                 <w:szCs w:val="20"/>
               </w:rPr>
-              <w:t>I5_n</w:t>
+              <w:t>LMB__INACT5064RT_DE_n</w:t>
             </w:r>
           </w:p>
         </w:tc>
@@ -3094,7 +3094,7 @@
             <w:noWrap/>
             <w:vAlign w:val="center"/>
           </w:tcPr>
-          <w:p>
+          <w:p w14:textId="4199FLMB__EMP_CUR2">
             <w:pPr>
               <w:jc w:val="center"/>
               <w:rPr>
@@ -3113,7 +3113,7 @@
                 <w:sz w:val="20"/>
                 <w:szCs w:val="20"/>
               </w:rPr>
-              <w:t>J1_z</w:t>
+              <w:t>LMB__VAC_CUR_z</w:t>
             </w:r>
           </w:p>
         </w:tc>
@@ -3143,7 +3143,7 @@
                 <w:sz w:val="20"/>
                 <w:szCs w:val="20"/>
               </w:rPr>
-              <w:t>J2_z</w:t>
+              <w:t>LMB__VAC_DQ_z</w:t>
             </w:r>
           </w:p>
         </w:tc>
@@ -3173,7 +3173,7 @@
                 <w:sz w:val="20"/>
                 <w:szCs w:val="20"/>
               </w:rPr>
-              <w:t>J3_z</w:t>
+              <w:t>LMB__VAC_DY_z</w:t>
             </w:r>
           </w:p>
         </w:tc>
@@ -3202,7 +3202,7 @@
                 <w:sz w:val="20"/>
                 <w:szCs w:val="20"/>
               </w:rPr>
-              <w:t>J4_z</w:t>
+              <w:t>LMB__VAC_DC_z</w:t>
             </w:r>
           </w:p>
         </w:tc>
@@ -3231,12 +3231,12 @@
                 <w:sz w:val="20"/>
                 <w:szCs w:val="20"/>
               </w:rPr>
-              <w:t>J5_z</w:t>
+              <w:t>LMB__VAC_DE_z</w:t>
             </w:r>
           </w:p>
         </w:tc>
       </w:tr>
-      <w:tr>
+      <w:tr w14:paraId="0LMB__EMP_CUR22C04">
         <w:trPr>
           <w:trHeight w:hRule="exact" w:val="894"/>
           <w:jc w:val="center"/>
@@ -3248,7 +3248,7 @@
             <w:vAlign w:val="center"/>
             <w:hideMark/>
           </w:tcPr>
-          <w:p>
+          <w:p w:rsidP="008410LMB__EMP_CUR">
             <w:pPr>
               <w:rPr>
                 <w:rFonts w:cs="Arial"/>
@@ -3305,7 +3305,7 @@
             <w:noWrap/>
             <w:vAlign w:val="center"/>
           </w:tcPr>
-          <w:p>
+          <w:p w:rsidP="008410LMB__EMP_CUR">
             <w:pPr>
               <w:jc w:val="center"/>
               <w:rPr>
@@ -3324,7 +3324,7 @@
                 <w:sz w:val="20"/>
                 <w:szCs w:val="20"/>
               </w:rPr>
-              <w:t>K1</w:t>
+              <w:t>LMB__PAYROLL_CUR</w:t>
             </w:r>
           </w:p>
         </w:tc>
@@ -3352,7 +3352,7 @@
                 <w:sz w:val="20"/>
                 <w:szCs w:val="20"/>
               </w:rPr>
-              <w:t>K2_p</w:t>
+              <w:t>LMB__PAYROLL_DQ_p</w:t>
             </w:r>
             <w:r>
               <w:rPr>
@@ -3361,16 +3361,16 @@
                 <w:sz w:val="20"/>
                 <w:szCs w:val="20"/>
               </w:rPr>
-              <w:t>K2_n</w:t>
-            </w:r>
-            <w:r>
-              <w:rPr>
-                <w:b/>
-                <w:color w:val="000000"/>
-                <w:sz w:val="20"/>
-                <w:szCs w:val="20"/>
-              </w:rPr>
-              <w:t>K2_z</w:t>
+              <w:t>LMB__PAYROLL_DQ_n</w:t>
+            </w:r>
+            <w:r>
+              <w:rPr>
+                <w:b/>
+                <w:color w:val="000000"/>
+                <w:sz w:val="20"/>
+                <w:szCs w:val="20"/>
+              </w:rPr>
+              <w:t>LMB__PAYROLL_DQ_z</w:t>
             </w:r>
           </w:p>
         </w:tc>
@@ -3381,7 +3381,7 @@
             <w:noWrap/>
             <w:vAlign w:val="center"/>
           </w:tcPr>
-          <w:p>
+          <w:p w14:paraId="5ALMB__UNEMPRT_CUR2C39" w:rsidP="008410LMB__EMP_CUR">
             <w:pPr>
               <w:jc w:val="center"/>
               <w:rPr>
@@ -3399,7 +3399,7 @@
                 <w:sz w:val="20"/>
                 <w:szCs w:val="20"/>
               </w:rPr>
-              <w:t>K3_p</w:t>
+              <w:t>LMB__PAYROLL_DY_p</w:t>
             </w:r>
             <w:r>
               <w:rPr>
@@ -3408,16 +3408,16 @@
                 <w:sz w:val="20"/>
                 <w:szCs w:val="20"/>
               </w:rPr>
-              <w:t>K3_n</w:t>
-            </w:r>
-            <w:r>
-              <w:rPr>
-                <w:b/>
-                <w:color w:val="000000"/>
-                <w:sz w:val="20"/>
-                <w:szCs w:val="20"/>
-              </w:rPr>
-              <w:t>K3_z</w:t>
+              <w:t>LMB__PAYROLL_DY_n</w:t>
+            </w:r>
+            <w:r>
+              <w:rPr>
+                <w:b/>
+                <w:color w:val="000000"/>
+                <w:sz w:val="20"/>
+                <w:szCs w:val="20"/>
+              </w:rPr>
+              <w:t>LMB__PAYROLL_DY_z</w:t>
             </w:r>
           </w:p>
         </w:tc>
@@ -3427,7 +3427,7 @@
             <w:shd w:val="clear" w:color="auto" w:fill="D9DDEA" w:themeFill="accent5"/>
             <w:vAlign w:val="center"/>
           </w:tcPr>
-          <w:p>
+          <w:p w:rsidP="008410LMB__EMP_CUR">
             <w:pPr>
               <w:jc w:val="center"/>
               <w:rPr>
@@ -3445,7 +3445,7 @@
                 <w:sz w:val="20"/>
                 <w:szCs w:val="20"/>
               </w:rPr>
-              <w:t>K4_p</w:t>
+              <w:t>LMB__PAYROLL_DC_p</w:t>
             </w:r>
             <w:r>
               <w:rPr>
@@ -3454,16 +3454,16 @@
                 <w:sz w:val="20"/>
                 <w:szCs w:val="20"/>
               </w:rPr>
-              <w:t>K4_n</w:t>
-            </w:r>
-            <w:r>
-              <w:rPr>
-                <w:b/>
-                <w:color w:val="000000"/>
-                <w:sz w:val="20"/>
-                <w:szCs w:val="20"/>
-              </w:rPr>
-              <w:t>K4_z</w:t>
+              <w:t>LMB__PAYROLL_DC_n</w:t>
+            </w:r>
+            <w:r>
+              <w:rPr>
+                <w:b/>
+                <w:color w:val="000000"/>
+                <w:sz w:val="20"/>
+                <w:szCs w:val="20"/>
+              </w:rPr>
+              <w:t>LMB__PAYROLL_DC_z</w:t>
             </w:r>
           </w:p>
         </w:tc>
@@ -3473,7 +3473,7 @@
             <w:shd w:val="clear" w:color="auto" w:fill="D9DDEA" w:themeFill="accent5"/>
             <w:vAlign w:val="center"/>
           </w:tcPr>
-          <w:p>
+          <w:p w:rsidP="008410LMB__EMP_CUR">
             <w:pPr>
               <w:jc w:val="center"/>
               <w:rPr>
@@ -3491,7 +3491,7 @@
                 <w:sz w:val="20"/>
                 <w:szCs w:val="20"/>
               </w:rPr>
-              <w:t>K5_p</w:t>
+              <w:t>LMB__PAYROLL_DE_p</w:t>
             </w:r>
             <w:r>
               <w:rPr>
@@ -3500,21 +3500,21 @@
                 <w:sz w:val="20"/>
                 <w:szCs w:val="20"/>
               </w:rPr>
-              <w:t>K5_n</w:t>
-            </w:r>
-            <w:r>
-              <w:rPr>
-                <w:b/>
-                <w:color w:val="000000"/>
-                <w:sz w:val="20"/>
-                <w:szCs w:val="20"/>
-              </w:rPr>
-              <w:t>K5_z</w:t>
+              <w:t>LMB__PAYROLL_DE_n</w:t>
+            </w:r>
+            <w:r>
+              <w:rPr>
+                <w:b/>
+                <w:color w:val="000000"/>
+                <w:sz w:val="20"/>
+                <w:szCs w:val="20"/>
+              </w:rPr>
+              <w:t>LMB__PAYROLL_DE_z</w:t>
             </w:r>
           </w:p>
         </w:tc>
       </w:tr>
-      <w:tr>
+      <w:tr w14:textId="470LMB__EMP_CUR7CA">
         <w:trPr>
           <w:trHeight w:hRule="exact" w:val="999"/>
           <w:jc w:val="center"/>
@@ -3526,7 +3526,7 @@
             <w:vAlign w:val="center"/>
             <w:hideMark/>
           </w:tcPr>
-          <w:p>
+          <w:p w:rsidP="008410LMB__EMP_CUR">
             <w:pPr>
               <w:rPr>
                 <w:rFonts w:cs="Arial"/>
@@ -3594,7 +3594,7 @@
             <w:shd w:val="clear" w:color="auto" w:fill="D9DDEA" w:themeFill="accent5"/>
             <w:vAlign w:val="center"/>
           </w:tcPr>
-          <w:p>
+          <w:p w14:textId="35EFF9LMB__UNEMP_CUR" w:rsidP="008410LMB__EMP_CUR">
             <w:pPr>
               <w:spacing w:before="0"/>
               <w:jc w:val="center"/>
@@ -3612,7 +3612,7 @@
                 <w:sz w:val="20"/>
                 <w:szCs w:val="20"/>
               </w:rPr>
-              <w:t>L1</w:t>
+              <w:t>LMB__WAGENOM_CUR</w:t>
             </w:r>
           </w:p>
         </w:tc>
@@ -3623,7 +3623,7 @@
             <w:noWrap/>
             <w:vAlign w:val="center"/>
           </w:tcPr>
-          <w:p>
+          <w:p w:rsidP="008410LMB__EMP_CUR">
             <w:pPr>
               <w:jc w:val="center"/>
               <w:rPr>
@@ -3641,7 +3641,7 @@
                 <w:sz w:val="20"/>
                 <w:szCs w:val="20"/>
               </w:rPr>
-              <w:t>L2_p</w:t>
+              <w:t>LMB__WAGENOM_DQ_p</w:t>
             </w:r>
             <w:r>
               <w:rPr>
@@ -3650,16 +3650,16 @@
                 <w:sz w:val="20"/>
                 <w:szCs w:val="20"/>
               </w:rPr>
-              <w:t>L2_n</w:t>
-            </w:r>
-            <w:r>
-              <w:rPr>
-                <w:b/>
-                <w:color w:val="000000"/>
-                <w:sz w:val="20"/>
-                <w:szCs w:val="20"/>
-              </w:rPr>
-              <w:t>L2_z</w:t>
+              <w:t>LMB__WAGENOM_DQ_n</w:t>
+            </w:r>
+            <w:r>
+              <w:rPr>
+                <w:b/>
+                <w:color w:val="000000"/>
+                <w:sz w:val="20"/>
+                <w:szCs w:val="20"/>
+              </w:rPr>
+              <w:t>LMB__WAGENOM_DQ_z</w:t>
             </w:r>
           </w:p>
         </w:tc>
@@ -3670,7 +3670,7 @@
             <w:noWrap/>
             <w:vAlign w:val="center"/>
           </w:tcPr>
-          <w:p>
+          <w:p w:rsidP="008410LMB__EMP_CUR">
             <w:pPr>
               <w:jc w:val="center"/>
               <w:rPr>
@@ -3688,7 +3688,7 @@
                 <w:sz w:val="20"/>
                 <w:szCs w:val="20"/>
               </w:rPr>
-              <w:t>L3_p</w:t>
+              <w:t>LMB__WAGENOM_DY_p</w:t>
             </w:r>
             <w:r>
               <w:rPr>
@@ -3697,16 +3697,16 @@
                 <w:sz w:val="20"/>
                 <w:szCs w:val="20"/>
               </w:rPr>
-              <w:t>L3_n</w:t>
-            </w:r>
-            <w:r>
-              <w:rPr>
-                <w:b/>
-                <w:color w:val="000000"/>
-                <w:sz w:val="20"/>
-                <w:szCs w:val="20"/>
-              </w:rPr>
-              <w:t>L3_z</w:t>
+              <w:t>LMB__WAGENOM_DY_n</w:t>
+            </w:r>
+            <w:r>
+              <w:rPr>
+                <w:b/>
+                <w:color w:val="000000"/>
+                <w:sz w:val="20"/>
+                <w:szCs w:val="20"/>
+              </w:rPr>
+              <w:t>LMB__WAGENOM_DY_z</w:t>
             </w:r>
           </w:p>
         </w:tc>
@@ -3716,7 +3716,7 @@
             <w:shd w:val="clear" w:color="auto" w:fill="D9DDEA" w:themeFill="accent5"/>
             <w:vAlign w:val="center"/>
           </w:tcPr>
-          <w:p>
+          <w:p w:rsidP="008410LMB__EMP_CUR">
             <w:pPr>
               <w:jc w:val="center"/>
               <w:rPr>
@@ -3734,7 +3734,7 @@
                 <w:sz w:val="20"/>
                 <w:szCs w:val="20"/>
               </w:rPr>
-              <w:t>L4_p</w:t>
+              <w:t>LMB__WAGENOM_DC_p</w:t>
             </w:r>
             <w:r>
               <w:rPr>
@@ -3743,16 +3743,16 @@
                 <w:sz w:val="20"/>
                 <w:szCs w:val="20"/>
               </w:rPr>
-              <w:t>L4_n</w:t>
-            </w:r>
-            <w:r>
-              <w:rPr>
-                <w:b/>
-                <w:color w:val="000000"/>
-                <w:sz w:val="20"/>
-                <w:szCs w:val="20"/>
-              </w:rPr>
-              <w:t>L4_z</w:t>
+              <w:t>LMB__WAGENOM_DC_n</w:t>
+            </w:r>
+            <w:r>
+              <w:rPr>
+                <w:b/>
+                <w:color w:val="000000"/>
+                <w:sz w:val="20"/>
+                <w:szCs w:val="20"/>
+              </w:rPr>
+              <w:t>LMB__WAGENOM_DC_z</w:t>
             </w:r>
           </w:p>
         </w:tc>
@@ -3762,7 +3762,7 @@
             <w:shd w:val="clear" w:color="auto" w:fill="D9DDEA" w:themeFill="accent5"/>
             <w:vAlign w:val="center"/>
           </w:tcPr>
-          <w:p>
+          <w:p w:rsidP="008410LMB__EMP_CUR">
             <w:pPr>
               <w:jc w:val="center"/>
               <w:rPr>
@@ -3780,7 +3780,7 @@
                 <w:sz w:val="20"/>
                 <w:szCs w:val="20"/>
               </w:rPr>
-              <w:t>L5_p</w:t>
+              <w:t>LMB__WAGENOM_DE_p</w:t>
             </w:r>
             <w:r>
               <w:rPr>
@@ -3789,16 +3789,16 @@
                 <w:sz w:val="20"/>
                 <w:szCs w:val="20"/>
               </w:rPr>
-              <w:t>L5_n</w:t>
-            </w:r>
-            <w:r>
-              <w:rPr>
-                <w:b/>
-                <w:color w:val="000000"/>
-                <w:sz w:val="20"/>
-                <w:szCs w:val="20"/>
-              </w:rPr>
-              <w:t>L5_z</w:t>
+              <w:t>LMB__WAGENOM_DE_n</w:t>
+            </w:r>
+            <w:r>
+              <w:rPr>
+                <w:b/>
+                <w:color w:val="000000"/>
+                <w:sz w:val="20"/>
+                <w:szCs w:val="20"/>
+              </w:rPr>
+              <w:t>LMB__WAGENOM_DE_z</w:t>
             </w:r>
           </w:p>
         </w:tc>
@@ -3815,7 +3815,7 @@
             <w:vAlign w:val="center"/>
             <w:hideMark/>
           </w:tcPr>
-          <w:p>
+          <w:p w:rsidP="008410LMB__EMP_CUR">
             <w:pPr>
               <w:rPr>
                 <w:rFonts w:cs="Arial"/>
@@ -3883,7 +3883,7 @@
             <w:shd w:val="clear" w:color="auto" w:fill="D9DDEA" w:themeFill="accent5"/>
             <w:vAlign w:val="center"/>
           </w:tcPr>
-          <w:p>
+          <w:p w:rsidP="008410LMB__EMP_CUR">
             <w:pPr>
               <w:spacing w:before="0"/>
               <w:jc w:val="center"/>
@@ -3907,7 +3907,7 @@
                 <w:sz w:val="20"/>
                 <w:szCs w:val="20"/>
               </w:rPr>
-              <w:t>M1</w:t>
+              <w:t>LMB__WAGECPI_CUR</w:t>
             </w:r>
           </w:p>
         </w:tc>
@@ -3918,7 +3918,7 @@
             <w:noWrap/>
             <w:vAlign w:val="center"/>
           </w:tcPr>
-          <w:p>
+          <w:p w:rsidP="008410LMB__EMP_CUR">
             <w:pPr>
               <w:jc w:val="center"/>
               <w:rPr>
@@ -3941,7 +3941,7 @@
                 <w:sz w:val="20"/>
                 <w:szCs w:val="20"/>
               </w:rPr>
-              <w:t>M2_z</w:t>
+              <w:t>LMB__WAGECPI_DQ_z</w:t>
             </w:r>
             <w:r>
               <w:rPr>
@@ -3950,7 +3950,7 @@
                 <w:sz w:val="20"/>
                 <w:szCs w:val="20"/>
               </w:rPr>
-              <w:t>M2_p</w:t>
+              <w:t>LMB__WAGECPI_DQ_p</w:t>
             </w:r>
             <w:r>
               <w:rPr>
@@ -3959,7 +3959,7 @@
                 <w:sz w:val="20"/>
                 <w:szCs w:val="20"/>
               </w:rPr>
-              <w:t>M2_n</w:t>
+              <w:t>LMB__WAGECPI_DQ_n</w:t>
             </w:r>
           </w:p>
         </w:tc>
@@ -3970,7 +3970,7 @@
             <w:noWrap/>
             <w:vAlign w:val="center"/>
           </w:tcPr>
-          <w:p>
+          <w:p w:rsidP="008410LMB__EMP_CUR">
             <w:pPr>
               <w:spacing w:before="0" w:after="0"/>
               <w:jc w:val="center"/>
@@ -3994,7 +3994,7 @@
                 <w:sz w:val="20"/>
                 <w:szCs w:val="20"/>
               </w:rPr>
-              <w:t>M3_p</w:t>
+              <w:t>LMB__WAGECPI_DY_p</w:t>
             </w:r>
             <w:r>
               <w:rPr>
@@ -4006,7 +4006,7 @@
                 <w:sz w:val="20"/>
                 <w:szCs w:val="20"/>
               </w:rPr>
-              <w:t>M3_n</w:t>
+              <w:t>LMB__WAGECPI_DY_n</w:t>
             </w:r>
             <w:r>
               <w:rPr>
@@ -4018,7 +4018,7 @@
                 <w:sz w:val="20"/>
                 <w:szCs w:val="20"/>
               </w:rPr>
-              <w:t>M3_z</w:t>
+              <w:t>LMB__WAGECPI_DY_z</w:t>
             </w:r>
           </w:p>
         </w:tc>
@@ -4028,7 +4028,7 @@
             <w:shd w:val="clear" w:color="auto" w:fill="D9DDEA" w:themeFill="accent5"/>
             <w:vAlign w:val="center"/>
           </w:tcPr>
-          <w:p>
+          <w:p w:rsidP="008410LMB__EMP_CUR">
             <w:pPr>
               <w:spacing w:before="0" w:after="0"/>
               <w:jc w:val="center"/>
@@ -4052,7 +4052,7 @@
                 <w:sz w:val="20"/>
                 <w:szCs w:val="20"/>
               </w:rPr>
-              <w:t>M4_z</w:t>
+              <w:t>LMB__WAGECPI_DC_z</w:t>
             </w:r>
             <w:r>
               <w:rPr>
@@ -4061,7 +4061,7 @@
                 <w:sz w:val="20"/>
                 <w:szCs w:val="20"/>
               </w:rPr>
-              <w:t>M4_p</w:t>
+              <w:t>LMB__WAGECPI_DC_p</w:t>
             </w:r>
             <w:r>
               <w:rPr>
@@ -4070,7 +4070,7 @@
                 <w:sz w:val="20"/>
                 <w:szCs w:val="20"/>
               </w:rPr>
-              <w:t>M4_n</w:t>
+              <w:t>LMB__WAGECPI_DC_n</w:t>
             </w:r>
           </w:p>
         </w:tc>
@@ -4080,7 +4080,7 @@
             <w:shd w:val="clear" w:color="auto" w:fill="D9DDEA" w:themeFill="accent5"/>
             <w:vAlign w:val="center"/>
           </w:tcPr>
-          <w:p>
+          <w:p w:rsidP="008410LMB__EMP_CUR">
             <w:pPr>
               <w:spacing w:before="0" w:after="0"/>
               <w:jc w:val="center"/>
@@ -4104,7 +4104,7 @@
                 <w:sz w:val="20"/>
                 <w:szCs w:val="20"/>
               </w:rPr>
-              <w:t>M5_z</w:t>
+              <w:t>LMB__WAGECPI_DE_z</w:t>
             </w:r>
             <w:r>
               <w:rPr>
@@ -4113,7 +4113,7 @@
                 <w:sz w:val="20"/>
                 <w:szCs w:val="20"/>
               </w:rPr>
-              <w:t>M5_p</w:t>
+              <w:t>LMB__WAGECPI_DE_p</w:t>
             </w:r>
             <w:r>
               <w:rPr>
@@ -4122,7 +4122,7 @@
                 <w:sz w:val="20"/>
                 <w:szCs w:val="20"/>
               </w:rPr>
-              <w:t>M5_n</w:t>
+              <w:t>LMB__WAGECPI_DE_n</w:t>
             </w:r>
           </w:p>
         </w:tc>
@@ -4294,7 +4294,7 @@
             </w:tcBorders>
             <w:shd w:val="clear" w:color="auto" w:fill="D9DDEA" w:themeFill="accent5"/>
           </w:tcPr>
-          <w:p>
+          <w:p w14:textId="5D0LMB__EMP_CURLMB__UNEMPRT_CURE">
             <w:pPr>
               <w:pStyle w:val="Heading1"/>
             </w:pPr>
@@ -4332,10 +4332,10 @@
           <w:sz w:val="22"/>
           <w:szCs w:val="28"/>
         </w:rPr>
-        <w:t>tt1</w:t>
+        <w:t>LMB__TT01</w:t>
       </w:r>
     </w:p>
-    <w:p>
+    <w:p w:rsidRPr="00ELMB__EMP_CUR557">
       <w:pPr>
         <w:pStyle w:val="ListParagraph"/>
         <w:numPr>
@@ -4356,7 +4356,7 @@
           <w:sz w:val="22"/>
           <w:szCs w:val="28"/>
         </w:rPr>
-        <w:t>tt2</w:t>
+        <w:t>LMB__TT02</w:t>
       </w:r>
       <w:r>
         <w:rPr>
@@ -4412,7 +4412,7 @@
           <w:sz w:val="22"/>
           <w:szCs w:val="28"/>
         </w:rPr>
-        <w:t>tt3</w:t>
+        <w:t>LMB__TT03</w:t>
       </w:r>
     </w:p>
     <w:p>
@@ -4436,7 +4436,7 @@
           <w:sz w:val="22"/>
           <w:szCs w:val="22"/>
         </w:rPr>
-        <w:t>tt4</w:t>
+        <w:t>LMB__TT04</w:t>
       </w:r>
     </w:p>
     <w:p>
@@ -4460,10 +4460,10 @@
           <w:sz w:val="22"/>
           <w:szCs w:val="28"/>
         </w:rPr>
-        <w:t>tt5</w:t>
+        <w:t>LMB__TT05</w:t>
       </w:r>
     </w:p>
-    <w:p>
+    <w:p w14:paraId="0LMB__UNEMPRT_CURC44AE">
       <w:pPr>
         <w:pStyle w:val="ListParagraph"/>
         <w:numPr>
@@ -4484,7 +4484,7 @@
           <w:sz w:val="22"/>
           <w:szCs w:val="28"/>
         </w:rPr>
-        <w:t>tt6</w:t>
+        <w:t>LMB__TT06</w:t>
       </w:r>
     </w:p>
     <w:p>
@@ -4508,7 +4508,7 @@
           <w:sz w:val="22"/>
           <w:szCs w:val="28"/>
         </w:rPr>
-        <w:t>tt7</w:t>
+        <w:t>LMB__TT07</w:t>
       </w:r>
     </w:p>
     <w:p>
@@ -4532,10 +4532,10 @@
           <w:sz w:val="22"/>
           <w:szCs w:val="28"/>
         </w:rPr>
-        <w:t>tt8</w:t>
+        <w:t>LMB__TT08</w:t>
       </w:r>
     </w:p>
-    <w:p>
+    <w:p w:rsidR="009LMB__EMPRT_CURA59">
       <w:pPr>
         <w:pStyle w:val="ListParagraph"/>
         <w:numPr>
@@ -4556,7 +4556,7 @@
           <w:sz w:val="22"/>
           <w:szCs w:val="28"/>
         </w:rPr>
-        <w:t>tt9</w:t>
+        <w:t>LMB__TT09</w:t>
       </w:r>
     </w:p>
     <w:p>
@@ -4580,7 +4580,7 @@
           <w:sz w:val="22"/>
           <w:szCs w:val="28"/>
         </w:rPr>
-        <w:t>tt10</w:t>
+        <w:t>LMB__TT10</w:t>
       </w:r>
     </w:p>
     <w:p>
@@ -4613,7 +4613,7 @@
         </w:rPr>
       </w:pPr>
     </w:p>
-    <w:p>
+    <w:p w:rsidP="000D6LMB__UNEMPRT_CUR7">
       <w:pPr>
         <w:spacing w:before="240" w:after="0" w:line="276" w:lineRule="auto"/>
         <w:rPr>

</xml_diff>

<commit_message>
Replace LMB__ placeholders with gibberish lowercase words
All template placeholders changed from LMB__STAT_PERIOD format to
qvz-prefixed lowercase words (e.g. qvzempcur, qvzertdqp) to prevent
Word from splitting them across XML runs. Updated fill_conditional
to append p/n/z directly without underscore separator. Fixed corrupted
LMB__SLMB__WAGENOM_CUR0 placeholder in template (now qvzsl03).

https://claude.ai/code/session_01QTVHE2cPDWnCbu52Ph5Q3X
</commit_message>
<xml_diff>
--- a/LMSB_extracted/labour-market-stats-brief/utils/ManualDB.docx
+++ b/LMSB_extracted/labour-market-stats-brief/utils/ManualDB.docx
@@ -1,6 +1,6 @@
 
 <file path=word/document.xml><?xml version="1.0" encoding="utf-8"?>
-<w:document xmlns:wpc="http://schemas.microsoft.com/office/word/2010/wordprocessingCanvas" xmlns:cx="http://schemas.microsoft.com/office/drawing/2014/chartex" xmlns:cx1="http://schemas.microsoft.com/office/drawing/2015/9/8/chartex" xmlns:cx2="http://schemas.microsoft.com/office/drawing/2015/10/21/chartex" xmlns:cx3="http://schemas.microsoft.com/office/drawing/2016/5/9/chartex" xmlns:cx4="http://schemas.microsoft.com/office/drawing/2016/5/10/chartex" xmlns:cx5="http://schemas.microsoft.com/office/drawing/2016/5/11/chartex" xmlns:cx6="http://schemas.microsoft.com/office/drawing/2016/5/12/chartex" xmlns:cx7="http://schemas.microsoft.com/office/drawing/2016/5/13/chartex" xmlns:cx8="http://schemas.microsoft.com/office/drawing/2016/5/14/chartex" xmlns:mc="http://schemas.openxmlformats.org/markup-compatibility/2006" xmlns:aink="http://schemas.microsoft.com/office/drawing/2016/ink" xmlns:am3d="http://schemas.microsoft.com/office/drawing/2017/model3d" xmlns:o="urn:schemas-microsoft-com:office:office" xmlns:oel="http://schemas.microsoft.com/office/2019/extlst" xmlns:r="http://schemas.openxmlformats.org/officeDocument/2006/relationships" xmlns:m="http://schemas.openxmlformats.org/officeDocument/2006/math" xmlns:v="urn:schemas-microsoft-com:vml" xmlns:wp14="http://schemas.microsoft.com/office/word/2010/wordprocessingDrawing" xmlns:wp="http://schemas.openxmlformats.org/drawingml/2006/wordprocessingDrawing" xmlns:w10="urn:schemas-microsoft-com:office:word" xmlns:w="http://schemas.openxmlformats.org/wordprocessingml/2006/main" xmlns:w14="http://schemas.microsoft.com/office/word/2010/wordml" xmlns:w15="http://schemas.microsoft.com/office/word/2012/wordml" xmlns:w16cex="http://schemas.microsoft.com/office/word/2018/wordml/cex" xmlns:w16cid="http://schemas.microsoft.com/office/word/2016/wordml/cid" xmlns:w16="http://schemas.microsoft.com/office/word/2018/wordml" xmlns:w16du="http://schemas.microsoft.com/office/word/2023/wordml/word16du" xmlns:w16sdtdh="http://schemas.microsoft.com/office/word/2020/wordml/sdtdatahash" xmlns:w16sdtfl="http://schemas.microsoft.com/office/word/2024/wordml/sdtformatlock" xmlns:w16se="http://schemas.microsoft.com/office/word/2015/wordml/symex" xmlns:wpg="http://schemas.microsoft.com/office/word/2010/wordprocessingGroup" xmlns:wpi="http://schemas.microsoft.com/office/word/2010/wordprocessingInk" xmlns:wne="http://schemas.microsoft.com/office/word/2006/wordml" xmlns:wps="http://schemas.microsoft.com/office/word/2010/wordprocessingShape" mc:Ignorable="w14 w15 w16se w16cid w16 w16cex w16sdtdh w16sdtfl w16du wp14">
+<w:document xmlns:a="http://schemas.openxmlformats.org/drawingml/2006/main" xmlns:a14="http://schemas.microsoft.com/office/drawing/2010/main" xmlns:adec="http://schemas.microsoft.com/office/drawing/2017/decorative" xmlns:mc="http://schemas.openxmlformats.org/markup-compatibility/2006" xmlns:pic="http://schemas.openxmlformats.org/drawingml/2006/picture" xmlns:r="http://schemas.openxmlformats.org/officeDocument/2006/relationships" xmlns:w="http://schemas.openxmlformats.org/wordprocessingml/2006/main" xmlns:w14="http://schemas.microsoft.com/office/word/2010/wordml" xmlns:wp="http://schemas.openxmlformats.org/drawingml/2006/wordprocessingDrawing" xmlns:wp14="http://schemas.microsoft.com/office/word/2010/wordprocessingDrawing" mc:Ignorable="w14 w15 w16se w16cid w16 w16cex w16sdtdh w16sdtfl w16du wp14">
   <w:body>
     <w:tbl>
       <w:tblPr>
@@ -58,7 +58,7 @@
                   <w:sz w:val="32"/>
                   <w:szCs w:val="32"/>
                 </w:rPr>
-                <w:t>LMB__MONTH_LABEL</w:t>
+                <w:t>qvzmonthlabel</w:t>
               </w:r>
             </w:hyperlink>
             <w:r w:rsidR="00LMB__EMP_CUR40EB">
@@ -106,23 +106,23 @@
                   <wp:effectExtent l="0" t="0" r="6985" b="6350"/>
                   <wp:wrapSquare wrapText="bothSides"/>
                   <wp:docPr id="530377592" name="Picture 1">
-                    <a:extLst xmlns:a="http://schemas.openxmlformats.org/drawingml/2006/main">
+                    <a:extLst>
                       <a:ext uri="{LMB__EMPRT_CUR83D7F6-B498-43B3-948B-1728B52AA6E4}">
-                        <adec:decorative xmlns:adec="http://schemas.microsoft.com/office/drawing/2017/decorative" val="1"/>
+                        <adec:decorative val="1"/>
                       </a:ext>
                     </a:extLst>
                   </wp:docPr>
                   <wp:cNvGraphicFramePr>
-                    <a:graphicFrameLocks xmlns:a="http://schemas.openxmlformats.org/drawingml/2006/main" noChangeAspect="1"/>
+                    <a:graphicFrameLocks noChangeAspect="1"/>
                   </wp:cNvGraphicFramePr>
-                  <a:graphic xmlns:a="http://schemas.openxmlformats.org/drawingml/2006/main">
+                  <a:graphic>
                     <a:graphicData uri="http://schemas.openxmlformats.org/drawingml/2006/picture">
-                      <pic:pic xmlns:pic="http://schemas.openxmlformats.org/drawingml/2006/picture">
+                      <pic:pic>
                         <pic:nvPicPr>
                           <pic:cNvPr id="530377592" name="Picture 1">
                             <a:extLst>
                               <a:ext uri="{LMB__EMPRT_CUR83D7F6-B498-43B3-948B-1728B52AA6E4}">
-                                <adec:decorative xmlns:adec="http://schemas.microsoft.com/office/drawing/2017/decorative" val="1"/>
+                                <adec:decorative val="1"/>
                               </a:ext>
                             </a:extLst>
                           </pic:cNvPr>
@@ -134,7 +134,7 @@
                           <a:blip r:embed="rId13">
                             <a:extLst>
                               <a:ext uri="{28A0092B-C50C-407E-A947-70E740481LMB__EMPRT_CURC}">
-                                <a14:useLocalDpi xmlns:a14="http://schemas.microsoft.com/office/drawing/2010/main" val="0"/>
+                                <a14:useLocalDpi val="0"/>
                               </a:ext>
                             </a:extLst>
                           </a:blip>
@@ -177,7 +177,7 @@
                 <w:rFonts w:cs="Arial"/>
                 <w:color w:val="00285F" w:themeColor="text2"/>
               </w:rPr>
-              <w:t>LMB__RENDER_DATE</w:t>
+              <w:t>qvzrenderdate</w:t>
             </w:r>
             <w:r>
               <w:rPr>
@@ -420,7 +420,7 @@
           <w:sz w:val="22"/>
           <w:szCs w:val="28"/>
         </w:rPr>
-        <w:t>LMB__LFS_PERIOD</w:t>
+        <w:t>qvzlfsperiod</w:t>
       </w:r>
       <w:r>
         <w:rPr>
@@ -591,7 +591,7 @@
                 <w:sz w:val="22"/>
                 <w:szCs w:val="22"/>
               </w:rPr>
-              <w:t>LMB__SL01</w:t>
+              <w:t>qvzsl01</w:t>
             </w:r>
           </w:p>
           <w:p>
@@ -612,7 +612,7 @@
                 <w:sz w:val="22"/>
                 <w:szCs w:val="22"/>
               </w:rPr>
-              <w:t>LMB__SL02</w:t>
+              <w:t>qvzsl02</w:t>
             </w:r>
           </w:p>
           <w:p w14:paraId="256D32LMB__EMP_CUR">
@@ -633,7 +633,7 @@
                 <w:sz w:val="22"/>
                 <w:szCs w:val="22"/>
               </w:rPr>
-              <w:t>LMB__SL04</w:t>
+              <w:t>qvzsl04</w:t>
             </w:r>
           </w:p>
           <w:p w:rsidR="009LMB__UNEMP_CURAAA">
@@ -654,7 +654,7 @@
                 <w:sz w:val="22"/>
                 <w:szCs w:val="22"/>
               </w:rPr>
-              <w:t>LMB__SL05</w:t>
+              <w:t>qvzsl05</w:t>
             </w:r>
           </w:p>
           <w:p>
@@ -675,7 +675,7 @@
                 <w:sz w:val="22"/>
                 <w:szCs w:val="28"/>
               </w:rPr>
-              <w:t>LMB__SL08</w:t>
+              <w:t>qvzsl08</w:t>
             </w:r>
           </w:p>
           <w:p>
@@ -696,7 +696,7 @@
                 <w:sz w:val="22"/>
                 <w:szCs w:val="28"/>
               </w:rPr>
-              <w:t>LMB__SL09</w:t>
+              <w:t>qvzsl09</w:t>
             </w:r>
           </w:p>
           <w:p>
@@ -717,7 +717,7 @@
                 <w:sz w:val="22"/>
                 <w:szCs w:val="28"/>
               </w:rPr>
-              <w:t>LMB__SLMB__WAGENOM_CUR0</w:t>
+              <w:t>qvzsl03</w:t>
             </w:r>
           </w:p>
         </w:tc>
@@ -810,7 +810,7 @@
                 <w:sz w:val="20"/>
                 <w:szCs w:val="20"/>
               </w:rPr>
-              <w:t>LMB__LFS_QUARTER</w:t>
+              <w:t>qvzlfsquarter</w:t>
             </w:r>
           </w:p>
         </w:tc>
@@ -1026,7 +1026,7 @@
                 <w:sz w:val="20"/>
                 <w:szCs w:val="20"/>
               </w:rPr>
-              <w:t>LMB__EMP_CUR</w:t>
+              <w:t>qvzempcur</w:t>
             </w:r>
           </w:p>
         </w:tc>
@@ -1058,7 +1058,7 @@
                 <w:sz w:val="20"/>
                 <w:szCs w:val="20"/>
               </w:rPr>
-              <w:t>LMB__EMP_DQ_p</w:t>
+              <w:t>qvzempdqp</w:t>
             </w:r>
             <w:r>
               <w:rPr>
@@ -1070,7 +1070,7 @@
                 <w:sz w:val="20"/>
                 <w:szCs w:val="20"/>
               </w:rPr>
-              <w:t>LMB__EMP_DQ_n</w:t>
+              <w:t>qvzempdqn</w:t>
             </w:r>
             <w:r>
               <w:rPr>
@@ -1082,7 +1082,7 @@
                 <w:sz w:val="20"/>
                 <w:szCs w:val="20"/>
               </w:rPr>
-              <w:t>LMB__EMP_DQ_z</w:t>
+              <w:t>qvzempdqz</w:t>
             </w:r>
           </w:p>
         </w:tc>
@@ -1113,7 +1113,7 @@
                 <w:sz w:val="20"/>
                 <w:szCs w:val="20"/>
               </w:rPr>
-              <w:t>LMB__EMP_DY_p</w:t>
+              <w:t>qvzempdyp</w:t>
             </w:r>
             <w:r>
               <w:rPr>
@@ -1125,7 +1125,7 @@
                 <w:sz w:val="20"/>
                 <w:szCs w:val="20"/>
               </w:rPr>
-              <w:t>LMB__EMP_DY_n</w:t>
+              <w:t>qvzempdyn</w:t>
             </w:r>
             <w:r>
               <w:rPr>
@@ -1137,7 +1137,7 @@
                 <w:sz w:val="20"/>
                 <w:szCs w:val="20"/>
               </w:rPr>
-              <w:t>LMB__EMP_DY_z</w:t>
+              <w:t>qvzempdyz</w:t>
             </w:r>
           </w:p>
         </w:tc>
@@ -1167,7 +1167,7 @@
                 <w:sz w:val="20"/>
                 <w:szCs w:val="20"/>
               </w:rPr>
-              <w:t>LMB__EMP_DC_p</w:t>
+              <w:t>qvzempdcp</w:t>
             </w:r>
             <w:r>
               <w:rPr>
@@ -1179,7 +1179,7 @@
                 <w:sz w:val="20"/>
                 <w:szCs w:val="20"/>
               </w:rPr>
-              <w:t>LMB__EMP_DC_n</w:t>
+              <w:t>qvzempdcn</w:t>
             </w:r>
             <w:r>
               <w:rPr>
@@ -1191,7 +1191,7 @@
                 <w:sz w:val="20"/>
                 <w:szCs w:val="20"/>
               </w:rPr>
-              <w:t>LMB__EMP_DC_z</w:t>
+              <w:t>qvzempdcz</w:t>
             </w:r>
           </w:p>
         </w:tc>
@@ -1221,7 +1221,7 @@
                 <w:sz w:val="20"/>
                 <w:szCs w:val="20"/>
               </w:rPr>
-              <w:t>LMB__EMP_DE_p</w:t>
+              <w:t>qvzempdep</w:t>
             </w:r>
             <w:r>
               <w:rPr>
@@ -1233,7 +1233,7 @@
                 <w:sz w:val="20"/>
                 <w:szCs w:val="20"/>
               </w:rPr>
-              <w:t>LMB__EMP_DE_n</w:t>
+              <w:t>qvzempden</w:t>
             </w:r>
             <w:r>
               <w:rPr>
@@ -1245,7 +1245,7 @@
                 <w:sz w:val="20"/>
                 <w:szCs w:val="20"/>
               </w:rPr>
-              <w:t>LMB__EMP_DE_z</w:t>
+              <w:t>qvzempdez</w:t>
             </w:r>
           </w:p>
         </w:tc>
@@ -1310,7 +1310,7 @@
                 <w:sz w:val="20"/>
                 <w:szCs w:val="20"/>
               </w:rPr>
-              <w:t>LMB__EMPRT_CUR</w:t>
+              <w:t>qvzertcur</w:t>
             </w:r>
           </w:p>
         </w:tc>
@@ -1338,7 +1338,7 @@
                 <w:sz w:val="20"/>
                 <w:szCs w:val="20"/>
               </w:rPr>
-              <w:t>LMB__EMPRT_DQ_p</w:t>
+              <w:t>qvzertdqp</w:t>
             </w:r>
             <w:r>
               <w:rPr>
@@ -1347,16 +1347,16 @@
                 <w:sz w:val="20"/>
                 <w:szCs w:val="20"/>
               </w:rPr>
-              <w:t>LMB__EMPRT_DQ_n</w:t>
-            </w:r>
-            <w:r>
-              <w:rPr>
-                <w:b/>
-                <w:color w:val="000000"/>
-                <w:sz w:val="20"/>
-                <w:szCs w:val="20"/>
-              </w:rPr>
-              <w:t>LMB__EMPRT_DQ_z</w:t>
+              <w:t>qvzertdqn</w:t>
+            </w:r>
+            <w:r>
+              <w:rPr>
+                <w:b/>
+                <w:color w:val="000000"/>
+                <w:sz w:val="20"/>
+                <w:szCs w:val="20"/>
+              </w:rPr>
+              <w:t>qvzertdqz</w:t>
             </w:r>
           </w:p>
         </w:tc>
@@ -1385,7 +1385,7 @@
                 <w:sz w:val="20"/>
                 <w:szCs w:val="20"/>
               </w:rPr>
-              <w:t>LMB__EMPRT_DY_p</w:t>
+              <w:t>qvzertdyp</w:t>
             </w:r>
             <w:r>
               <w:rPr>
@@ -1394,16 +1394,16 @@
                 <w:sz w:val="20"/>
                 <w:szCs w:val="20"/>
               </w:rPr>
-              <w:t>LMB__EMPRT_DY_n</w:t>
-            </w:r>
-            <w:r>
-              <w:rPr>
-                <w:b/>
-                <w:color w:val="000000"/>
-                <w:sz w:val="20"/>
-                <w:szCs w:val="20"/>
-              </w:rPr>
-              <w:t>LMB__EMPRT_DY_z</w:t>
+              <w:t>qvzertdyn</w:t>
+            </w:r>
+            <w:r>
+              <w:rPr>
+                <w:b/>
+                <w:color w:val="000000"/>
+                <w:sz w:val="20"/>
+                <w:szCs w:val="20"/>
+              </w:rPr>
+              <w:t>qvzertdyz</w:t>
             </w:r>
           </w:p>
         </w:tc>
@@ -1431,7 +1431,7 @@
                 <w:sz w:val="20"/>
                 <w:szCs w:val="20"/>
               </w:rPr>
-              <w:t>LMB__EMPRT_DC_p</w:t>
+              <w:t>qvzertdcp</w:t>
             </w:r>
             <w:r>
               <w:rPr>
@@ -1440,16 +1440,16 @@
                 <w:sz w:val="20"/>
                 <w:szCs w:val="20"/>
               </w:rPr>
-              <w:t>LMB__EMPRT_DC_n</w:t>
-            </w:r>
-            <w:r>
-              <w:rPr>
-                <w:b/>
-                <w:color w:val="000000"/>
-                <w:sz w:val="20"/>
-                <w:szCs w:val="20"/>
-              </w:rPr>
-              <w:t>LMB__EMPRT_DC_z</w:t>
+              <w:t>qvzertdcn</w:t>
+            </w:r>
+            <w:r>
+              <w:rPr>
+                <w:b/>
+                <w:color w:val="000000"/>
+                <w:sz w:val="20"/>
+                <w:szCs w:val="20"/>
+              </w:rPr>
+              <w:t>qvzertdcz</w:t>
             </w:r>
           </w:p>
         </w:tc>
@@ -1477,7 +1477,7 @@
                 <w:sz w:val="20"/>
                 <w:szCs w:val="20"/>
               </w:rPr>
-              <w:t>LMB__EMPRT_DE_p</w:t>
+              <w:t>qvzertdep</w:t>
             </w:r>
             <w:r>
               <w:rPr>
@@ -1486,16 +1486,16 @@
                 <w:sz w:val="20"/>
                 <w:szCs w:val="20"/>
               </w:rPr>
-              <w:t>LMB__EMPRT_DE_n</w:t>
-            </w:r>
-            <w:r>
-              <w:rPr>
-                <w:b/>
-                <w:color w:val="000000"/>
-                <w:sz w:val="20"/>
-                <w:szCs w:val="20"/>
-              </w:rPr>
-              <w:t>LMB__EMPRT_DE_z</w:t>
+              <w:t>qvzertden</w:t>
+            </w:r>
+            <w:r>
+              <w:rPr>
+                <w:b/>
+                <w:color w:val="000000"/>
+                <w:sz w:val="20"/>
+                <w:szCs w:val="20"/>
+              </w:rPr>
+              <w:t>qvzertdez</w:t>
             </w:r>
           </w:p>
         </w:tc>
@@ -1560,7 +1560,7 @@
                 <w:sz w:val="20"/>
                 <w:szCs w:val="20"/>
               </w:rPr>
-              <w:t>LMB__UNEMP_CUR</w:t>
+              <w:t>qvzunecur</w:t>
             </w:r>
           </w:p>
         </w:tc>
@@ -1589,7 +1589,7 @@
                 <w:sz w:val="20"/>
                 <w:szCs w:val="20"/>
               </w:rPr>
-              <w:t>LMB__UNEMP_DQ_p</w:t>
+              <w:t>qvzunedqp</w:t>
             </w:r>
             <w:r>
               <w:rPr>
@@ -1598,16 +1598,16 @@
                 <w:sz w:val="20"/>
                 <w:szCs w:val="20"/>
               </w:rPr>
-              <w:t>LMB__UNEMP_DQ_n</w:t>
-            </w:r>
-            <w:r>
-              <w:rPr>
-                <w:b/>
-                <w:color w:val="000000"/>
-                <w:sz w:val="20"/>
-                <w:szCs w:val="20"/>
-              </w:rPr>
-              <w:t>LMB__UNEMP_DQ_z</w:t>
+              <w:t>qvzunedqn</w:t>
+            </w:r>
+            <w:r>
+              <w:rPr>
+                <w:b/>
+                <w:color w:val="000000"/>
+                <w:sz w:val="20"/>
+                <w:szCs w:val="20"/>
+              </w:rPr>
+              <w:t>qvzunedqz</w:t>
             </w:r>
           </w:p>
         </w:tc>
@@ -1636,7 +1636,7 @@
                 <w:sz w:val="20"/>
                 <w:szCs w:val="20"/>
               </w:rPr>
-              <w:t>LMB__UNEMP_DY_p</w:t>
+              <w:t>qvzunedyp</w:t>
             </w:r>
             <w:r>
               <w:rPr>
@@ -1645,16 +1645,16 @@
                 <w:sz w:val="20"/>
                 <w:szCs w:val="20"/>
               </w:rPr>
-              <w:t>LMB__UNEMP_DY_n</w:t>
-            </w:r>
-            <w:r>
-              <w:rPr>
-                <w:b/>
-                <w:color w:val="000000"/>
-                <w:sz w:val="20"/>
-                <w:szCs w:val="20"/>
-              </w:rPr>
-              <w:t>LMB__UNEMP_DY_z</w:t>
+              <w:t>qvzunedyn</w:t>
+            </w:r>
+            <w:r>
+              <w:rPr>
+                <w:b/>
+                <w:color w:val="000000"/>
+                <w:sz w:val="20"/>
+                <w:szCs w:val="20"/>
+              </w:rPr>
+              <w:t>qvzunedyz</w:t>
             </w:r>
           </w:p>
         </w:tc>
@@ -1682,7 +1682,7 @@
                 <w:sz w:val="20"/>
                 <w:szCs w:val="20"/>
               </w:rPr>
-              <w:t>LMB__UNEMP_DC_p</w:t>
+              <w:t>qvzunedcp</w:t>
             </w:r>
             <w:r>
               <w:rPr>
@@ -1691,16 +1691,16 @@
                 <w:sz w:val="20"/>
                 <w:szCs w:val="20"/>
               </w:rPr>
-              <w:t>LMB__UNEMP_DC_n</w:t>
-            </w:r>
-            <w:r>
-              <w:rPr>
-                <w:b/>
-                <w:color w:val="000000"/>
-                <w:sz w:val="20"/>
-                <w:szCs w:val="20"/>
-              </w:rPr>
-              <w:t>LMB__UNEMP_DC_z</w:t>
+              <w:t>qvzunedcn</w:t>
+            </w:r>
+            <w:r>
+              <w:rPr>
+                <w:b/>
+                <w:color w:val="000000"/>
+                <w:sz w:val="20"/>
+                <w:szCs w:val="20"/>
+              </w:rPr>
+              <w:t>qvzunedcz</w:t>
             </w:r>
           </w:p>
         </w:tc>
@@ -1728,7 +1728,7 @@
                 <w:sz w:val="20"/>
                 <w:szCs w:val="20"/>
               </w:rPr>
-              <w:t>LMB__UNEMP_DE_p</w:t>
+              <w:t>qvzunedep</w:t>
             </w:r>
             <w:r>
               <w:rPr>
@@ -1737,16 +1737,16 @@
                 <w:sz w:val="20"/>
                 <w:szCs w:val="20"/>
               </w:rPr>
-              <w:t>LMB__UNEMP_DE_n</w:t>
-            </w:r>
-            <w:r>
-              <w:rPr>
-                <w:b/>
-                <w:color w:val="000000"/>
-                <w:sz w:val="20"/>
-                <w:szCs w:val="20"/>
-              </w:rPr>
-              <w:t>LMB__UNEMP_DE_z</w:t>
+              <w:t>qvzuneden</w:t>
+            </w:r>
+            <w:r>
+              <w:rPr>
+                <w:b/>
+                <w:color w:val="000000"/>
+                <w:sz w:val="20"/>
+                <w:szCs w:val="20"/>
+              </w:rPr>
+              <w:t>qvzunedez</w:t>
             </w:r>
           </w:p>
         </w:tc>
@@ -1811,7 +1811,7 @@
                 <w:sz w:val="20"/>
                 <w:szCs w:val="20"/>
               </w:rPr>
-              <w:t>LMB__UNEMPRT_CUR</w:t>
+              <w:t>qvzurtcur</w:t>
             </w:r>
           </w:p>
         </w:tc>
@@ -1839,7 +1839,7 @@
                 <w:sz w:val="20"/>
                 <w:szCs w:val="20"/>
               </w:rPr>
-              <w:t>LMB__UNEMPRT_DQ_p</w:t>
+              <w:t>qvzurtdqp</w:t>
             </w:r>
             <w:r>
               <w:rPr>
@@ -1848,16 +1848,16 @@
                 <w:sz w:val="20"/>
                 <w:szCs w:val="20"/>
               </w:rPr>
-              <w:t>LMB__UNEMPRT_DQ_n</w:t>
-            </w:r>
-            <w:r>
-              <w:rPr>
-                <w:b/>
-                <w:color w:val="000000"/>
-                <w:sz w:val="20"/>
-                <w:szCs w:val="20"/>
-              </w:rPr>
-              <w:t>LMB__UNEMPRT_DQ_z</w:t>
+              <w:t>qvzurtdqn</w:t>
+            </w:r>
+            <w:r>
+              <w:rPr>
+                <w:b/>
+                <w:color w:val="000000"/>
+                <w:sz w:val="20"/>
+                <w:szCs w:val="20"/>
+              </w:rPr>
+              <w:t>qvzurtdqz</w:t>
             </w:r>
           </w:p>
         </w:tc>
@@ -1886,7 +1886,7 @@
                 <w:sz w:val="20"/>
                 <w:szCs w:val="20"/>
               </w:rPr>
-              <w:t>LMB__UNEMPRT_DY_p</w:t>
+              <w:t>qvzurtdyp</w:t>
             </w:r>
             <w:r>
               <w:rPr>
@@ -1895,16 +1895,16 @@
                 <w:sz w:val="20"/>
                 <w:szCs w:val="20"/>
               </w:rPr>
-              <w:t>LMB__UNEMPRT_DY_n</w:t>
-            </w:r>
-            <w:r>
-              <w:rPr>
-                <w:b/>
-                <w:color w:val="000000"/>
-                <w:sz w:val="20"/>
-                <w:szCs w:val="20"/>
-              </w:rPr>
-              <w:t>LMB__UNEMPRT_DY_z</w:t>
+              <w:t>qvzurtdyn</w:t>
+            </w:r>
+            <w:r>
+              <w:rPr>
+                <w:b/>
+                <w:color w:val="000000"/>
+                <w:sz w:val="20"/>
+                <w:szCs w:val="20"/>
+              </w:rPr>
+              <w:t>qvzurtdyz</w:t>
             </w:r>
           </w:p>
         </w:tc>
@@ -1932,7 +1932,7 @@
                 <w:sz w:val="20"/>
                 <w:szCs w:val="20"/>
               </w:rPr>
-              <w:t>LMB__UNEMPRT_DC_p</w:t>
+              <w:t>qvzurtdcp</w:t>
             </w:r>
             <w:r>
               <w:rPr>
@@ -1941,16 +1941,16 @@
                 <w:sz w:val="20"/>
                 <w:szCs w:val="20"/>
               </w:rPr>
-              <w:t>LMB__UNEMPRT_DC_n</w:t>
-            </w:r>
-            <w:r>
-              <w:rPr>
-                <w:b/>
-                <w:color w:val="000000"/>
-                <w:sz w:val="20"/>
-                <w:szCs w:val="20"/>
-              </w:rPr>
-              <w:t>LMB__UNEMPRT_DC_z</w:t>
+              <w:t>qvzurtdcn</w:t>
+            </w:r>
+            <w:r>
+              <w:rPr>
+                <w:b/>
+                <w:color w:val="000000"/>
+                <w:sz w:val="20"/>
+                <w:szCs w:val="20"/>
+              </w:rPr>
+              <w:t>qvzurtdcz</w:t>
             </w:r>
           </w:p>
         </w:tc>
@@ -1978,7 +1978,7 @@
                 <w:sz w:val="20"/>
                 <w:szCs w:val="20"/>
               </w:rPr>
-              <w:t>LMB__UNEMPRT_DE_p</w:t>
+              <w:t>qvzurtdep</w:t>
             </w:r>
             <w:r>
               <w:rPr>
@@ -1987,16 +1987,16 @@
                 <w:sz w:val="20"/>
                 <w:szCs w:val="20"/>
               </w:rPr>
-              <w:t>LMB__UNEMPRT_DE_n</w:t>
-            </w:r>
-            <w:r>
-              <w:rPr>
-                <w:b/>
-                <w:color w:val="000000"/>
-                <w:sz w:val="20"/>
-                <w:szCs w:val="20"/>
-              </w:rPr>
-              <w:t>LMB__UNEMPRT_DE_z</w:t>
+              <w:t>qvzurtden</w:t>
+            </w:r>
+            <w:r>
+              <w:rPr>
+                <w:b/>
+                <w:color w:val="000000"/>
+                <w:sz w:val="20"/>
+                <w:szCs w:val="20"/>
+              </w:rPr>
+              <w:t>qvzurtdez</w:t>
             </w:r>
           </w:p>
         </w:tc>
@@ -2061,7 +2061,7 @@
                 <w:sz w:val="20"/>
                 <w:szCs w:val="20"/>
               </w:rPr>
-              <w:t>LMB__INACT_CUR</w:t>
+              <w:t>qvzinacur</w:t>
             </w:r>
           </w:p>
         </w:tc>
@@ -2090,7 +2090,7 @@
                 <w:sz w:val="20"/>
                 <w:szCs w:val="20"/>
               </w:rPr>
-              <w:t>LMB__INACT_DQ_p</w:t>
+              <w:t>qvzinadqp</w:t>
             </w:r>
             <w:r>
               <w:rPr>
@@ -2099,16 +2099,16 @@
                 <w:sz w:val="20"/>
                 <w:szCs w:val="20"/>
               </w:rPr>
-              <w:t>LMB__INACT_DQ_n</w:t>
-            </w:r>
-            <w:r>
-              <w:rPr>
-                <w:b/>
-                <w:color w:val="000000"/>
-                <w:sz w:val="20"/>
-                <w:szCs w:val="20"/>
-              </w:rPr>
-              <w:t>LMB__INACT_DQ_z</w:t>
+              <w:t>qvzinadqn</w:t>
+            </w:r>
+            <w:r>
+              <w:rPr>
+                <w:b/>
+                <w:color w:val="000000"/>
+                <w:sz w:val="20"/>
+                <w:szCs w:val="20"/>
+              </w:rPr>
+              <w:t>qvzinadqz</w:t>
             </w:r>
           </w:p>
         </w:tc>
@@ -2137,7 +2137,7 @@
                 <w:sz w:val="20"/>
                 <w:szCs w:val="20"/>
               </w:rPr>
-              <w:t>LMB__INACT_DY_p</w:t>
+              <w:t>qvzinadyp</w:t>
             </w:r>
             <w:r>
               <w:rPr>
@@ -2146,16 +2146,16 @@
                 <w:sz w:val="20"/>
                 <w:szCs w:val="20"/>
               </w:rPr>
-              <w:t>LMB__INACT_DY_n</w:t>
-            </w:r>
-            <w:r>
-              <w:rPr>
-                <w:b/>
-                <w:color w:val="000000"/>
-                <w:sz w:val="20"/>
-                <w:szCs w:val="20"/>
-              </w:rPr>
-              <w:t>LMB__INACT_DY_z</w:t>
+              <w:t>qvzinadyn</w:t>
+            </w:r>
+            <w:r>
+              <w:rPr>
+                <w:b/>
+                <w:color w:val="000000"/>
+                <w:sz w:val="20"/>
+                <w:szCs w:val="20"/>
+              </w:rPr>
+              <w:t>qvzinadyz</w:t>
             </w:r>
           </w:p>
         </w:tc>
@@ -2183,7 +2183,7 @@
                 <w:sz w:val="20"/>
                 <w:szCs w:val="20"/>
               </w:rPr>
-              <w:t>LMB__INACT_DC_p</w:t>
+              <w:t>qvzinadcp</w:t>
             </w:r>
             <w:r>
               <w:rPr>
@@ -2192,16 +2192,16 @@
                 <w:sz w:val="20"/>
                 <w:szCs w:val="20"/>
               </w:rPr>
-              <w:t>LMB__INACT_DC_n</w:t>
-            </w:r>
-            <w:r>
-              <w:rPr>
-                <w:b/>
-                <w:color w:val="000000"/>
-                <w:sz w:val="20"/>
-                <w:szCs w:val="20"/>
-              </w:rPr>
-              <w:t>LMB__INACT_DC_z</w:t>
+              <w:t>qvzinadcn</w:t>
+            </w:r>
+            <w:r>
+              <w:rPr>
+                <w:b/>
+                <w:color w:val="000000"/>
+                <w:sz w:val="20"/>
+                <w:szCs w:val="20"/>
+              </w:rPr>
+              <w:t>qvzinadcz</w:t>
             </w:r>
           </w:p>
         </w:tc>
@@ -2229,7 +2229,7 @@
                 <w:sz w:val="20"/>
                 <w:szCs w:val="20"/>
               </w:rPr>
-              <w:t>LMB__INACT_DE_p</w:t>
+              <w:t>qvzinadep</w:t>
             </w:r>
             <w:r>
               <w:rPr>
@@ -2238,16 +2238,16 @@
                 <w:sz w:val="20"/>
                 <w:szCs w:val="20"/>
               </w:rPr>
-              <w:t>LMB__INACT_DE_n</w:t>
-            </w:r>
-            <w:r>
-              <w:rPr>
-                <w:b/>
-                <w:color w:val="000000"/>
-                <w:sz w:val="20"/>
-                <w:szCs w:val="20"/>
-              </w:rPr>
-              <w:t>LMB__INACT_DE_z</w:t>
+              <w:t>qvzinaden</w:t>
+            </w:r>
+            <w:r>
+              <w:rPr>
+                <w:b/>
+                <w:color w:val="000000"/>
+                <w:sz w:val="20"/>
+                <w:szCs w:val="20"/>
+              </w:rPr>
+              <w:t>qvzinadez</w:t>
             </w:r>
           </w:p>
         </w:tc>
@@ -2316,7 +2316,7 @@
                 <w:sz w:val="20"/>
                 <w:szCs w:val="20"/>
               </w:rPr>
-              <w:t>LMB__INACT5064_CUR</w:t>
+              <w:t>qvzifecur</w:t>
             </w:r>
           </w:p>
         </w:tc>
@@ -2347,7 +2347,7 @@
                 <w:sz w:val="20"/>
                 <w:szCs w:val="20"/>
               </w:rPr>
-              <w:t>LMB__INACT5064_DQ_p</w:t>
+              <w:t>qvzifedqp</w:t>
             </w:r>
             <w:r w:rsidRPr="003LMB__UNEMP_CUR602">
               <w:rPr>
@@ -2357,7 +2357,7 @@
                 <w:sz w:val="20"/>
                 <w:szCs w:val="20"/>
               </w:rPr>
-              <w:t>LMB__INACT5064_DQ_n</w:t>
+              <w:t>qvzifedqn</w:t>
             </w:r>
             <w:r w:rsidRPr="003LMB__UNEMP_CUR602">
               <w:rPr>
@@ -2367,7 +2367,7 @@
                 <w:sz w:val="20"/>
                 <w:szCs w:val="20"/>
               </w:rPr>
-              <w:t>LMB__INACT5064_DQ_z</w:t>
+              <w:t>qvzifedqz</w:t>
             </w:r>
           </w:p>
         </w:tc>
@@ -2398,7 +2398,7 @@
                 <w:sz w:val="20"/>
                 <w:szCs w:val="20"/>
               </w:rPr>
-              <w:t>LMB__INACT5064_DY_p</w:t>
+              <w:t>qvzifedyp</w:t>
             </w:r>
             <w:r w:rsidRPr="003LMB__UNEMP_CUR602">
               <w:rPr>
@@ -2408,7 +2408,7 @@
                 <w:sz w:val="20"/>
                 <w:szCs w:val="20"/>
               </w:rPr>
-              <w:t>LMB__INACT5064_DY_n</w:t>
+              <w:t>qvzifedyn</w:t>
             </w:r>
             <w:r w:rsidRPr="003LMB__UNEMP_CUR602">
               <w:rPr>
@@ -2418,7 +2418,7 @@
                 <w:sz w:val="20"/>
                 <w:szCs w:val="20"/>
               </w:rPr>
-              <w:t>LMB__INACT5064_DY_z</w:t>
+              <w:t>qvzifedyz</w:t>
             </w:r>
           </w:p>
         </w:tc>
@@ -2448,7 +2448,7 @@
                 <w:sz w:val="20"/>
                 <w:szCs w:val="20"/>
               </w:rPr>
-              <w:t>LMB__INACT5064_DC_p</w:t>
+              <w:t>qvzifedcp</w:t>
             </w:r>
             <w:r w:rsidRPr="003LMB__UNEMP_CUR602">
               <w:rPr>
@@ -2458,7 +2458,7 @@
                 <w:sz w:val="20"/>
                 <w:szCs w:val="20"/>
               </w:rPr>
-              <w:t>LMB__INACT5064_DC_n</w:t>
+              <w:t>qvzifedcn</w:t>
             </w:r>
             <w:r w:rsidRPr="003LMB__UNEMP_CUR602">
               <w:rPr>
@@ -2468,7 +2468,7 @@
                 <w:sz w:val="20"/>
                 <w:szCs w:val="20"/>
               </w:rPr>
-              <w:t>LMB__INACT5064_DC_z</w:t>
+              <w:t>qvzifedcz</w:t>
             </w:r>
           </w:p>
         </w:tc>
@@ -2498,7 +2498,7 @@
                 <w:sz w:val="20"/>
                 <w:szCs w:val="20"/>
               </w:rPr>
-              <w:t>LMB__INACT5064_DE_p</w:t>
+              <w:t>qvzifedep</w:t>
             </w:r>
             <w:r w:rsidRPr="003LMB__UNEMP_CUR602">
               <w:rPr>
@@ -2508,7 +2508,7 @@
                 <w:sz w:val="20"/>
                 <w:szCs w:val="20"/>
               </w:rPr>
-              <w:t>LMB__INACT5064_DE_n</w:t>
+              <w:t>qvzifeden</w:t>
             </w:r>
             <w:r w:rsidRPr="003LMB__UNEMP_CUR602">
               <w:rPr>
@@ -2518,7 +2518,7 @@
                 <w:sz w:val="20"/>
                 <w:szCs w:val="20"/>
               </w:rPr>
-              <w:t>LMB__INACT5064_DE_z</w:t>
+              <w:t>qvzifedez</w:t>
             </w:r>
           </w:p>
         </w:tc>
@@ -2583,7 +2583,7 @@
                 <w:sz w:val="20"/>
                 <w:szCs w:val="20"/>
               </w:rPr>
-              <w:t>LMB__INACTRT_CUR</w:t>
+              <w:t>qvzirtcur</w:t>
             </w:r>
           </w:p>
         </w:tc>
@@ -2612,7 +2612,7 @@
                 <w:sz w:val="20"/>
                 <w:szCs w:val="20"/>
               </w:rPr>
-              <w:t>LMB__INACTRT_DQ_p</w:t>
+              <w:t>qvzirtdqp</w:t>
             </w:r>
             <w:r>
               <w:rPr>
@@ -2621,16 +2621,16 @@
                 <w:sz w:val="20"/>
                 <w:szCs w:val="20"/>
               </w:rPr>
-              <w:t>LMB__INACTRT_DQ_n</w:t>
-            </w:r>
-            <w:r>
-              <w:rPr>
-                <w:b/>
-                <w:color w:val="000000"/>
-                <w:sz w:val="20"/>
-                <w:szCs w:val="20"/>
-              </w:rPr>
-              <w:t>LMB__INACTRT_DQ_z</w:t>
+              <w:t>qvzirtdqn</w:t>
+            </w:r>
+            <w:r>
+              <w:rPr>
+                <w:b/>
+                <w:color w:val="000000"/>
+                <w:sz w:val="20"/>
+                <w:szCs w:val="20"/>
+              </w:rPr>
+              <w:t>qvzirtdqz</w:t>
             </w:r>
           </w:p>
         </w:tc>
@@ -2659,7 +2659,7 @@
                 <w:sz w:val="20"/>
                 <w:szCs w:val="20"/>
               </w:rPr>
-              <w:t>LMB__INACTRT_DY_p</w:t>
+              <w:t>qvzirtdyp</w:t>
             </w:r>
             <w:r>
               <w:rPr>
@@ -2668,16 +2668,16 @@
                 <w:sz w:val="20"/>
                 <w:szCs w:val="20"/>
               </w:rPr>
-              <w:t>LMB__INACTRT_DY_n</w:t>
-            </w:r>
-            <w:r>
-              <w:rPr>
-                <w:b/>
-                <w:color w:val="000000"/>
-                <w:sz w:val="20"/>
-                <w:szCs w:val="20"/>
-              </w:rPr>
-              <w:t>LMB__INACTRT_DY_z</w:t>
+              <w:t>qvzirtdyn</w:t>
+            </w:r>
+            <w:r>
+              <w:rPr>
+                <w:b/>
+                <w:color w:val="000000"/>
+                <w:sz w:val="20"/>
+                <w:szCs w:val="20"/>
+              </w:rPr>
+              <w:t>qvzirtdyz</w:t>
             </w:r>
           </w:p>
         </w:tc>
@@ -2705,7 +2705,7 @@
                 <w:sz w:val="20"/>
                 <w:szCs w:val="20"/>
               </w:rPr>
-              <w:t>LMB__INACTRT_DC_p</w:t>
+              <w:t>qvzirtdcp</w:t>
             </w:r>
             <w:r>
               <w:rPr>
@@ -2714,16 +2714,16 @@
                 <w:sz w:val="20"/>
                 <w:szCs w:val="20"/>
               </w:rPr>
-              <w:t>LMB__INACTRT_DC_n</w:t>
-            </w:r>
-            <w:r>
-              <w:rPr>
-                <w:b/>
-                <w:color w:val="000000"/>
-                <w:sz w:val="20"/>
-                <w:szCs w:val="20"/>
-              </w:rPr>
-              <w:t>LMB__INACTRT_DC_z</w:t>
+              <w:t>qvzirtdcn</w:t>
+            </w:r>
+            <w:r>
+              <w:rPr>
+                <w:b/>
+                <w:color w:val="000000"/>
+                <w:sz w:val="20"/>
+                <w:szCs w:val="20"/>
+              </w:rPr>
+              <w:t>qvzirtdcz</w:t>
             </w:r>
           </w:p>
         </w:tc>
@@ -2751,7 +2751,7 @@
                 <w:sz w:val="20"/>
                 <w:szCs w:val="20"/>
               </w:rPr>
-              <w:t>LMB__INACTRT_DE_p</w:t>
+              <w:t>qvzirtdep</w:t>
             </w:r>
             <w:r>
               <w:rPr>
@@ -2760,16 +2760,16 @@
                 <w:sz w:val="20"/>
                 <w:szCs w:val="20"/>
               </w:rPr>
-              <w:t>LMB__INACTRT_DE_n</w:t>
-            </w:r>
-            <w:r>
-              <w:rPr>
-                <w:b/>
-                <w:color w:val="000000"/>
-                <w:sz w:val="20"/>
-                <w:szCs w:val="20"/>
-              </w:rPr>
-              <w:t>LMB__INACTRT_DE_z</w:t>
+              <w:t>qvzirtden</w:t>
+            </w:r>
+            <w:r>
+              <w:rPr>
+                <w:b/>
+                <w:color w:val="000000"/>
+                <w:sz w:val="20"/>
+                <w:szCs w:val="20"/>
+              </w:rPr>
+              <w:t>qvzirtdez</w:t>
             </w:r>
           </w:p>
         </w:tc>
@@ -2836,7 +2836,7 @@
                 <w:sz w:val="20"/>
                 <w:szCs w:val="20"/>
               </w:rPr>
-              <w:t>LMB__INACT5064RT_CUR</w:t>
+              <w:t>qvzifrcur</w:t>
             </w:r>
           </w:p>
         </w:tc>
@@ -2867,7 +2867,7 @@
                 <w:sz w:val="20"/>
                 <w:szCs w:val="20"/>
               </w:rPr>
-              <w:t>LMB__INACT5064RT_DQ_z</w:t>
+              <w:t>qvzifrdqz</w:t>
             </w:r>
             <w:r w:rsidRPr="003LMB__UNEMP_CUR602">
               <w:rPr>
@@ -2877,7 +2877,7 @@
                 <w:sz w:val="20"/>
                 <w:szCs w:val="20"/>
               </w:rPr>
-              <w:t>LMB__INACT5064RT_DQ_p</w:t>
+              <w:t>qvzifrdqp</w:t>
             </w:r>
             <w:r w:rsidRPr="003LMB__UNEMP_CUR602">
               <w:rPr>
@@ -2887,7 +2887,7 @@
                 <w:sz w:val="20"/>
                 <w:szCs w:val="20"/>
               </w:rPr>
-              <w:t>LMB__INACT5064RT_DQ_n</w:t>
+              <w:t>qvzifrdqn</w:t>
             </w:r>
           </w:p>
         </w:tc>
@@ -2918,7 +2918,7 @@
                 <w:sz w:val="20"/>
                 <w:szCs w:val="20"/>
               </w:rPr>
-              <w:t>LMB__INACT5064RT_DY_z</w:t>
+              <w:t>qvzifrdyz</w:t>
             </w:r>
             <w:r w:rsidRPr="003LMB__UNEMP_CUR602">
               <w:rPr>
@@ -2928,7 +2928,7 @@
                 <w:sz w:val="20"/>
                 <w:szCs w:val="20"/>
               </w:rPr>
-              <w:t>LMB__INACT5064RT_DY_p</w:t>
+              <w:t>qvzifrdyp</w:t>
             </w:r>
             <w:r w:rsidRPr="003LMB__UNEMP_CUR602">
               <w:rPr>
@@ -2938,7 +2938,7 @@
                 <w:sz w:val="20"/>
                 <w:szCs w:val="20"/>
               </w:rPr>
-              <w:t>LMB__INACT5064RT_DY_n</w:t>
+              <w:t>qvzifrdyn</w:t>
             </w:r>
           </w:p>
         </w:tc>
@@ -2968,7 +2968,7 @@
                 <w:sz w:val="20"/>
                 <w:szCs w:val="20"/>
               </w:rPr>
-              <w:t>LMB__INACT5064RT_DC_z</w:t>
+              <w:t>qvzifrdcz</w:t>
             </w:r>
             <w:r w:rsidRPr="003LMB__UNEMP_CUR602">
               <w:rPr>
@@ -2978,7 +2978,7 @@
                 <w:sz w:val="20"/>
                 <w:szCs w:val="20"/>
               </w:rPr>
-              <w:t>LMB__INACT5064RT_DC_p</w:t>
+              <w:t>qvzifrdcp</w:t>
             </w:r>
             <w:r w:rsidRPr="003LMB__UNEMP_CUR602">
               <w:rPr>
@@ -2988,7 +2988,7 @@
                 <w:sz w:val="20"/>
                 <w:szCs w:val="20"/>
               </w:rPr>
-              <w:t>LMB__INACT5064RT_DC_n</w:t>
+              <w:t>qvzifrdcn</w:t>
             </w:r>
           </w:p>
         </w:tc>
@@ -3018,7 +3018,7 @@
                 <w:sz w:val="20"/>
                 <w:szCs w:val="20"/>
               </w:rPr>
-              <w:t>LMB__INACT5064RT_DE_z</w:t>
+              <w:t>qvzifrdez</w:t>
             </w:r>
             <w:r w:rsidRPr="003LMB__UNEMP_CUR602">
               <w:rPr>
@@ -3028,7 +3028,7 @@
                 <w:sz w:val="20"/>
                 <w:szCs w:val="20"/>
               </w:rPr>
-              <w:t>LMB__INACT5064RT_DE_p</w:t>
+              <w:t>qvzifrdep</w:t>
             </w:r>
             <w:r w:rsidRPr="003LMB__UNEMP_CUR602">
               <w:rPr>
@@ -3038,7 +3038,7 @@
                 <w:sz w:val="20"/>
                 <w:szCs w:val="20"/>
               </w:rPr>
-              <w:t>LMB__INACT5064RT_DE_n</w:t>
+              <w:t>qvzifrden</w:t>
             </w:r>
           </w:p>
         </w:tc>
@@ -3113,7 +3113,7 @@
                 <w:sz w:val="20"/>
                 <w:szCs w:val="20"/>
               </w:rPr>
-              <w:t>LMB__VAC_CUR_z</w:t>
+              <w:t>qvzvaccurz</w:t>
             </w:r>
           </w:p>
         </w:tc>
@@ -3143,7 +3143,7 @@
                 <w:sz w:val="20"/>
                 <w:szCs w:val="20"/>
               </w:rPr>
-              <w:t>LMB__VAC_DQ_z</w:t>
+              <w:t>qvzvacdqz</w:t>
             </w:r>
           </w:p>
         </w:tc>
@@ -3173,7 +3173,7 @@
                 <w:sz w:val="20"/>
                 <w:szCs w:val="20"/>
               </w:rPr>
-              <w:t>LMB__VAC_DY_z</w:t>
+              <w:t>qvzvacdyz</w:t>
             </w:r>
           </w:p>
         </w:tc>
@@ -3202,7 +3202,7 @@
                 <w:sz w:val="20"/>
                 <w:szCs w:val="20"/>
               </w:rPr>
-              <w:t>LMB__VAC_DC_z</w:t>
+              <w:t>qvzvacdcz</w:t>
             </w:r>
           </w:p>
         </w:tc>
@@ -3231,7 +3231,7 @@
                 <w:sz w:val="20"/>
                 <w:szCs w:val="20"/>
               </w:rPr>
-              <w:t>LMB__VAC_DE_z</w:t>
+              <w:t>qvzvacdez</w:t>
             </w:r>
           </w:p>
         </w:tc>
@@ -3324,7 +3324,7 @@
                 <w:sz w:val="20"/>
                 <w:szCs w:val="20"/>
               </w:rPr>
-              <w:t>LMB__PAYROLL_CUR</w:t>
+              <w:t>qvzpaycur</w:t>
             </w:r>
           </w:p>
         </w:tc>
@@ -3352,7 +3352,7 @@
                 <w:sz w:val="20"/>
                 <w:szCs w:val="20"/>
               </w:rPr>
-              <w:t>LMB__PAYROLL_DQ_p</w:t>
+              <w:t>qvzpaydqp</w:t>
             </w:r>
             <w:r>
               <w:rPr>
@@ -3361,16 +3361,16 @@
                 <w:sz w:val="20"/>
                 <w:szCs w:val="20"/>
               </w:rPr>
-              <w:t>LMB__PAYROLL_DQ_n</w:t>
-            </w:r>
-            <w:r>
-              <w:rPr>
-                <w:b/>
-                <w:color w:val="000000"/>
-                <w:sz w:val="20"/>
-                <w:szCs w:val="20"/>
-              </w:rPr>
-              <w:t>LMB__PAYROLL_DQ_z</w:t>
+              <w:t>qvzpaydqn</w:t>
+            </w:r>
+            <w:r>
+              <w:rPr>
+                <w:b/>
+                <w:color w:val="000000"/>
+                <w:sz w:val="20"/>
+                <w:szCs w:val="20"/>
+              </w:rPr>
+              <w:t>qvzpaydqz</w:t>
             </w:r>
           </w:p>
         </w:tc>
@@ -3399,7 +3399,7 @@
                 <w:sz w:val="20"/>
                 <w:szCs w:val="20"/>
               </w:rPr>
-              <w:t>LMB__PAYROLL_DY_p</w:t>
+              <w:t>qvzpaydyp</w:t>
             </w:r>
             <w:r>
               <w:rPr>
@@ -3408,16 +3408,16 @@
                 <w:sz w:val="20"/>
                 <w:szCs w:val="20"/>
               </w:rPr>
-              <w:t>LMB__PAYROLL_DY_n</w:t>
-            </w:r>
-            <w:r>
-              <w:rPr>
-                <w:b/>
-                <w:color w:val="000000"/>
-                <w:sz w:val="20"/>
-                <w:szCs w:val="20"/>
-              </w:rPr>
-              <w:t>LMB__PAYROLL_DY_z</w:t>
+              <w:t>qvzpaydyn</w:t>
+            </w:r>
+            <w:r>
+              <w:rPr>
+                <w:b/>
+                <w:color w:val="000000"/>
+                <w:sz w:val="20"/>
+                <w:szCs w:val="20"/>
+              </w:rPr>
+              <w:t>qvzpaydyz</w:t>
             </w:r>
           </w:p>
         </w:tc>
@@ -3445,7 +3445,7 @@
                 <w:sz w:val="20"/>
                 <w:szCs w:val="20"/>
               </w:rPr>
-              <w:t>LMB__PAYROLL_DC_p</w:t>
+              <w:t>qvzpaydcp</w:t>
             </w:r>
             <w:r>
               <w:rPr>
@@ -3454,16 +3454,16 @@
                 <w:sz w:val="20"/>
                 <w:szCs w:val="20"/>
               </w:rPr>
-              <w:t>LMB__PAYROLL_DC_n</w:t>
-            </w:r>
-            <w:r>
-              <w:rPr>
-                <w:b/>
-                <w:color w:val="000000"/>
-                <w:sz w:val="20"/>
-                <w:szCs w:val="20"/>
-              </w:rPr>
-              <w:t>LMB__PAYROLL_DC_z</w:t>
+              <w:t>qvzpaydcn</w:t>
+            </w:r>
+            <w:r>
+              <w:rPr>
+                <w:b/>
+                <w:color w:val="000000"/>
+                <w:sz w:val="20"/>
+                <w:szCs w:val="20"/>
+              </w:rPr>
+              <w:t>qvzpaydcz</w:t>
             </w:r>
           </w:p>
         </w:tc>
@@ -3491,7 +3491,7 @@
                 <w:sz w:val="20"/>
                 <w:szCs w:val="20"/>
               </w:rPr>
-              <w:t>LMB__PAYROLL_DE_p</w:t>
+              <w:t>qvzpaydep</w:t>
             </w:r>
             <w:r>
               <w:rPr>
@@ -3500,16 +3500,16 @@
                 <w:sz w:val="20"/>
                 <w:szCs w:val="20"/>
               </w:rPr>
-              <w:t>LMB__PAYROLL_DE_n</w:t>
-            </w:r>
-            <w:r>
-              <w:rPr>
-                <w:b/>
-                <w:color w:val="000000"/>
-                <w:sz w:val="20"/>
-                <w:szCs w:val="20"/>
-              </w:rPr>
-              <w:t>LMB__PAYROLL_DE_z</w:t>
+              <w:t>qvzpayden</w:t>
+            </w:r>
+            <w:r>
+              <w:rPr>
+                <w:b/>
+                <w:color w:val="000000"/>
+                <w:sz w:val="20"/>
+                <w:szCs w:val="20"/>
+              </w:rPr>
+              <w:t>qvzpaydez</w:t>
             </w:r>
           </w:p>
         </w:tc>
@@ -3612,7 +3612,7 @@
                 <w:sz w:val="20"/>
                 <w:szCs w:val="20"/>
               </w:rPr>
-              <w:t>LMB__WAGENOM_CUR</w:t>
+              <w:t>qvzwnocur</w:t>
             </w:r>
           </w:p>
         </w:tc>
@@ -3641,7 +3641,7 @@
                 <w:sz w:val="20"/>
                 <w:szCs w:val="20"/>
               </w:rPr>
-              <w:t>LMB__WAGENOM_DQ_p</w:t>
+              <w:t>qvzwnodqp</w:t>
             </w:r>
             <w:r>
               <w:rPr>
@@ -3650,16 +3650,16 @@
                 <w:sz w:val="20"/>
                 <w:szCs w:val="20"/>
               </w:rPr>
-              <w:t>LMB__WAGENOM_DQ_n</w:t>
-            </w:r>
-            <w:r>
-              <w:rPr>
-                <w:b/>
-                <w:color w:val="000000"/>
-                <w:sz w:val="20"/>
-                <w:szCs w:val="20"/>
-              </w:rPr>
-              <w:t>LMB__WAGENOM_DQ_z</w:t>
+              <w:t>qvzwnodqn</w:t>
+            </w:r>
+            <w:r>
+              <w:rPr>
+                <w:b/>
+                <w:color w:val="000000"/>
+                <w:sz w:val="20"/>
+                <w:szCs w:val="20"/>
+              </w:rPr>
+              <w:t>qvzwnodqz</w:t>
             </w:r>
           </w:p>
         </w:tc>
@@ -3688,7 +3688,7 @@
                 <w:sz w:val="20"/>
                 <w:szCs w:val="20"/>
               </w:rPr>
-              <w:t>LMB__WAGENOM_DY_p</w:t>
+              <w:t>qvzwnodyp</w:t>
             </w:r>
             <w:r>
               <w:rPr>
@@ -3697,16 +3697,16 @@
                 <w:sz w:val="20"/>
                 <w:szCs w:val="20"/>
               </w:rPr>
-              <w:t>LMB__WAGENOM_DY_n</w:t>
-            </w:r>
-            <w:r>
-              <w:rPr>
-                <w:b/>
-                <w:color w:val="000000"/>
-                <w:sz w:val="20"/>
-                <w:szCs w:val="20"/>
-              </w:rPr>
-              <w:t>LMB__WAGENOM_DY_z</w:t>
+              <w:t>qvzwnodyn</w:t>
+            </w:r>
+            <w:r>
+              <w:rPr>
+                <w:b/>
+                <w:color w:val="000000"/>
+                <w:sz w:val="20"/>
+                <w:szCs w:val="20"/>
+              </w:rPr>
+              <w:t>qvzwnodyz</w:t>
             </w:r>
           </w:p>
         </w:tc>
@@ -3734,7 +3734,7 @@
                 <w:sz w:val="20"/>
                 <w:szCs w:val="20"/>
               </w:rPr>
-              <w:t>LMB__WAGENOM_DC_p</w:t>
+              <w:t>qvzwnodcp</w:t>
             </w:r>
             <w:r>
               <w:rPr>
@@ -3743,16 +3743,16 @@
                 <w:sz w:val="20"/>
                 <w:szCs w:val="20"/>
               </w:rPr>
-              <w:t>LMB__WAGENOM_DC_n</w:t>
-            </w:r>
-            <w:r>
-              <w:rPr>
-                <w:b/>
-                <w:color w:val="000000"/>
-                <w:sz w:val="20"/>
-                <w:szCs w:val="20"/>
-              </w:rPr>
-              <w:t>LMB__WAGENOM_DC_z</w:t>
+              <w:t>qvzwnodcn</w:t>
+            </w:r>
+            <w:r>
+              <w:rPr>
+                <w:b/>
+                <w:color w:val="000000"/>
+                <w:sz w:val="20"/>
+                <w:szCs w:val="20"/>
+              </w:rPr>
+              <w:t>qvzwnodcz</w:t>
             </w:r>
           </w:p>
         </w:tc>
@@ -3780,7 +3780,7 @@
                 <w:sz w:val="20"/>
                 <w:szCs w:val="20"/>
               </w:rPr>
-              <w:t>LMB__WAGENOM_DE_p</w:t>
+              <w:t>qvzwnodep</w:t>
             </w:r>
             <w:r>
               <w:rPr>
@@ -3789,16 +3789,16 @@
                 <w:sz w:val="20"/>
                 <w:szCs w:val="20"/>
               </w:rPr>
-              <w:t>LMB__WAGENOM_DE_n</w:t>
-            </w:r>
-            <w:r>
-              <w:rPr>
-                <w:b/>
-                <w:color w:val="000000"/>
-                <w:sz w:val="20"/>
-                <w:szCs w:val="20"/>
-              </w:rPr>
-              <w:t>LMB__WAGENOM_DE_z</w:t>
+              <w:t>qvzwnoden</w:t>
+            </w:r>
+            <w:r>
+              <w:rPr>
+                <w:b/>
+                <w:color w:val="000000"/>
+                <w:sz w:val="20"/>
+                <w:szCs w:val="20"/>
+              </w:rPr>
+              <w:t>qvzwnodez</w:t>
             </w:r>
           </w:p>
         </w:tc>
@@ -3907,7 +3907,7 @@
                 <w:sz w:val="20"/>
                 <w:szCs w:val="20"/>
               </w:rPr>
-              <w:t>LMB__WAGECPI_CUR</w:t>
+              <w:t>qvzwcpcur</w:t>
             </w:r>
           </w:p>
         </w:tc>
@@ -3941,7 +3941,7 @@
                 <w:sz w:val="20"/>
                 <w:szCs w:val="20"/>
               </w:rPr>
-              <w:t>LMB__WAGECPI_DQ_z</w:t>
+              <w:t>qvzwcpdqz</w:t>
             </w:r>
             <w:r>
               <w:rPr>
@@ -3950,7 +3950,7 @@
                 <w:sz w:val="20"/>
                 <w:szCs w:val="20"/>
               </w:rPr>
-              <w:t>LMB__WAGECPI_DQ_p</w:t>
+              <w:t>qvzwcpdqp</w:t>
             </w:r>
             <w:r>
               <w:rPr>
@@ -3959,7 +3959,7 @@
                 <w:sz w:val="20"/>
                 <w:szCs w:val="20"/>
               </w:rPr>
-              <w:t>LMB__WAGECPI_DQ_n</w:t>
+              <w:t>qvzwcpdqn</w:t>
             </w:r>
           </w:p>
         </w:tc>
@@ -3994,7 +3994,7 @@
                 <w:sz w:val="20"/>
                 <w:szCs w:val="20"/>
               </w:rPr>
-              <w:t>LMB__WAGECPI_DY_p</w:t>
+              <w:t>qvzwcpdyp</w:t>
             </w:r>
             <w:r>
               <w:rPr>
@@ -4006,7 +4006,7 @@
                 <w:sz w:val="20"/>
                 <w:szCs w:val="20"/>
               </w:rPr>
-              <w:t>LMB__WAGECPI_DY_n</w:t>
+              <w:t>qvzwcpdyn</w:t>
             </w:r>
             <w:r>
               <w:rPr>
@@ -4018,7 +4018,7 @@
                 <w:sz w:val="20"/>
                 <w:szCs w:val="20"/>
               </w:rPr>
-              <w:t>LMB__WAGECPI_DY_z</w:t>
+              <w:t>qvzwcpdyz</w:t>
             </w:r>
           </w:p>
         </w:tc>
@@ -4052,7 +4052,7 @@
                 <w:sz w:val="20"/>
                 <w:szCs w:val="20"/>
               </w:rPr>
-              <w:t>LMB__WAGECPI_DC_z</w:t>
+              <w:t>qvzwcpdcz</w:t>
             </w:r>
             <w:r>
               <w:rPr>
@@ -4061,7 +4061,7 @@
                 <w:sz w:val="20"/>
                 <w:szCs w:val="20"/>
               </w:rPr>
-              <w:t>LMB__WAGECPI_DC_p</w:t>
+              <w:t>qvzwcpdcp</w:t>
             </w:r>
             <w:r>
               <w:rPr>
@@ -4070,7 +4070,7 @@
                 <w:sz w:val="20"/>
                 <w:szCs w:val="20"/>
               </w:rPr>
-              <w:t>LMB__WAGECPI_DC_n</w:t>
+              <w:t>qvzwcpdcn</w:t>
             </w:r>
           </w:p>
         </w:tc>
@@ -4104,7 +4104,7 @@
                 <w:sz w:val="20"/>
                 <w:szCs w:val="20"/>
               </w:rPr>
-              <w:t>LMB__WAGECPI_DE_z</w:t>
+              <w:t>qvzwcpdez</w:t>
             </w:r>
             <w:r>
               <w:rPr>
@@ -4113,7 +4113,7 @@
                 <w:sz w:val="20"/>
                 <w:szCs w:val="20"/>
               </w:rPr>
-              <w:t>LMB__WAGECPI_DE_p</w:t>
+              <w:t>qvzwcpdep</w:t>
             </w:r>
             <w:r>
               <w:rPr>
@@ -4122,7 +4122,7 @@
                 <w:sz w:val="20"/>
                 <w:szCs w:val="20"/>
               </w:rPr>
-              <w:t>LMB__WAGECPI_DE_n</w:t>
+              <w:t>qvzwcpden</w:t>
             </w:r>
           </w:p>
         </w:tc>
@@ -4332,7 +4332,7 @@
           <w:sz w:val="22"/>
           <w:szCs w:val="28"/>
         </w:rPr>
-        <w:t>LMB__TT01</w:t>
+        <w:t>qvztt01</w:t>
       </w:r>
     </w:p>
     <w:p w:rsidRPr="00ELMB__EMP_CUR557">
@@ -4356,7 +4356,7 @@
           <w:sz w:val="22"/>
           <w:szCs w:val="28"/>
         </w:rPr>
-        <w:t>LMB__TT02</w:t>
+        <w:t>qvztt02</w:t>
       </w:r>
       <w:r>
         <w:rPr>
@@ -4412,7 +4412,7 @@
           <w:sz w:val="22"/>
           <w:szCs w:val="28"/>
         </w:rPr>
-        <w:t>LMB__TT03</w:t>
+        <w:t>qvztt03</w:t>
       </w:r>
     </w:p>
     <w:p>
@@ -4436,7 +4436,7 @@
           <w:sz w:val="22"/>
           <w:szCs w:val="22"/>
         </w:rPr>
-        <w:t>LMB__TT04</w:t>
+        <w:t>qvztt04</w:t>
       </w:r>
     </w:p>
     <w:p>
@@ -4460,7 +4460,7 @@
           <w:sz w:val="22"/>
           <w:szCs w:val="28"/>
         </w:rPr>
-        <w:t>LMB__TT05</w:t>
+        <w:t>qvztt05</w:t>
       </w:r>
     </w:p>
     <w:p w14:paraId="0LMB__UNEMPRT_CURC44AE">
@@ -4484,7 +4484,7 @@
           <w:sz w:val="22"/>
           <w:szCs w:val="28"/>
         </w:rPr>
-        <w:t>LMB__TT06</w:t>
+        <w:t>qvztt06</w:t>
       </w:r>
     </w:p>
     <w:p>
@@ -4508,7 +4508,7 @@
           <w:sz w:val="22"/>
           <w:szCs w:val="28"/>
         </w:rPr>
-        <w:t>LMB__TT07</w:t>
+        <w:t>qvztt07</w:t>
       </w:r>
     </w:p>
     <w:p>
@@ -4532,7 +4532,7 @@
           <w:sz w:val="22"/>
           <w:szCs w:val="28"/>
         </w:rPr>
-        <w:t>LMB__TT08</w:t>
+        <w:t>qvztt08</w:t>
       </w:r>
     </w:p>
     <w:p w:rsidR="009LMB__EMPRT_CURA59">
@@ -4556,7 +4556,7 @@
           <w:sz w:val="22"/>
           <w:szCs w:val="28"/>
         </w:rPr>
-        <w:t>LMB__TT09</w:t>
+        <w:t>qvztt09</w:t>
       </w:r>
     </w:p>
     <w:p>
@@ -4580,7 +4580,7 @@
           <w:sz w:val="22"/>
           <w:szCs w:val="28"/>
         </w:rPr>
-        <w:t>LMB__TT10</w:t>
+        <w:t>qvztt10</w:t>
       </w:r>
     </w:p>
     <w:p>

</xml_diff>

<commit_message>
Use template OECD page with qvz placeholders instead of building table
- Extracted the exact OECD International Comparisons page from the
  published briefing into ManualDB.docx (last page, with page break)
- Table cells use qvzoecd{cc}{col} placeholders (e.g. qvzoecdukur)
  that get replaced with data at runtime via replace_all()
- Removed flextable dependency — no longer rebuilds the table from
  scratch each time
- Preserves original formatting, footnotes, and styling from the
  published briefing

https://claude.ai/code/session_01VEXiosZ4vEhJnsCZ1briQm
</commit_message>
<xml_diff>
--- a/LMSB_extracted/labour-market-stats-brief/utils/ManualDB.docx
+++ b/LMSB_extracted/labour-market-stats-brief/utils/ManualDB.docx
@@ -1,6 +1,6 @@
 
 <file path=word/document.xml><?xml version="1.0" encoding="utf-8"?>
-<w:document xmlns:a="http://schemas.openxmlformats.org/drawingml/2006/main" xmlns:a14="http://schemas.microsoft.com/office/drawing/2010/main" xmlns:adec="http://schemas.microsoft.com/office/drawing/2017/decorative" xmlns:mc="http://schemas.openxmlformats.org/markup-compatibility/2006" xmlns:pic="http://schemas.openxmlformats.org/drawingml/2006/picture" xmlns:r="http://schemas.openxmlformats.org/officeDocument/2006/relationships" xmlns:w="http://schemas.openxmlformats.org/wordprocessingml/2006/main" xmlns:w14="http://schemas.microsoft.com/office/word/2010/wordml" xmlns:wp="http://schemas.openxmlformats.org/drawingml/2006/wordprocessingDrawing" xmlns:wp14="http://schemas.microsoft.com/office/word/2010/wordprocessingDrawing" mc:Ignorable="w14 w15 w16se w16cid w16 w16cex w16sdtdh w16sdtfl w16du wp14">
+<w:document xmlns:a="http://schemas.openxmlformats.org/drawingml/2006/main" xmlns:mc="http://schemas.openxmlformats.org/markup-compatibility/2006" xmlns:ns7="http://schemas.microsoft.com/office/drawing/2017/decorative" xmlns:ns9="http://schemas.microsoft.com/office/drawing/2010/main" xmlns:pic="http://schemas.openxmlformats.org/drawingml/2006/picture" xmlns:r="http://schemas.openxmlformats.org/officeDocument/2006/relationships" xmlns:w="http://schemas.openxmlformats.org/wordprocessingml/2006/main" xmlns:w14="http://schemas.microsoft.com/office/word/2010/wordml" xmlns:wp="http://schemas.openxmlformats.org/drawingml/2006/wordprocessingDrawing" xmlns:wp14="http://schemas.microsoft.com/office/word/2010/wordprocessingDrawing" mc:Ignorable="w14 w15 w16se w16cid w16 w16cex w16sdtdh w16sdtfl w16du wp14">
   <w:body>
     <w:tbl>
       <w:tblPr>
@@ -108,7 +108,7 @@
                   <wp:docPr id="530377592" name="Picture 1">
                     <a:extLst>
                       <a:ext uri="{LMB__EMPRT_CUR83D7F6-B498-43B3-948B-1728B52AA6E4}">
-                        <adec:decorative val="1"/>
+                        <ns7:decorative val="1"/>
                       </a:ext>
                     </a:extLst>
                   </wp:docPr>
@@ -122,7 +122,7 @@
                           <pic:cNvPr id="530377592" name="Picture 1">
                             <a:extLst>
                               <a:ext uri="{LMB__EMPRT_CUR83D7F6-B498-43B3-948B-1728B52AA6E4}">
-                                <adec:decorative val="1"/>
+                                <ns7:decorative val="1"/>
                               </a:ext>
                             </a:extLst>
                           </pic:cNvPr>
@@ -134,7 +134,7 @@
                           <a:blip r:embed="rId13">
                             <a:extLst>
                               <a:ext uri="{28A0092B-C50C-407E-A947-70E740481LMB__EMPRT_CURC}">
-                                <a14:useLocalDpi val="0"/>
+                                <ns9:useLocalDpi val="0"/>
                               </a:ext>
                             </a:extLst>
                           </a:blip>
@@ -4622,6 +4622,2070 @@
           <w:szCs w:val="28"/>
         </w:rPr>
       </w:pPr>
+    </w:p>
+    <w:p>
+      <w:pPr/>
+      <w:r>
+        <w:br w:type="page"/>
+      </w:r>
+    </w:p>
+    <w:tbl>
+      <w:tblPr>
+        <w:tblStyle w:val="TableGrid"/>
+        <w:tblW w:w="0" w:type="auto"/>
+        <w:tblLook w:val="04A0" w:firstRow="1" w:lastRow="0" w:firstColumn="1" w:lastColumn="0" w:noHBand="0" w:noVBand="1"/>
+      </w:tblPr>
+      <w:tblGrid>
+        <w:gridCol w:w="10456"/>
+      </w:tblGrid>
+      <w:tr>
+        <w:tc>
+          <w:tcPr>
+            <w:tcW w:w="10456" w:type="dxa"/>
+            <w:tcBorders>
+              <w:top w:val="nil"/>
+              <w:left w:val="nil"/>
+              <w:bottom w:val="nil"/>
+              <w:right w:val="nil"/>
+            </w:tcBorders>
+            <w:shd w:val="clear" w:color="auto" w:fill="D9DDEA" w:themeFill="accent5"/>
+          </w:tcPr>
+          <w:p>
+            <w:pPr>
+              <w:pStyle w:val="Heading1"/>
+            </w:pPr>
+            <w:r>
+              <w:lastRenderedPageBreak/>
+              <w:t>International Comparisons</w:t>
+            </w:r>
+          </w:p>
+        </w:tc>
+      </w:tr>
+      <w:tr>
+        <w:trPr>
+          <w:trHeight w:val="143"/>
+        </w:trPr>
+        <w:tc>
+          <w:tcPr>
+            <w:tcW w:w="10456" w:type="dxa"/>
+            <w:tcBorders>
+              <w:top w:val="nil"/>
+              <w:left w:val="nil"/>
+              <w:bottom w:val="nil"/>
+              <w:right w:val="nil"/>
+            </w:tcBorders>
+          </w:tcPr>
+          <w:p>
+            <w:pPr>
+              <w:pStyle w:val="Heading1"/>
+              <w:spacing w:before="0" w:after="0"/>
+              <w:jc w:val="both"/>
+              <w:rPr>
+                <w:sz w:val="2"/>
+                <w:szCs w:val="2"/>
+              </w:rPr>
+            </w:pPr>
+          </w:p>
+        </w:tc>
+      </w:tr>
+    </w:tbl>
+    <w:tbl>
+      <w:tblPr>
+        <w:tblpPr w:leftFromText="180" w:rightFromText="180" w:vertAnchor="text" w:horzAnchor="margin" w:tblpXSpec="center" w:tblpY="29"/>
+        <w:tblW w:w="5000" w:type="pct"/>
+        <w:jc w:val="center"/>
+        <w:tblBorders>
+          <w:insideH w:val="single" w:sz="4" w:space="0" w:color="auto"/>
+        </w:tblBorders>
+        <w:tblLayout w:type="fixed"/>
+        <w:tblLook w:val="04A0" w:firstRow="1" w:lastRow="0" w:firstColumn="1" w:lastColumn="0" w:noHBand="0" w:noVBand="1"/>
+      </w:tblPr>
+      <w:tblGrid>
+        <w:gridCol w:w="1700"/>
+        <w:gridCol w:w="2191"/>
+        <w:gridCol w:w="2191"/>
+        <w:gridCol w:w="2191"/>
+        <w:gridCol w:w="2188"/>
+      </w:tblGrid>
+      <w:tr>
+        <w:trPr>
+          <w:trHeight w:val="96"/>
+          <w:jc w:val="center"/>
+        </w:trPr>
+        <w:tc>
+          <w:tcPr>
+            <w:tcW w:w="813" w:type="pct"/>
+            <w:tcBorders>
+              <w:bottom w:val="single" w:sz="4" w:space="0" w:color="000000"/>
+              <w:right w:val="single" w:sz="4" w:space="0" w:color="auto"/>
+            </w:tcBorders>
+            <w:noWrap/>
+            <w:vAlign w:val="center"/>
+            <w:hideMark/>
+          </w:tcPr>
+          <w:p>
+            <w:pPr>
+              <w:spacing w:before="0" w:after="0"/>
+              <w:rPr>
+                <w:rFonts w:cs="Arial"/>
+                <w:b/>
+                <w:bCs/>
+                <w:color w:val="FFFFFF"/>
+                <w:sz w:val="20"/>
+                <w:szCs w:val="20"/>
+              </w:rPr>
+            </w:pPr>
+          </w:p>
+        </w:tc>
+        <w:tc>
+          <w:tcPr>
+            <w:tcW w:w="1047" w:type="pct"/>
+            <w:tcBorders>
+              <w:top w:val="single" w:sz="4" w:space="0" w:color="auto"/>
+              <w:left w:val="single" w:sz="4" w:space="0" w:color="auto"/>
+              <w:bottom w:val="single" w:sz="4" w:space="0" w:color="000000"/>
+              <w:right w:val="single" w:sz="4" w:space="0" w:color="auto"/>
+            </w:tcBorders>
+            <w:shd w:val="clear" w:color="auto" w:fill="00285F" w:themeFill="text2"/>
+            <w:noWrap/>
+            <w:vAlign w:val="center"/>
+          </w:tcPr>
+          <w:p>
+            <w:pPr>
+              <w:jc w:val="center"/>
+              <w:rPr>
+                <w:rFonts w:cs="Arial"/>
+                <w:b/>
+                <w:bCs/>
+                <w:color w:val="FFFFFF"/>
+                <w:szCs w:val="24"/>
+              </w:rPr>
+            </w:pPr>
+            <w:r>
+              <w:rPr>
+                <w:rFonts w:cs="Arial"/>
+                <w:b/>
+                <w:bCs/>
+                <w:color w:val="FFFFFF"/>
+                <w:szCs w:val="24"/>
+              </w:rPr>
+              <w:t>Time period</w:t>
+            </w:r>
+            <w:r>
+              <w:rPr>
+                <w:rFonts w:cs="Arial"/>
+                <w:b/>
+                <w:bCs/>
+                <w:color w:val="FFFFFF"/>
+                <w:szCs w:val="24"/>
+                <w:vertAlign w:val="superscript"/>
+              </w:rPr>
+              <w:t>1</w:t>
+            </w:r>
+          </w:p>
+        </w:tc>
+        <w:tc>
+          <w:tcPr>
+            <w:tcW w:w="1047" w:type="pct"/>
+            <w:tcBorders>
+              <w:top w:val="single" w:sz="4" w:space="0" w:color="auto"/>
+              <w:left w:val="single" w:sz="4" w:space="0" w:color="auto"/>
+              <w:bottom w:val="single" w:sz="4" w:space="0" w:color="000000"/>
+              <w:right w:val="single" w:sz="4" w:space="0" w:color="auto"/>
+            </w:tcBorders>
+            <w:shd w:val="clear" w:color="auto" w:fill="00285F" w:themeFill="text2"/>
+            <w:noWrap/>
+            <w:vAlign w:val="center"/>
+          </w:tcPr>
+          <w:p>
+            <w:pPr>
+              <w:jc w:val="center"/>
+              <w:rPr>
+                <w:rFonts w:cs="Arial"/>
+                <w:b/>
+                <w:bCs/>
+                <w:color w:val="FFFFFF"/>
+                <w:szCs w:val="24"/>
+              </w:rPr>
+            </w:pPr>
+            <w:r>
+              <w:rPr>
+                <w:rFonts w:cs="Arial"/>
+                <w:b/>
+                <w:bCs/>
+                <w:color w:val="FFFFFF"/>
+                <w:szCs w:val="24"/>
+              </w:rPr>
+              <w:t>Unemployment rate (15+</w:t>
+            </w:r>
+            <w:r>
+              <w:rPr>
+                <w:rFonts w:cs="Arial"/>
+                <w:b/>
+                <w:bCs/>
+                <w:color w:val="FFFFFF"/>
+                <w:szCs w:val="24"/>
+                <w:vertAlign w:val="superscript"/>
+              </w:rPr>
+              <w:t>2</w:t>
+            </w:r>
+            <w:r>
+              <w:rPr>
+                <w:rFonts w:cs="Arial"/>
+                <w:b/>
+                <w:bCs/>
+                <w:color w:val="FFFFFF"/>
+                <w:szCs w:val="24"/>
+              </w:rPr>
+              <w:t>, %)</w:t>
+            </w:r>
+          </w:p>
+        </w:tc>
+        <w:tc>
+          <w:tcPr>
+            <w:tcW w:w="1047" w:type="pct"/>
+            <w:tcBorders>
+              <w:top w:val="single" w:sz="4" w:space="0" w:color="auto"/>
+              <w:left w:val="single" w:sz="4" w:space="0" w:color="auto"/>
+              <w:bottom w:val="single" w:sz="4" w:space="0" w:color="000000"/>
+              <w:right w:val="single" w:sz="4" w:space="0" w:color="auto"/>
+            </w:tcBorders>
+            <w:shd w:val="clear" w:color="auto" w:fill="00285F" w:themeFill="text2"/>
+            <w:noWrap/>
+            <w:vAlign w:val="center"/>
+          </w:tcPr>
+          <w:p>
+            <w:pPr>
+              <w:jc w:val="center"/>
+              <w:rPr>
+                <w:rFonts w:cs="Arial"/>
+                <w:b/>
+                <w:bCs/>
+                <w:color w:val="FFFFFF"/>
+                <w:szCs w:val="24"/>
+              </w:rPr>
+            </w:pPr>
+            <w:r>
+              <w:rPr>
+                <w:rFonts w:cs="Arial"/>
+                <w:b/>
+                <w:bCs/>
+                <w:color w:val="FFFFFF"/>
+                <w:szCs w:val="24"/>
+              </w:rPr>
+              <w:t>Employment rate (15-64</w:t>
+            </w:r>
+            <w:r>
+              <w:rPr>
+                <w:rFonts w:cs="Arial"/>
+                <w:b/>
+                <w:bCs/>
+                <w:color w:val="FFFFFF"/>
+                <w:szCs w:val="24"/>
+                <w:vertAlign w:val="superscript"/>
+              </w:rPr>
+              <w:t>2</w:t>
+            </w:r>
+            <w:r>
+              <w:rPr>
+                <w:rFonts w:cs="Arial"/>
+                <w:b/>
+                <w:bCs/>
+                <w:color w:val="FFFFFF"/>
+                <w:szCs w:val="24"/>
+              </w:rPr>
+              <w:t>, %)</w:t>
+            </w:r>
+          </w:p>
+        </w:tc>
+        <w:tc>
+          <w:tcPr>
+            <w:tcW w:w="1046" w:type="pct"/>
+            <w:tcBorders>
+              <w:top w:val="single" w:sz="4" w:space="0" w:color="auto"/>
+              <w:left w:val="single" w:sz="4" w:space="0" w:color="auto"/>
+              <w:bottom w:val="single" w:sz="4" w:space="0" w:color="000000"/>
+              <w:right w:val="single" w:sz="4" w:space="0" w:color="auto"/>
+            </w:tcBorders>
+            <w:shd w:val="clear" w:color="auto" w:fill="00285F" w:themeFill="text2"/>
+          </w:tcPr>
+          <w:p>
+            <w:pPr>
+              <w:jc w:val="center"/>
+              <w:rPr>
+                <w:rFonts w:cs="Arial"/>
+                <w:b/>
+                <w:bCs/>
+                <w:color w:val="FFFFFF"/>
+                <w:szCs w:val="24"/>
+              </w:rPr>
+            </w:pPr>
+            <w:r>
+              <w:rPr>
+                <w:rFonts w:cs="Arial"/>
+                <w:b/>
+                <w:bCs/>
+                <w:color w:val="FFFFFF"/>
+                <w:szCs w:val="24"/>
+              </w:rPr>
+              <w:t>Inactivity Rate (1</w:t>
+            </w:r>
+            <w:r>
+              <w:rPr>
+                <w:rFonts w:cs="Arial"/>
+                <w:b/>
+                <w:bCs/>
+                <w:color w:val="FFFFFF"/>
+                <w:szCs w:val="24"/>
+              </w:rPr>
+              <w:t>5</w:t>
+            </w:r>
+            <w:r>
+              <w:rPr>
+                <w:rFonts w:cs="Arial"/>
+                <w:b/>
+                <w:bCs/>
+                <w:color w:val="FFFFFF"/>
+                <w:szCs w:val="24"/>
+              </w:rPr>
+              <w:t>-64</w:t>
+            </w:r>
+            <w:r>
+              <w:rPr>
+                <w:rFonts w:cs="Arial"/>
+                <w:b/>
+                <w:bCs/>
+                <w:color w:val="FFFFFF"/>
+                <w:szCs w:val="24"/>
+                <w:vertAlign w:val="superscript"/>
+              </w:rPr>
+              <w:t>2</w:t>
+            </w:r>
+            <w:r>
+              <w:rPr>
+                <w:rFonts w:cs="Arial"/>
+                <w:b/>
+                <w:bCs/>
+                <w:color w:val="FFFFFF"/>
+                <w:szCs w:val="24"/>
+              </w:rPr>
+              <w:t>, %)</w:t>
+            </w:r>
+          </w:p>
+        </w:tc>
+      </w:tr>
+      <w:tr>
+        <w:trPr>
+          <w:trHeight w:val="546"/>
+          <w:jc w:val="center"/>
+        </w:trPr>
+        <w:tc>
+          <w:tcPr>
+            <w:tcW w:w="813" w:type="pct"/>
+            <w:tcBorders>
+              <w:top w:val="single" w:sz="4" w:space="0" w:color="000000"/>
+              <w:left w:val="single" w:sz="4" w:space="0" w:color="000000"/>
+              <w:bottom w:val="single" w:sz="4" w:space="0" w:color="000000"/>
+              <w:right w:val="single" w:sz="4" w:space="0" w:color="000000"/>
+            </w:tcBorders>
+            <w:shd w:val="clear" w:color="auto" w:fill="002060"/>
+            <w:vAlign w:val="center"/>
+          </w:tcPr>
+          <w:p>
+            <w:pPr>
+              <w:spacing w:before="0" w:after="0"/>
+              <w:jc w:val="center"/>
+              <w:rPr>
+                <w:rFonts w:cs="Arial"/>
+                <w:b/>
+                <w:bCs/>
+                <w:color w:val="FFFFFF"/>
+                <w:szCs w:val="24"/>
+              </w:rPr>
+            </w:pPr>
+            <w:r>
+              <w:t>UK</w:t>
+            </w:r>
+          </w:p>
+        </w:tc>
+        <w:tc>
+          <w:tcPr>
+            <w:tcW w:w="1047" w:type="pct"/>
+            <w:tcBorders>
+              <w:top w:val="single" w:sz="4" w:space="0" w:color="000000"/>
+              <w:left w:val="single" w:sz="4" w:space="0" w:color="000000"/>
+              <w:bottom w:val="single" w:sz="4" w:space="0" w:color="000000"/>
+              <w:right w:val="single" w:sz="4" w:space="0" w:color="000000"/>
+            </w:tcBorders>
+            <w:shd w:val="clear" w:color="000000" w:fill="FFFFFF"/>
+            <w:noWrap/>
+            <w:vAlign w:val="center"/>
+          </w:tcPr>
+          <w:p>
+            <w:pPr>
+              <w:spacing w:before="0" w:after="0"/>
+              <w:jc w:val="center"/>
+              <w:rPr>
+                <w:rFonts w:cs="Arial"/>
+                <w:b/>
+                <w:color w:val="000000"/>
+                <w:szCs w:val="24"/>
+              </w:rPr>
+            </w:pPr>
+            <w:r>
+              <w:t>qvzoecduktp</w:t>
+            </w:r>
+            <w:r>
+              <w:t/>
+            </w:r>
+            <w:r>
+              <w:t xml:space="preserve"/>
+            </w:r>
+            <w:r>
+              <w:t/>
+            </w:r>
+          </w:p>
+        </w:tc>
+        <w:tc>
+          <w:tcPr>
+            <w:tcW w:w="1047" w:type="pct"/>
+            <w:tcBorders>
+              <w:top w:val="single" w:sz="4" w:space="0" w:color="000000"/>
+              <w:left w:val="single" w:sz="4" w:space="0" w:color="000000"/>
+              <w:bottom w:val="single" w:sz="4" w:space="0" w:color="000000"/>
+              <w:right w:val="single" w:sz="4" w:space="0" w:color="000000"/>
+            </w:tcBorders>
+            <w:shd w:val="clear" w:color="000000" w:fill="FFFFFF"/>
+            <w:noWrap/>
+            <w:vAlign w:val="center"/>
+          </w:tcPr>
+          <w:p>
+            <w:pPr>
+              <w:spacing w:before="0" w:after="0"/>
+              <w:jc w:val="center"/>
+              <w:rPr>
+                <w:rFonts w:cs="Arial"/>
+                <w:b/>
+                <w:color w:val="9C0006"/>
+                <w:szCs w:val="24"/>
+              </w:rPr>
+            </w:pPr>
+            <w:r>
+              <w:t>qvzoecdukur</w:t>
+            </w:r>
+            <w:r>
+              <w:t/>
+            </w:r>
+            <w:r>
+              <w:t/>
+            </w:r>
+          </w:p>
+        </w:tc>
+        <w:tc>
+          <w:tcPr>
+            <w:tcW w:w="1047" w:type="pct"/>
+            <w:tcBorders>
+              <w:top w:val="single" w:sz="4" w:space="0" w:color="000000"/>
+              <w:left w:val="single" w:sz="4" w:space="0" w:color="000000"/>
+              <w:bottom w:val="single" w:sz="4" w:space="0" w:color="000000"/>
+              <w:right w:val="single" w:sz="4" w:space="0" w:color="000000"/>
+            </w:tcBorders>
+            <w:shd w:val="clear" w:color="000000" w:fill="FFFFFF"/>
+            <w:noWrap/>
+            <w:vAlign w:val="center"/>
+          </w:tcPr>
+          <w:p>
+            <w:pPr>
+              <w:spacing w:before="0" w:after="0"/>
+              <w:jc w:val="center"/>
+              <w:rPr>
+                <w:rFonts w:cs="Arial"/>
+                <w:b/>
+                <w:color w:val="00B050"/>
+                <w:szCs w:val="24"/>
+              </w:rPr>
+            </w:pPr>
+            <w:r>
+              <w:t>qvzoecduker</w:t>
+            </w:r>
+          </w:p>
+        </w:tc>
+        <w:tc>
+          <w:tcPr>
+            <w:tcW w:w="1046" w:type="pct"/>
+            <w:tcBorders>
+              <w:top w:val="single" w:sz="4" w:space="0" w:color="000000"/>
+              <w:left w:val="single" w:sz="4" w:space="0" w:color="000000"/>
+              <w:bottom w:val="single" w:sz="4" w:space="0" w:color="000000"/>
+              <w:right w:val="single" w:sz="4" w:space="0" w:color="000000"/>
+            </w:tcBorders>
+            <w:shd w:val="clear" w:color="000000" w:fill="FFFFFF"/>
+            <w:vAlign w:val="center"/>
+          </w:tcPr>
+          <w:p>
+            <w:pPr>
+              <w:spacing w:before="0" w:after="0"/>
+              <w:jc w:val="center"/>
+              <w:rPr>
+                <w:rFonts w:cs="Arial"/>
+                <w:b/>
+                <w:color w:val="006100"/>
+                <w:szCs w:val="24"/>
+              </w:rPr>
+            </w:pPr>
+            <w:r>
+              <w:t>qvzoecdukir</w:t>
+            </w:r>
+            <w:r>
+              <w:t/>
+            </w:r>
+            <w:r>
+              <w:t/>
+            </w:r>
+            <w:r>
+              <w:t/>
+            </w:r>
+            <w:r>
+              <w:t/>
+            </w:r>
+          </w:p>
+        </w:tc>
+      </w:tr>
+      <w:tr>
+        <w:trPr>
+          <w:trHeight w:val="546"/>
+          <w:jc w:val="center"/>
+        </w:trPr>
+        <w:tc>
+          <w:tcPr>
+            <w:tcW w:w="813" w:type="pct"/>
+            <w:tcBorders>
+              <w:top w:val="single" w:sz="4" w:space="0" w:color="000000"/>
+              <w:left w:val="single" w:sz="4" w:space="0" w:color="000000"/>
+              <w:bottom w:val="single" w:sz="4" w:space="0" w:color="000000"/>
+              <w:right w:val="single" w:sz="4" w:space="0" w:color="000000"/>
+            </w:tcBorders>
+            <w:shd w:val="clear" w:color="auto" w:fill="002060"/>
+            <w:vAlign w:val="center"/>
+          </w:tcPr>
+          <w:p>
+            <w:pPr>
+              <w:spacing w:before="0" w:after="0"/>
+              <w:jc w:val="center"/>
+              <w:rPr>
+                <w:rFonts w:cs="Arial"/>
+                <w:b/>
+                <w:bCs/>
+                <w:color w:val="FFFFFF"/>
+                <w:szCs w:val="24"/>
+              </w:rPr>
+            </w:pPr>
+            <w:r>
+              <w:t>US</w:t>
+            </w:r>
+          </w:p>
+        </w:tc>
+        <w:tc>
+          <w:tcPr>
+            <w:tcW w:w="1047" w:type="pct"/>
+            <w:tcBorders>
+              <w:top w:val="single" w:sz="4" w:space="0" w:color="000000"/>
+              <w:left w:val="single" w:sz="4" w:space="0" w:color="000000"/>
+              <w:bottom w:val="single" w:sz="4" w:space="0" w:color="000000"/>
+              <w:right w:val="single" w:sz="4" w:space="0" w:color="000000"/>
+            </w:tcBorders>
+            <w:shd w:val="clear" w:color="000000" w:fill="FFFFFF"/>
+            <w:noWrap/>
+            <w:vAlign w:val="center"/>
+          </w:tcPr>
+          <w:p>
+            <w:pPr>
+              <w:spacing w:before="0" w:after="0"/>
+              <w:jc w:val="center"/>
+              <w:rPr>
+                <w:rFonts w:cs="Arial"/>
+                <w:b/>
+                <w:color w:val="000000"/>
+                <w:szCs w:val="24"/>
+              </w:rPr>
+            </w:pPr>
+            <w:r>
+              <w:t>qvzoecdustp</w:t>
+            </w:r>
+          </w:p>
+        </w:tc>
+        <w:tc>
+          <w:tcPr>
+            <w:tcW w:w="1047" w:type="pct"/>
+            <w:tcBorders>
+              <w:top w:val="single" w:sz="4" w:space="0" w:color="000000"/>
+              <w:left w:val="single" w:sz="4" w:space="0" w:color="000000"/>
+              <w:bottom w:val="single" w:sz="4" w:space="0" w:color="000000"/>
+              <w:right w:val="single" w:sz="4" w:space="0" w:color="000000"/>
+            </w:tcBorders>
+            <w:shd w:val="clear" w:color="000000" w:fill="FFFFFF"/>
+            <w:noWrap/>
+            <w:vAlign w:val="center"/>
+          </w:tcPr>
+          <w:p>
+            <w:pPr>
+              <w:spacing w:before="0" w:after="0"/>
+              <w:jc w:val="center"/>
+              <w:rPr>
+                <w:rFonts w:cs="Arial"/>
+                <w:b/>
+                <w:szCs w:val="24"/>
+              </w:rPr>
+            </w:pPr>
+            <w:r>
+              <w:t>qvzoecdusur</w:t>
+            </w:r>
+          </w:p>
+        </w:tc>
+        <w:tc>
+          <w:tcPr>
+            <w:tcW w:w="1047" w:type="pct"/>
+            <w:tcBorders>
+              <w:top w:val="single" w:sz="4" w:space="0" w:color="000000"/>
+              <w:left w:val="single" w:sz="4" w:space="0" w:color="000000"/>
+              <w:bottom w:val="single" w:sz="4" w:space="0" w:color="000000"/>
+              <w:right w:val="single" w:sz="4" w:space="0" w:color="000000"/>
+            </w:tcBorders>
+            <w:shd w:val="clear" w:color="000000" w:fill="FFFFFF"/>
+            <w:noWrap/>
+            <w:vAlign w:val="center"/>
+          </w:tcPr>
+          <w:p>
+            <w:pPr>
+              <w:spacing w:before="0" w:after="0"/>
+              <w:jc w:val="center"/>
+              <w:rPr>
+                <w:rFonts w:cs="Arial"/>
+                <w:b/>
+                <w:color w:val="9C0006"/>
+                <w:szCs w:val="24"/>
+              </w:rPr>
+            </w:pPr>
+            <w:r>
+              <w:t>qvzoecduser</w:t>
+            </w:r>
+          </w:p>
+        </w:tc>
+        <w:tc>
+          <w:tcPr>
+            <w:tcW w:w="1046" w:type="pct"/>
+            <w:tcBorders>
+              <w:top w:val="single" w:sz="4" w:space="0" w:color="000000"/>
+              <w:left w:val="single" w:sz="4" w:space="0" w:color="000000"/>
+              <w:bottom w:val="single" w:sz="4" w:space="0" w:color="000000"/>
+              <w:right w:val="single" w:sz="4" w:space="0" w:color="000000"/>
+            </w:tcBorders>
+            <w:shd w:val="clear" w:color="000000" w:fill="FFFFFF"/>
+            <w:vAlign w:val="center"/>
+          </w:tcPr>
+          <w:p>
+            <w:pPr>
+              <w:spacing w:before="0" w:after="0"/>
+              <w:jc w:val="center"/>
+              <w:rPr>
+                <w:rFonts w:cs="Arial"/>
+                <w:b/>
+                <w:color w:val="9C0006"/>
+                <w:szCs w:val="24"/>
+              </w:rPr>
+            </w:pPr>
+            <w:r>
+              <w:t>qvzoecdusir</w:t>
+            </w:r>
+          </w:p>
+        </w:tc>
+      </w:tr>
+      <w:tr>
+        <w:trPr>
+          <w:trHeight w:val="546"/>
+          <w:jc w:val="center"/>
+        </w:trPr>
+        <w:tc>
+          <w:tcPr>
+            <w:tcW w:w="813" w:type="pct"/>
+            <w:tcBorders>
+              <w:top w:val="single" w:sz="4" w:space="0" w:color="000000"/>
+              <w:left w:val="single" w:sz="4" w:space="0" w:color="000000"/>
+              <w:bottom w:val="single" w:sz="4" w:space="0" w:color="000000"/>
+              <w:right w:val="single" w:sz="4" w:space="0" w:color="000000"/>
+            </w:tcBorders>
+            <w:shd w:val="clear" w:color="auto" w:fill="002060"/>
+            <w:vAlign w:val="center"/>
+          </w:tcPr>
+          <w:p>
+            <w:pPr>
+              <w:spacing w:before="0" w:after="0"/>
+              <w:jc w:val="center"/>
+              <w:rPr>
+                <w:rFonts w:cs="Arial"/>
+                <w:b/>
+                <w:bCs/>
+                <w:color w:val="FFFFFF"/>
+                <w:szCs w:val="24"/>
+              </w:rPr>
+            </w:pPr>
+            <w:r>
+              <w:t>France</w:t>
+            </w:r>
+          </w:p>
+        </w:tc>
+        <w:tc>
+          <w:tcPr>
+            <w:tcW w:w="1047" w:type="pct"/>
+            <w:tcBorders>
+              <w:top w:val="single" w:sz="4" w:space="0" w:color="000000"/>
+              <w:left w:val="single" w:sz="4" w:space="0" w:color="000000"/>
+              <w:bottom w:val="single" w:sz="4" w:space="0" w:color="000000"/>
+              <w:right w:val="single" w:sz="4" w:space="0" w:color="000000"/>
+            </w:tcBorders>
+            <w:shd w:val="clear" w:color="000000" w:fill="FFFFFF"/>
+            <w:noWrap/>
+            <w:vAlign w:val="center"/>
+          </w:tcPr>
+          <w:p>
+            <w:pPr>
+              <w:spacing w:before="0" w:after="0"/>
+              <w:jc w:val="center"/>
+              <w:rPr>
+                <w:rFonts w:cs="Arial"/>
+                <w:b/>
+                <w:color w:val="000000"/>
+                <w:szCs w:val="24"/>
+              </w:rPr>
+            </w:pPr>
+            <w:r>
+              <w:t>qvzoecdfrtp</w:t>
+            </w:r>
+          </w:p>
+        </w:tc>
+        <w:tc>
+          <w:tcPr>
+            <w:tcW w:w="1047" w:type="pct"/>
+            <w:tcBorders>
+              <w:top w:val="single" w:sz="4" w:space="0" w:color="000000"/>
+              <w:left w:val="single" w:sz="4" w:space="0" w:color="000000"/>
+              <w:bottom w:val="single" w:sz="4" w:space="0" w:color="000000"/>
+              <w:right w:val="single" w:sz="4" w:space="0" w:color="000000"/>
+            </w:tcBorders>
+            <w:shd w:val="clear" w:color="000000" w:fill="FFFFFF"/>
+            <w:noWrap/>
+            <w:vAlign w:val="center"/>
+          </w:tcPr>
+          <w:p>
+            <w:pPr>
+              <w:spacing w:before="0" w:after="0"/>
+              <w:jc w:val="center"/>
+              <w:rPr>
+                <w:rFonts w:cs="Arial"/>
+                <w:b/>
+                <w:color w:val="9C0006"/>
+                <w:szCs w:val="24"/>
+              </w:rPr>
+            </w:pPr>
+            <w:r>
+              <w:t>qvzoecdfrur</w:t>
+            </w:r>
+          </w:p>
+        </w:tc>
+        <w:tc>
+          <w:tcPr>
+            <w:tcW w:w="1047" w:type="pct"/>
+            <w:tcBorders>
+              <w:top w:val="single" w:sz="4" w:space="0" w:color="000000"/>
+              <w:left w:val="single" w:sz="4" w:space="0" w:color="000000"/>
+              <w:bottom w:val="single" w:sz="4" w:space="0" w:color="000000"/>
+              <w:right w:val="single" w:sz="4" w:space="0" w:color="000000"/>
+            </w:tcBorders>
+            <w:shd w:val="clear" w:color="000000" w:fill="FFFFFF"/>
+            <w:noWrap/>
+            <w:vAlign w:val="center"/>
+          </w:tcPr>
+          <w:p>
+            <w:pPr>
+              <w:spacing w:before="0" w:after="0"/>
+              <w:jc w:val="center"/>
+              <w:rPr>
+                <w:rFonts w:cs="Arial"/>
+                <w:b/>
+                <w:color w:val="9C0006"/>
+                <w:szCs w:val="24"/>
+              </w:rPr>
+            </w:pPr>
+            <w:r>
+              <w:t>qvzoecdfrer</w:t>
+            </w:r>
+          </w:p>
+        </w:tc>
+        <w:tc>
+          <w:tcPr>
+            <w:tcW w:w="1046" w:type="pct"/>
+            <w:tcBorders>
+              <w:top w:val="single" w:sz="4" w:space="0" w:color="000000"/>
+              <w:left w:val="single" w:sz="4" w:space="0" w:color="000000"/>
+              <w:bottom w:val="single" w:sz="4" w:space="0" w:color="000000"/>
+              <w:right w:val="single" w:sz="4" w:space="0" w:color="000000"/>
+            </w:tcBorders>
+            <w:shd w:val="clear" w:color="000000" w:fill="FFFFFF"/>
+            <w:vAlign w:val="center"/>
+          </w:tcPr>
+          <w:p>
+            <w:pPr>
+              <w:spacing w:before="0" w:after="0"/>
+              <w:jc w:val="center"/>
+              <w:rPr>
+                <w:rFonts w:cs="Arial"/>
+                <w:b/>
+                <w:color w:val="9C0006"/>
+                <w:szCs w:val="24"/>
+              </w:rPr>
+            </w:pPr>
+            <w:r>
+              <w:t>qvzoecdfrir</w:t>
+            </w:r>
+          </w:p>
+        </w:tc>
+      </w:tr>
+      <w:tr>
+        <w:trPr>
+          <w:trHeight w:val="546"/>
+          <w:jc w:val="center"/>
+        </w:trPr>
+        <w:tc>
+          <w:tcPr>
+            <w:tcW w:w="813" w:type="pct"/>
+            <w:tcBorders>
+              <w:top w:val="single" w:sz="4" w:space="0" w:color="000000"/>
+              <w:left w:val="single" w:sz="4" w:space="0" w:color="000000"/>
+              <w:bottom w:val="single" w:sz="4" w:space="0" w:color="000000"/>
+              <w:right w:val="single" w:sz="4" w:space="0" w:color="000000"/>
+            </w:tcBorders>
+            <w:shd w:val="clear" w:color="auto" w:fill="002060"/>
+            <w:vAlign w:val="center"/>
+          </w:tcPr>
+          <w:p>
+            <w:pPr>
+              <w:spacing w:before="0" w:after="0"/>
+              <w:jc w:val="center"/>
+              <w:rPr>
+                <w:rFonts w:cs="Arial"/>
+                <w:b/>
+                <w:bCs/>
+                <w:color w:val="FFFFFF"/>
+                <w:szCs w:val="24"/>
+              </w:rPr>
+            </w:pPr>
+            <w:r>
+              <w:t>Germany</w:t>
+            </w:r>
+          </w:p>
+        </w:tc>
+        <w:tc>
+          <w:tcPr>
+            <w:tcW w:w="1047" w:type="pct"/>
+            <w:tcBorders>
+              <w:top w:val="single" w:sz="4" w:space="0" w:color="000000"/>
+              <w:left w:val="single" w:sz="4" w:space="0" w:color="000000"/>
+              <w:bottom w:val="single" w:sz="4" w:space="0" w:color="000000"/>
+              <w:right w:val="single" w:sz="4" w:space="0" w:color="000000"/>
+            </w:tcBorders>
+            <w:shd w:val="clear" w:color="000000" w:fill="FFFFFF"/>
+            <w:noWrap/>
+            <w:vAlign w:val="center"/>
+          </w:tcPr>
+          <w:p>
+            <w:pPr>
+              <w:spacing w:before="0" w:after="0"/>
+              <w:jc w:val="center"/>
+              <w:rPr>
+                <w:rFonts w:cs="Arial"/>
+                <w:b/>
+                <w:color w:val="000000"/>
+                <w:szCs w:val="24"/>
+              </w:rPr>
+            </w:pPr>
+            <w:r>
+              <w:t>qvzoecddetp</w:t>
+            </w:r>
+          </w:p>
+        </w:tc>
+        <w:tc>
+          <w:tcPr>
+            <w:tcW w:w="1047" w:type="pct"/>
+            <w:tcBorders>
+              <w:top w:val="single" w:sz="4" w:space="0" w:color="000000"/>
+              <w:left w:val="single" w:sz="4" w:space="0" w:color="000000"/>
+              <w:bottom w:val="single" w:sz="4" w:space="0" w:color="000000"/>
+              <w:right w:val="single" w:sz="4" w:space="0" w:color="000000"/>
+            </w:tcBorders>
+            <w:shd w:val="clear" w:color="000000" w:fill="FFFFFF"/>
+            <w:noWrap/>
+            <w:vAlign w:val="center"/>
+          </w:tcPr>
+          <w:p>
+            <w:pPr>
+              <w:spacing w:before="0" w:after="0"/>
+              <w:jc w:val="center"/>
+              <w:rPr>
+                <w:rFonts w:cs="Arial"/>
+                <w:b/>
+                <w:szCs w:val="24"/>
+              </w:rPr>
+            </w:pPr>
+            <w:r>
+              <w:t>qvzoecddeur</w:t>
+            </w:r>
+          </w:p>
+        </w:tc>
+        <w:tc>
+          <w:tcPr>
+            <w:tcW w:w="1047" w:type="pct"/>
+            <w:tcBorders>
+              <w:top w:val="single" w:sz="4" w:space="0" w:color="000000"/>
+              <w:left w:val="single" w:sz="4" w:space="0" w:color="000000"/>
+              <w:bottom w:val="single" w:sz="4" w:space="0" w:color="000000"/>
+              <w:right w:val="single" w:sz="4" w:space="0" w:color="000000"/>
+            </w:tcBorders>
+            <w:shd w:val="clear" w:color="000000" w:fill="FFFFFF"/>
+            <w:noWrap/>
+            <w:vAlign w:val="center"/>
+          </w:tcPr>
+          <w:p>
+            <w:pPr>
+              <w:spacing w:before="0" w:after="0"/>
+              <w:jc w:val="center"/>
+              <w:rPr>
+                <w:rFonts w:cs="Arial"/>
+                <w:b/>
+                <w:color w:val="9C0006"/>
+                <w:szCs w:val="24"/>
+              </w:rPr>
+            </w:pPr>
+            <w:r>
+              <w:t>qvzoecddeer</w:t>
+            </w:r>
+          </w:p>
+        </w:tc>
+        <w:tc>
+          <w:tcPr>
+            <w:tcW w:w="1046" w:type="pct"/>
+            <w:tcBorders>
+              <w:top w:val="single" w:sz="4" w:space="0" w:color="000000"/>
+              <w:left w:val="single" w:sz="4" w:space="0" w:color="000000"/>
+              <w:bottom w:val="single" w:sz="4" w:space="0" w:color="000000"/>
+              <w:right w:val="single" w:sz="4" w:space="0" w:color="000000"/>
+            </w:tcBorders>
+            <w:shd w:val="clear" w:color="000000" w:fill="FFFFFF"/>
+            <w:vAlign w:val="center"/>
+          </w:tcPr>
+          <w:p>
+            <w:pPr>
+              <w:spacing w:before="0" w:after="0"/>
+              <w:jc w:val="center"/>
+              <w:rPr>
+                <w:rFonts w:cs="Arial"/>
+                <w:b/>
+                <w:color w:val="9C0006"/>
+                <w:szCs w:val="24"/>
+              </w:rPr>
+            </w:pPr>
+            <w:r>
+              <w:t>qvzoecddeir</w:t>
+            </w:r>
+          </w:p>
+        </w:tc>
+      </w:tr>
+      <w:tr>
+        <w:trPr>
+          <w:trHeight w:val="546"/>
+          <w:jc w:val="center"/>
+        </w:trPr>
+        <w:tc>
+          <w:tcPr>
+            <w:tcW w:w="813" w:type="pct"/>
+            <w:tcBorders>
+              <w:top w:val="single" w:sz="4" w:space="0" w:color="000000"/>
+              <w:left w:val="single" w:sz="4" w:space="0" w:color="000000"/>
+              <w:bottom w:val="single" w:sz="4" w:space="0" w:color="000000"/>
+              <w:right w:val="single" w:sz="4" w:space="0" w:color="000000"/>
+            </w:tcBorders>
+            <w:shd w:val="clear" w:color="auto" w:fill="002060"/>
+            <w:vAlign w:val="center"/>
+          </w:tcPr>
+          <w:p>
+            <w:pPr>
+              <w:spacing w:before="0" w:after="0"/>
+              <w:jc w:val="center"/>
+              <w:rPr>
+                <w:rFonts w:cs="Arial"/>
+                <w:b/>
+                <w:bCs/>
+                <w:color w:val="FFFFFF"/>
+                <w:szCs w:val="24"/>
+              </w:rPr>
+            </w:pPr>
+            <w:r>
+              <w:t>Italy</w:t>
+            </w:r>
+          </w:p>
+        </w:tc>
+        <w:tc>
+          <w:tcPr>
+            <w:tcW w:w="1047" w:type="pct"/>
+            <w:tcBorders>
+              <w:top w:val="single" w:sz="4" w:space="0" w:color="000000"/>
+              <w:left w:val="single" w:sz="4" w:space="0" w:color="000000"/>
+              <w:bottom w:val="single" w:sz="4" w:space="0" w:color="000000"/>
+              <w:right w:val="single" w:sz="4" w:space="0" w:color="000000"/>
+            </w:tcBorders>
+            <w:shd w:val="clear" w:color="000000" w:fill="FFFFFF"/>
+            <w:noWrap/>
+            <w:vAlign w:val="center"/>
+          </w:tcPr>
+          <w:p>
+            <w:pPr>
+              <w:spacing w:before="0" w:after="0"/>
+              <w:jc w:val="center"/>
+              <w:rPr>
+                <w:rFonts w:cs="Arial"/>
+                <w:b/>
+                <w:color w:val="000000"/>
+                <w:szCs w:val="24"/>
+              </w:rPr>
+            </w:pPr>
+            <w:r>
+              <w:t>qvzoecdittp</w:t>
+            </w:r>
+          </w:p>
+        </w:tc>
+        <w:tc>
+          <w:tcPr>
+            <w:tcW w:w="1047" w:type="pct"/>
+            <w:tcBorders>
+              <w:top w:val="single" w:sz="4" w:space="0" w:color="000000"/>
+              <w:left w:val="single" w:sz="4" w:space="0" w:color="000000"/>
+              <w:bottom w:val="single" w:sz="4" w:space="0" w:color="000000"/>
+              <w:right w:val="single" w:sz="4" w:space="0" w:color="000000"/>
+            </w:tcBorders>
+            <w:shd w:val="clear" w:color="000000" w:fill="FFFFFF"/>
+            <w:noWrap/>
+            <w:vAlign w:val="center"/>
+          </w:tcPr>
+          <w:p>
+            <w:pPr>
+              <w:spacing w:before="0" w:after="0"/>
+              <w:jc w:val="center"/>
+              <w:rPr>
+                <w:rFonts w:cs="Arial"/>
+                <w:b/>
+                <w:color w:val="006100"/>
+                <w:szCs w:val="24"/>
+              </w:rPr>
+            </w:pPr>
+            <w:r>
+              <w:t>qvzoecditur</w:t>
+            </w:r>
+          </w:p>
+        </w:tc>
+        <w:tc>
+          <w:tcPr>
+            <w:tcW w:w="1047" w:type="pct"/>
+            <w:tcBorders>
+              <w:top w:val="single" w:sz="4" w:space="0" w:color="000000"/>
+              <w:left w:val="single" w:sz="4" w:space="0" w:color="000000"/>
+              <w:bottom w:val="single" w:sz="4" w:space="0" w:color="000000"/>
+              <w:right w:val="single" w:sz="4" w:space="0" w:color="000000"/>
+            </w:tcBorders>
+            <w:shd w:val="clear" w:color="000000" w:fill="FFFFFF"/>
+            <w:noWrap/>
+            <w:vAlign w:val="center"/>
+          </w:tcPr>
+          <w:p>
+            <w:pPr>
+              <w:spacing w:before="0" w:after="0"/>
+              <w:jc w:val="center"/>
+              <w:rPr>
+                <w:rFonts w:cs="Arial"/>
+                <w:b/>
+                <w:color w:val="9C0006"/>
+                <w:szCs w:val="24"/>
+              </w:rPr>
+            </w:pPr>
+            <w:r>
+              <w:t>qvzoecditer</w:t>
+            </w:r>
+          </w:p>
+        </w:tc>
+        <w:tc>
+          <w:tcPr>
+            <w:tcW w:w="1046" w:type="pct"/>
+            <w:tcBorders>
+              <w:top w:val="single" w:sz="4" w:space="0" w:color="000000"/>
+              <w:left w:val="single" w:sz="4" w:space="0" w:color="000000"/>
+              <w:bottom w:val="single" w:sz="4" w:space="0" w:color="000000"/>
+              <w:right w:val="single" w:sz="4" w:space="0" w:color="000000"/>
+            </w:tcBorders>
+            <w:shd w:val="clear" w:color="000000" w:fill="FFFFFF"/>
+            <w:vAlign w:val="center"/>
+          </w:tcPr>
+          <w:p>
+            <w:pPr>
+              <w:spacing w:before="0" w:after="0"/>
+              <w:jc w:val="center"/>
+              <w:rPr>
+                <w:rFonts w:cs="Arial"/>
+                <w:b/>
+                <w:color w:val="9C0006"/>
+                <w:szCs w:val="24"/>
+              </w:rPr>
+            </w:pPr>
+            <w:r>
+              <w:t>qvzoecditir</w:t>
+            </w:r>
+          </w:p>
+        </w:tc>
+      </w:tr>
+      <w:tr>
+        <w:trPr>
+          <w:trHeight w:val="546"/>
+          <w:jc w:val="center"/>
+        </w:trPr>
+        <w:tc>
+          <w:tcPr>
+            <w:tcW w:w="813" w:type="pct"/>
+            <w:tcBorders>
+              <w:top w:val="single" w:sz="4" w:space="0" w:color="000000"/>
+              <w:left w:val="single" w:sz="4" w:space="0" w:color="000000"/>
+              <w:bottom w:val="single" w:sz="4" w:space="0" w:color="000000"/>
+              <w:right w:val="single" w:sz="4" w:space="0" w:color="000000"/>
+            </w:tcBorders>
+            <w:shd w:val="clear" w:color="auto" w:fill="002060"/>
+            <w:vAlign w:val="center"/>
+          </w:tcPr>
+          <w:p>
+            <w:pPr>
+              <w:spacing w:before="0" w:after="0"/>
+              <w:jc w:val="center"/>
+              <w:rPr>
+                <w:rFonts w:cs="Arial"/>
+                <w:b/>
+                <w:bCs/>
+                <w:color w:val="FFFFFF"/>
+                <w:szCs w:val="24"/>
+              </w:rPr>
+            </w:pPr>
+            <w:r>
+              <w:t>Spain</w:t>
+            </w:r>
+          </w:p>
+        </w:tc>
+        <w:tc>
+          <w:tcPr>
+            <w:tcW w:w="1047" w:type="pct"/>
+            <w:tcBorders>
+              <w:top w:val="single" w:sz="4" w:space="0" w:color="000000"/>
+              <w:left w:val="single" w:sz="4" w:space="0" w:color="000000"/>
+              <w:bottom w:val="single" w:sz="4" w:space="0" w:color="000000"/>
+              <w:right w:val="single" w:sz="4" w:space="0" w:color="000000"/>
+            </w:tcBorders>
+            <w:shd w:val="clear" w:color="000000" w:fill="FFFFFF"/>
+            <w:noWrap/>
+            <w:vAlign w:val="center"/>
+          </w:tcPr>
+          <w:p>
+            <w:pPr>
+              <w:spacing w:before="0" w:after="0"/>
+              <w:jc w:val="center"/>
+              <w:rPr>
+                <w:rFonts w:cs="Arial"/>
+                <w:i/>
+                <w:iCs/>
+                <w:color w:val="000000"/>
+                <w:szCs w:val="24"/>
+              </w:rPr>
+            </w:pPr>
+            <w:r>
+              <w:t>qvzoecdestp</w:t>
+            </w:r>
+          </w:p>
+        </w:tc>
+        <w:tc>
+          <w:tcPr>
+            <w:tcW w:w="1047" w:type="pct"/>
+            <w:tcBorders>
+              <w:top w:val="single" w:sz="4" w:space="0" w:color="000000"/>
+              <w:left w:val="single" w:sz="4" w:space="0" w:color="000000"/>
+              <w:bottom w:val="single" w:sz="4" w:space="0" w:color="000000"/>
+              <w:right w:val="single" w:sz="4" w:space="0" w:color="000000"/>
+            </w:tcBorders>
+            <w:shd w:val="clear" w:color="000000" w:fill="FFFFFF"/>
+            <w:noWrap/>
+            <w:vAlign w:val="center"/>
+          </w:tcPr>
+          <w:p>
+            <w:pPr>
+              <w:spacing w:before="0" w:after="0"/>
+              <w:jc w:val="center"/>
+              <w:rPr>
+                <w:rFonts w:cs="Arial"/>
+                <w:i/>
+                <w:color w:val="006100"/>
+                <w:szCs w:val="24"/>
+              </w:rPr>
+            </w:pPr>
+            <w:r>
+              <w:t>qvzoecdesur</w:t>
+            </w:r>
+          </w:p>
+        </w:tc>
+        <w:tc>
+          <w:tcPr>
+            <w:tcW w:w="1047" w:type="pct"/>
+            <w:tcBorders>
+              <w:top w:val="single" w:sz="4" w:space="0" w:color="000000"/>
+              <w:left w:val="single" w:sz="4" w:space="0" w:color="000000"/>
+              <w:bottom w:val="single" w:sz="4" w:space="0" w:color="000000"/>
+              <w:right w:val="single" w:sz="4" w:space="0" w:color="000000"/>
+            </w:tcBorders>
+            <w:shd w:val="clear" w:color="000000" w:fill="FFFFFF"/>
+            <w:noWrap/>
+            <w:vAlign w:val="center"/>
+          </w:tcPr>
+          <w:p>
+            <w:pPr>
+              <w:spacing w:before="0" w:after="0"/>
+              <w:jc w:val="center"/>
+              <w:rPr>
+                <w:rFonts w:cs="Arial"/>
+                <w:i/>
+                <w:color w:val="9C0006"/>
+                <w:szCs w:val="24"/>
+              </w:rPr>
+            </w:pPr>
+            <w:r>
+              <w:t>qvzoecdeser</w:t>
+            </w:r>
+          </w:p>
+        </w:tc>
+        <w:tc>
+          <w:tcPr>
+            <w:tcW w:w="1046" w:type="pct"/>
+            <w:tcBorders>
+              <w:top w:val="single" w:sz="4" w:space="0" w:color="000000"/>
+              <w:left w:val="single" w:sz="4" w:space="0" w:color="000000"/>
+              <w:bottom w:val="single" w:sz="4" w:space="0" w:color="000000"/>
+              <w:right w:val="single" w:sz="4" w:space="0" w:color="000000"/>
+            </w:tcBorders>
+            <w:shd w:val="clear" w:color="000000" w:fill="FFFFFF"/>
+            <w:vAlign w:val="center"/>
+          </w:tcPr>
+          <w:p>
+            <w:pPr>
+              <w:spacing w:before="0" w:after="0"/>
+              <w:jc w:val="center"/>
+              <w:rPr>
+                <w:rFonts w:cs="Arial"/>
+                <w:i/>
+                <w:color w:val="9C0006"/>
+                <w:szCs w:val="24"/>
+              </w:rPr>
+            </w:pPr>
+            <w:r>
+              <w:t>qvzoecdesir</w:t>
+            </w:r>
+          </w:p>
+        </w:tc>
+      </w:tr>
+      <w:tr>
+        <w:trPr>
+          <w:trHeight w:val="546"/>
+          <w:jc w:val="center"/>
+        </w:trPr>
+        <w:tc>
+          <w:tcPr>
+            <w:tcW w:w="813" w:type="pct"/>
+            <w:tcBorders>
+              <w:top w:val="single" w:sz="4" w:space="0" w:color="000000"/>
+              <w:left w:val="single" w:sz="4" w:space="0" w:color="000000"/>
+              <w:bottom w:val="single" w:sz="4" w:space="0" w:color="000000"/>
+              <w:right w:val="single" w:sz="4" w:space="0" w:color="000000"/>
+            </w:tcBorders>
+            <w:shd w:val="clear" w:color="auto" w:fill="002060"/>
+            <w:vAlign w:val="center"/>
+          </w:tcPr>
+          <w:p>
+            <w:pPr>
+              <w:spacing w:before="0" w:after="0"/>
+              <w:jc w:val="center"/>
+              <w:rPr>
+                <w:rFonts w:cs="Arial"/>
+                <w:b/>
+                <w:bCs/>
+                <w:color w:val="FFFFFF"/>
+                <w:szCs w:val="24"/>
+              </w:rPr>
+            </w:pPr>
+            <w:r>
+              <w:t>Canada</w:t>
+            </w:r>
+          </w:p>
+        </w:tc>
+        <w:tc>
+          <w:tcPr>
+            <w:tcW w:w="1047" w:type="pct"/>
+            <w:tcBorders>
+              <w:top w:val="single" w:sz="4" w:space="0" w:color="000000"/>
+              <w:left w:val="single" w:sz="4" w:space="0" w:color="000000"/>
+              <w:bottom w:val="single" w:sz="4" w:space="0" w:color="000000"/>
+              <w:right w:val="single" w:sz="4" w:space="0" w:color="000000"/>
+            </w:tcBorders>
+            <w:shd w:val="clear" w:color="000000" w:fill="FFFFFF"/>
+            <w:noWrap/>
+            <w:vAlign w:val="center"/>
+          </w:tcPr>
+          <w:p>
+            <w:pPr>
+              <w:spacing w:before="0" w:after="0"/>
+              <w:jc w:val="center"/>
+              <w:rPr>
+                <w:rFonts w:cs="Arial"/>
+                <w:b/>
+                <w:color w:val="000000"/>
+                <w:szCs w:val="24"/>
+              </w:rPr>
+            </w:pPr>
+            <w:r>
+              <w:t>qvzoecdcatp</w:t>
+            </w:r>
+          </w:p>
+        </w:tc>
+        <w:tc>
+          <w:tcPr>
+            <w:tcW w:w="1047" w:type="pct"/>
+            <w:tcBorders>
+              <w:top w:val="single" w:sz="4" w:space="0" w:color="000000"/>
+              <w:left w:val="single" w:sz="4" w:space="0" w:color="000000"/>
+              <w:bottom w:val="single" w:sz="4" w:space="0" w:color="000000"/>
+              <w:right w:val="single" w:sz="4" w:space="0" w:color="000000"/>
+            </w:tcBorders>
+            <w:shd w:val="clear" w:color="000000" w:fill="FFFFFF"/>
+            <w:noWrap/>
+            <w:vAlign w:val="center"/>
+          </w:tcPr>
+          <w:p>
+            <w:pPr>
+              <w:spacing w:before="0" w:after="0"/>
+              <w:jc w:val="center"/>
+              <w:rPr>
+                <w:rFonts w:cs="Arial"/>
+                <w:b/>
+                <w:color w:val="006100"/>
+                <w:szCs w:val="24"/>
+              </w:rPr>
+            </w:pPr>
+            <w:r>
+              <w:t>qvzoecdcaur</w:t>
+            </w:r>
+          </w:p>
+        </w:tc>
+        <w:tc>
+          <w:tcPr>
+            <w:tcW w:w="1047" w:type="pct"/>
+            <w:tcBorders>
+              <w:top w:val="single" w:sz="4" w:space="0" w:color="000000"/>
+              <w:left w:val="single" w:sz="4" w:space="0" w:color="000000"/>
+              <w:bottom w:val="single" w:sz="4" w:space="0" w:color="000000"/>
+              <w:right w:val="single" w:sz="4" w:space="0" w:color="000000"/>
+            </w:tcBorders>
+            <w:shd w:val="clear" w:color="000000" w:fill="FFFFFF"/>
+            <w:noWrap/>
+            <w:vAlign w:val="center"/>
+          </w:tcPr>
+          <w:p>
+            <w:pPr>
+              <w:spacing w:before="0" w:after="0"/>
+              <w:jc w:val="center"/>
+              <w:rPr>
+                <w:rFonts w:cs="Arial"/>
+                <w:b/>
+                <w:color w:val="9C0006"/>
+                <w:szCs w:val="24"/>
+              </w:rPr>
+            </w:pPr>
+            <w:r>
+              <w:t>qvzoecdcaer</w:t>
+            </w:r>
+          </w:p>
+        </w:tc>
+        <w:tc>
+          <w:tcPr>
+            <w:tcW w:w="1046" w:type="pct"/>
+            <w:tcBorders>
+              <w:top w:val="single" w:sz="4" w:space="0" w:color="000000"/>
+              <w:left w:val="single" w:sz="4" w:space="0" w:color="000000"/>
+              <w:bottom w:val="single" w:sz="4" w:space="0" w:color="000000"/>
+              <w:right w:val="single" w:sz="4" w:space="0" w:color="000000"/>
+            </w:tcBorders>
+            <w:shd w:val="clear" w:color="000000" w:fill="FFFFFF"/>
+            <w:vAlign w:val="center"/>
+          </w:tcPr>
+          <w:p>
+            <w:pPr>
+              <w:spacing w:before="0" w:after="0"/>
+              <w:jc w:val="center"/>
+              <w:rPr>
+                <w:rFonts w:cs="Arial"/>
+                <w:b/>
+                <w:color w:val="9C0006"/>
+                <w:szCs w:val="24"/>
+              </w:rPr>
+            </w:pPr>
+            <w:r>
+              <w:t>qvzoecdcair</w:t>
+            </w:r>
+          </w:p>
+        </w:tc>
+      </w:tr>
+      <w:tr>
+        <w:trPr>
+          <w:trHeight w:val="546"/>
+          <w:jc w:val="center"/>
+        </w:trPr>
+        <w:tc>
+          <w:tcPr>
+            <w:tcW w:w="813" w:type="pct"/>
+            <w:tcBorders>
+              <w:top w:val="single" w:sz="4" w:space="0" w:color="000000"/>
+              <w:left w:val="single" w:sz="4" w:space="0" w:color="000000"/>
+              <w:bottom w:val="single" w:sz="4" w:space="0" w:color="000000"/>
+              <w:right w:val="single" w:sz="4" w:space="0" w:color="000000"/>
+            </w:tcBorders>
+            <w:shd w:val="clear" w:color="auto" w:fill="002060"/>
+            <w:vAlign w:val="center"/>
+          </w:tcPr>
+          <w:p>
+            <w:pPr>
+              <w:spacing w:before="0" w:after="0"/>
+              <w:jc w:val="center"/>
+              <w:rPr>
+                <w:rFonts w:cs="Arial"/>
+                <w:b/>
+                <w:bCs/>
+                <w:color w:val="FFFFFF"/>
+                <w:szCs w:val="24"/>
+              </w:rPr>
+            </w:pPr>
+            <w:r>
+              <w:t>Japan</w:t>
+            </w:r>
+          </w:p>
+        </w:tc>
+        <w:tc>
+          <w:tcPr>
+            <w:tcW w:w="1047" w:type="pct"/>
+            <w:tcBorders>
+              <w:top w:val="single" w:sz="4" w:space="0" w:color="000000"/>
+              <w:left w:val="single" w:sz="4" w:space="0" w:color="000000"/>
+              <w:bottom w:val="single" w:sz="4" w:space="0" w:color="000000"/>
+              <w:right w:val="single" w:sz="4" w:space="0" w:color="000000"/>
+            </w:tcBorders>
+            <w:shd w:val="clear" w:color="000000" w:fill="FFFFFF"/>
+            <w:noWrap/>
+            <w:vAlign w:val="center"/>
+          </w:tcPr>
+          <w:p>
+            <w:pPr>
+              <w:spacing w:before="0" w:after="0"/>
+              <w:jc w:val="center"/>
+              <w:rPr>
+                <w:rFonts w:cs="Arial"/>
+                <w:b/>
+                <w:color w:val="000000"/>
+                <w:szCs w:val="24"/>
+              </w:rPr>
+            </w:pPr>
+            <w:r>
+              <w:t>qvzoecdjptp</w:t>
+            </w:r>
+          </w:p>
+        </w:tc>
+        <w:tc>
+          <w:tcPr>
+            <w:tcW w:w="1047" w:type="pct"/>
+            <w:tcBorders>
+              <w:top w:val="single" w:sz="4" w:space="0" w:color="000000"/>
+              <w:left w:val="single" w:sz="4" w:space="0" w:color="000000"/>
+              <w:bottom w:val="single" w:sz="4" w:space="0" w:color="000000"/>
+              <w:right w:val="single" w:sz="4" w:space="0" w:color="000000"/>
+            </w:tcBorders>
+            <w:shd w:val="clear" w:color="000000" w:fill="FFFFFF"/>
+            <w:noWrap/>
+            <w:vAlign w:val="center"/>
+          </w:tcPr>
+          <w:p>
+            <w:pPr>
+              <w:spacing w:before="0" w:after="0"/>
+              <w:jc w:val="center"/>
+              <w:rPr>
+                <w:rFonts w:cs="Arial"/>
+                <w:b/>
+                <w:color w:val="006100"/>
+                <w:szCs w:val="24"/>
+              </w:rPr>
+            </w:pPr>
+            <w:r>
+              <w:t>qvzoecdjpur</w:t>
+            </w:r>
+          </w:p>
+        </w:tc>
+        <w:tc>
+          <w:tcPr>
+            <w:tcW w:w="1047" w:type="pct"/>
+            <w:tcBorders>
+              <w:top w:val="single" w:sz="4" w:space="0" w:color="000000"/>
+              <w:left w:val="single" w:sz="4" w:space="0" w:color="000000"/>
+              <w:bottom w:val="single" w:sz="4" w:space="0" w:color="000000"/>
+              <w:right w:val="single" w:sz="4" w:space="0" w:color="000000"/>
+            </w:tcBorders>
+            <w:shd w:val="clear" w:color="000000" w:fill="FFFFFF"/>
+            <w:noWrap/>
+            <w:vAlign w:val="center"/>
+          </w:tcPr>
+          <w:p>
+            <w:pPr>
+              <w:spacing w:before="0" w:after="0"/>
+              <w:jc w:val="center"/>
+              <w:rPr>
+                <w:rFonts w:cs="Arial"/>
+                <w:b/>
+                <w:color w:val="9C0006"/>
+                <w:szCs w:val="24"/>
+              </w:rPr>
+            </w:pPr>
+            <w:r>
+              <w:t>qvzoecdjper</w:t>
+            </w:r>
+          </w:p>
+        </w:tc>
+        <w:tc>
+          <w:tcPr>
+            <w:tcW w:w="1046" w:type="pct"/>
+            <w:tcBorders>
+              <w:top w:val="single" w:sz="4" w:space="0" w:color="000000"/>
+              <w:left w:val="single" w:sz="4" w:space="0" w:color="000000"/>
+              <w:bottom w:val="single" w:sz="4" w:space="0" w:color="000000"/>
+              <w:right w:val="single" w:sz="4" w:space="0" w:color="000000"/>
+            </w:tcBorders>
+            <w:shd w:val="clear" w:color="000000" w:fill="FFFFFF"/>
+            <w:vAlign w:val="center"/>
+          </w:tcPr>
+          <w:p>
+            <w:pPr>
+              <w:spacing w:before="0" w:after="0"/>
+              <w:jc w:val="center"/>
+              <w:rPr>
+                <w:rFonts w:cs="Arial"/>
+                <w:b/>
+                <w:color w:val="9C0006"/>
+                <w:szCs w:val="24"/>
+              </w:rPr>
+            </w:pPr>
+            <w:r>
+              <w:t>qvzoecdjpir</w:t>
+            </w:r>
+          </w:p>
+        </w:tc>
+      </w:tr>
+      <w:tr>
+        <w:trPr>
+          <w:trHeight w:val="546"/>
+          <w:jc w:val="center"/>
+        </w:trPr>
+        <w:tc>
+          <w:tcPr>
+            <w:tcW w:w="813" w:type="pct"/>
+            <w:tcBorders>
+              <w:top w:val="single" w:sz="4" w:space="0" w:color="000000"/>
+              <w:left w:val="single" w:sz="4" w:space="0" w:color="000000"/>
+              <w:bottom w:val="single" w:sz="4" w:space="0" w:color="000000"/>
+              <w:right w:val="single" w:sz="4" w:space="0" w:color="000000"/>
+            </w:tcBorders>
+            <w:shd w:val="clear" w:color="auto" w:fill="002060"/>
+            <w:vAlign w:val="center"/>
+          </w:tcPr>
+          <w:p>
+            <w:pPr>
+              <w:spacing w:before="0" w:after="0"/>
+              <w:jc w:val="center"/>
+              <w:rPr>
+                <w:rFonts w:cs="Arial"/>
+                <w:b/>
+                <w:bCs/>
+                <w:color w:val="FFFFFF"/>
+                <w:szCs w:val="24"/>
+              </w:rPr>
+            </w:pPr>
+            <w:r>
+              <w:t>Euro Area</w:t>
+            </w:r>
+          </w:p>
+        </w:tc>
+        <w:tc>
+          <w:tcPr>
+            <w:tcW w:w="1047" w:type="pct"/>
+            <w:tcBorders>
+              <w:top w:val="single" w:sz="4" w:space="0" w:color="000000"/>
+              <w:left w:val="single" w:sz="4" w:space="0" w:color="000000"/>
+              <w:bottom w:val="single" w:sz="4" w:space="0" w:color="000000"/>
+              <w:right w:val="single" w:sz="4" w:space="0" w:color="000000"/>
+            </w:tcBorders>
+            <w:shd w:val="clear" w:color="000000" w:fill="FFFFFF"/>
+            <w:noWrap/>
+            <w:vAlign w:val="center"/>
+          </w:tcPr>
+          <w:p>
+            <w:pPr>
+              <w:spacing w:before="0" w:after="0"/>
+              <w:jc w:val="center"/>
+              <w:rPr>
+                <w:rFonts w:cs="Arial"/>
+                <w:b/>
+                <w:color w:val="000000"/>
+                <w:szCs w:val="24"/>
+              </w:rPr>
+            </w:pPr>
+            <w:r>
+              <w:t>qvzoecdeatp</w:t>
+            </w:r>
+          </w:p>
+        </w:tc>
+        <w:tc>
+          <w:tcPr>
+            <w:tcW w:w="1047" w:type="pct"/>
+            <w:tcBorders>
+              <w:top w:val="single" w:sz="4" w:space="0" w:color="000000"/>
+              <w:left w:val="single" w:sz="4" w:space="0" w:color="000000"/>
+              <w:bottom w:val="single" w:sz="4" w:space="0" w:color="000000"/>
+              <w:right w:val="single" w:sz="4" w:space="0" w:color="000000"/>
+            </w:tcBorders>
+            <w:shd w:val="clear" w:color="000000" w:fill="FFFFFF"/>
+            <w:noWrap/>
+            <w:vAlign w:val="center"/>
+          </w:tcPr>
+          <w:p>
+            <w:pPr>
+              <w:spacing w:before="0" w:after="0"/>
+              <w:jc w:val="center"/>
+              <w:rPr>
+                <w:rFonts w:cs="Arial"/>
+                <w:b/>
+                <w:color w:val="006100"/>
+                <w:szCs w:val="24"/>
+              </w:rPr>
+            </w:pPr>
+            <w:r>
+              <w:t>qvzoecdeaur</w:t>
+            </w:r>
+          </w:p>
+        </w:tc>
+        <w:tc>
+          <w:tcPr>
+            <w:tcW w:w="1047" w:type="pct"/>
+            <w:tcBorders>
+              <w:top w:val="single" w:sz="4" w:space="0" w:color="000000"/>
+              <w:left w:val="single" w:sz="4" w:space="0" w:color="000000"/>
+              <w:bottom w:val="single" w:sz="4" w:space="0" w:color="000000"/>
+              <w:right w:val="single" w:sz="4" w:space="0" w:color="000000"/>
+            </w:tcBorders>
+            <w:shd w:val="clear" w:color="000000" w:fill="FFFFFF"/>
+            <w:noWrap/>
+            <w:vAlign w:val="center"/>
+          </w:tcPr>
+          <w:p>
+            <w:pPr>
+              <w:spacing w:before="0" w:after="0"/>
+              <w:jc w:val="center"/>
+              <w:rPr>
+                <w:rFonts w:cs="Arial"/>
+                <w:b/>
+                <w:color w:val="9C0006"/>
+                <w:szCs w:val="24"/>
+              </w:rPr>
+            </w:pPr>
+            <w:r>
+              <w:t>qvzoecdeaer</w:t>
+            </w:r>
+          </w:p>
+        </w:tc>
+        <w:tc>
+          <w:tcPr>
+            <w:tcW w:w="1046" w:type="pct"/>
+            <w:tcBorders>
+              <w:top w:val="single" w:sz="4" w:space="0" w:color="000000"/>
+              <w:left w:val="single" w:sz="4" w:space="0" w:color="000000"/>
+              <w:bottom w:val="single" w:sz="4" w:space="0" w:color="000000"/>
+              <w:right w:val="single" w:sz="4" w:space="0" w:color="000000"/>
+            </w:tcBorders>
+            <w:shd w:val="clear" w:color="000000" w:fill="FFFFFF"/>
+            <w:vAlign w:val="center"/>
+          </w:tcPr>
+          <w:p>
+            <w:pPr>
+              <w:spacing w:before="0" w:after="0"/>
+              <w:jc w:val="center"/>
+              <w:rPr>
+                <w:rFonts w:cs="Arial"/>
+                <w:b/>
+                <w:color w:val="9C0006"/>
+                <w:szCs w:val="24"/>
+              </w:rPr>
+            </w:pPr>
+            <w:r>
+              <w:t>qvzoecdeair</w:t>
+            </w:r>
+          </w:p>
+        </w:tc>
+      </w:tr>
+    </w:tbl>
+    <w:p>
+      <w:pPr>
+        <w:keepNext/>
+        <w:spacing w:before="0" w:after="60"/>
+        <w:rPr>
+          <w:rFonts w:cs="Arial"/>
+          <w:i/>
+          <w:szCs w:val="24"/>
+        </w:rPr>
+      </w:pPr>
+      <w:r>
+        <w:rPr>
+          <w:rFonts w:cs="Arial"/>
+          <w:i/>
+          <w:iCs/>
+          <w:sz w:val="22"/>
+        </w:rPr>
+        <w:t xml:space="preserve">Source: </w:t>
+      </w:r>
+      <w:hyperlink r:id="rId20" w:history="1">
+        <w:r>
+          <w:rPr>
+            <w:rStyle w:val="Hyperlink"/>
+            <w:rFonts w:cs="Arial"/>
+            <w:i/>
+            <w:iCs/>
+            <w:sz w:val="22"/>
+          </w:rPr>
+          <w:t>OECD</w:t>
+        </w:r>
+        <w:r>
+          <w:rPr>
+            <w:rStyle w:val="Hyperlink"/>
+            <w:i/>
+            <w:iCs/>
+            <w:sz w:val="22"/>
+          </w:rPr>
+          <w:t xml:space="preserve"> Infra-annual labour statistics</w:t>
+        </w:r>
+      </w:hyperlink>
+      <w:r>
+        <w:rPr>
+          <w:rFonts w:cs="Arial"/>
+          <w:i/>
+          <w:iCs/>
+          <w:sz w:val="22"/>
+        </w:rPr>
+        <w:t>.</w:t>
+      </w:r>
+      <w:r>
+        <w:rPr>
+          <w:rFonts w:cs="Arial"/>
+          <w:i/>
+          <w:iCs/>
+          <w:sz w:val="22"/>
+        </w:rPr>
+        <w:t xml:space="preserve">*Latest UK data from </w:t>
+      </w:r>
+      <w:hyperlink r:id="rId21" w:history="1">
+        <w:r>
+          <w:rPr>
+            <w:rStyle w:val="Hyperlink"/>
+            <w:rFonts w:cs="Arial"/>
+            <w:i/>
+            <w:sz w:val="22"/>
+          </w:rPr>
+          <w:t>ONS Labour Force Survey</w:t>
+        </w:r>
+      </w:hyperlink>
+      <w:r>
+        <w:rPr>
+          <w:rFonts w:cs="Arial"/>
+          <w:i/>
+          <w:sz w:val="22"/>
+        </w:rPr>
+        <w:t>.</w:t>
+      </w:r>
+    </w:p>
+    <w:p>
+      <w:pPr>
+        <w:spacing w:before="0" w:after="0" w:line="276" w:lineRule="auto"/>
+        <w:rPr>
+          <w:rFonts w:eastAsia="Arial"/>
+          <w:sz w:val="22"/>
+          <w:szCs w:val="28"/>
+        </w:rPr>
+      </w:pPr>
+      <w:r>
+        <w:rPr>
+          <w:rFonts w:eastAsia="Arial"/>
+          <w:b/>
+          <w:bCs/>
+          <w:sz w:val="22"/>
+          <w:szCs w:val="28"/>
+          <w:vertAlign w:val="superscript"/>
+        </w:rPr>
+        <w:t>1</w:t>
+      </w:r>
+      <w:r>
+        <w:rPr>
+          <w:rFonts w:eastAsia="Arial"/>
+          <w:sz w:val="22"/>
+          <w:szCs w:val="28"/>
+        </w:rPr>
+        <w:t xml:space="preserve">Note: </w:t>
+      </w:r>
+      <w:r>
+        <w:rPr>
+          <w:rFonts w:eastAsia="Arial"/>
+          <w:sz w:val="22"/>
+          <w:szCs w:val="28"/>
+        </w:rPr>
+        <w:t>Included is the latest OECD data. C</w:t>
+      </w:r>
+      <w:r>
+        <w:rPr>
+          <w:rFonts w:eastAsia="Arial"/>
+          <w:sz w:val="22"/>
+          <w:szCs w:val="28"/>
+        </w:rPr>
+        <w:t>ountries release labour market statistics on</w:t>
+      </w:r>
+      <w:r>
+        <w:rPr>
+          <w:rFonts w:eastAsia="Arial"/>
+          <w:sz w:val="22"/>
+          <w:szCs w:val="28"/>
+        </w:rPr>
+        <w:t xml:space="preserve"> different </w:t>
+      </w:r>
+      <w:r>
+        <w:rPr>
+          <w:rFonts w:eastAsia="Arial"/>
+          <w:sz w:val="22"/>
+          <w:szCs w:val="28"/>
+        </w:rPr>
+        <w:t>schedules</w:t>
+      </w:r>
+      <w:r>
+        <w:rPr>
+          <w:rFonts w:eastAsia="Arial"/>
+          <w:sz w:val="22"/>
+          <w:szCs w:val="28"/>
+        </w:rPr>
+        <w:t xml:space="preserve"> and</w:t>
+      </w:r>
+      <w:r>
+        <w:rPr>
+          <w:rFonts w:eastAsia="Arial"/>
+          <w:sz w:val="22"/>
+          <w:szCs w:val="28"/>
+        </w:rPr>
+        <w:t xml:space="preserve"> </w:t>
+      </w:r>
+      <w:r>
+        <w:rPr>
+          <w:rFonts w:eastAsia="Arial"/>
+          <w:sz w:val="22"/>
+          <w:szCs w:val="28"/>
+        </w:rPr>
+        <w:t xml:space="preserve">so </w:t>
+      </w:r>
+      <w:r>
+        <w:rPr>
+          <w:rFonts w:eastAsia="Arial"/>
+          <w:sz w:val="22"/>
+          <w:szCs w:val="28"/>
+        </w:rPr>
+        <w:t>r</w:t>
+      </w:r>
+      <w:r>
+        <w:rPr>
+          <w:rFonts w:eastAsia="Arial"/>
+          <w:sz w:val="22"/>
+          <w:szCs w:val="28"/>
+        </w:rPr>
+        <w:t>eference</w:t>
+      </w:r>
+      <w:r>
+        <w:rPr>
+          <w:rFonts w:eastAsia="Arial"/>
+          <w:sz w:val="22"/>
+          <w:szCs w:val="28"/>
+        </w:rPr>
+        <w:t xml:space="preserve"> periods </w:t>
+      </w:r>
+      <w:r>
+        <w:rPr>
+          <w:rFonts w:eastAsia="Arial"/>
+          <w:sz w:val="22"/>
+          <w:szCs w:val="28"/>
+        </w:rPr>
+        <w:t>vary</w:t>
+      </w:r>
+      <w:r>
+        <w:rPr>
+          <w:rFonts w:eastAsia="Arial"/>
+          <w:sz w:val="22"/>
+          <w:szCs w:val="28"/>
+        </w:rPr>
+        <w:t>,</w:t>
+      </w:r>
+      <w:r>
+        <w:rPr>
+          <w:rFonts w:eastAsia="Arial"/>
+          <w:sz w:val="22"/>
+          <w:szCs w:val="28"/>
+        </w:rPr>
+        <w:t xml:space="preserve"> </w:t>
+      </w:r>
+      <w:r>
+        <w:rPr>
+          <w:rFonts w:eastAsia="Arial"/>
+          <w:sz w:val="22"/>
+          <w:szCs w:val="28"/>
+        </w:rPr>
+        <w:t>with</w:t>
+      </w:r>
+      <w:r>
+        <w:rPr>
+          <w:rFonts w:eastAsia="Arial"/>
+          <w:sz w:val="22"/>
+          <w:szCs w:val="28"/>
+        </w:rPr>
+        <w:t xml:space="preserve"> </w:t>
+      </w:r>
+      <w:r>
+        <w:rPr>
+          <w:rFonts w:eastAsia="Arial"/>
+          <w:sz w:val="22"/>
+          <w:szCs w:val="28"/>
+        </w:rPr>
+        <w:t>some outdated</w:t>
+      </w:r>
+      <w:r>
+        <w:rPr>
+          <w:rFonts w:eastAsia="Arial"/>
+          <w:sz w:val="22"/>
+          <w:szCs w:val="28"/>
+        </w:rPr>
+        <w:t>. Co</w:t>
+      </w:r>
+      <w:r>
+        <w:rPr>
+          <w:rFonts w:eastAsia="Arial"/>
+          <w:sz w:val="22"/>
+          <w:szCs w:val="28"/>
+        </w:rPr>
+        <w:t>mparisons</w:t>
+      </w:r>
+      <w:r>
+        <w:rPr>
+          <w:rFonts w:eastAsia="Arial"/>
+          <w:sz w:val="22"/>
+          <w:szCs w:val="28"/>
+        </w:rPr>
+        <w:t xml:space="preserve"> should be </w:t>
+      </w:r>
+      <w:r>
+        <w:rPr>
+          <w:rFonts w:eastAsia="Arial"/>
+          <w:sz w:val="22"/>
+          <w:szCs w:val="28"/>
+        </w:rPr>
+        <w:t>treated</w:t>
+      </w:r>
+      <w:r>
+        <w:rPr>
+          <w:rFonts w:eastAsia="Arial"/>
+          <w:sz w:val="22"/>
+          <w:szCs w:val="28"/>
+        </w:rPr>
+        <w:t xml:space="preserve"> with caution.</w:t>
+      </w:r>
+    </w:p>
+    <w:p>
+      <w:pPr>
+        <w:spacing w:before="0" w:after="0" w:line="276" w:lineRule="auto"/>
+        <w:rPr>
+          <w:rFonts w:eastAsia="Arial"/>
+          <w:sz w:val="22"/>
+          <w:szCs w:val="28"/>
+        </w:rPr>
+      </w:pPr>
+      <w:r>
+        <w:rPr>
+          <w:rFonts w:eastAsia="Arial"/>
+          <w:b/>
+          <w:bCs/>
+          <w:sz w:val="22"/>
+          <w:szCs w:val="28"/>
+          <w:vertAlign w:val="superscript"/>
+        </w:rPr>
+        <w:t>2</w:t>
+      </w:r>
+      <w:r>
+        <w:rPr>
+          <w:rFonts w:eastAsia="Arial"/>
+          <w:sz w:val="22"/>
+          <w:szCs w:val="28"/>
+        </w:rPr>
+        <w:t xml:space="preserve">Note: </w:t>
+      </w:r>
+      <w:r>
+        <w:rPr>
+          <w:rFonts w:eastAsia="Arial"/>
+          <w:sz w:val="22"/>
+          <w:szCs w:val="28"/>
+        </w:rPr>
+        <w:t>The</w:t>
+      </w:r>
+      <w:r>
+        <w:rPr>
+          <w:rFonts w:eastAsia="Arial"/>
+          <w:sz w:val="22"/>
+          <w:szCs w:val="28"/>
+        </w:rPr>
+        <w:t xml:space="preserve"> UK and US </w:t>
+      </w:r>
+      <w:r>
+        <w:rPr>
+          <w:rFonts w:eastAsia="Arial"/>
+          <w:sz w:val="22"/>
+          <w:szCs w:val="28"/>
+        </w:rPr>
+        <w:t xml:space="preserve">use age </w:t>
+      </w:r>
+      <w:r>
+        <w:rPr>
+          <w:rFonts w:eastAsia="Arial"/>
+          <w:sz w:val="22"/>
+          <w:szCs w:val="28"/>
+        </w:rPr>
+        <w:t>16 rather than 15.</w:t>
+      </w:r>
     </w:p>
     <w:sectPr>
       <w:headerReference w:type="default" r:id="rId18"/>

</xml_diff>